<commit_message>
Embed Ch.4 result figures + AI-use acknowledgement (highlighted)
- Insert Figures 9-13 into Chapter 4 (confusion matrix, feature importance,
  SHAP, HMM transitions, flood-pressure risk map)
- Add highlighted "Acknowledgement of AI Assistance" section (in auto-TOC)
- All AI additions yellow-highlighted for easy review; PDF regenerated

Co-Authored-By: Claude Opus 4.8 (1M context) <noreply@anthropic.com>
</commit_message>
<xml_diff>
--- a/Flood_Risk_HMM_Capstone_Proposal.docx
+++ b/Flood_Risk_HMM_Capstone_Proposal.docx
@@ -149,7 +149,7 @@
       <w:r>
         <w:fldChar w:fldCharType="separate"/>
       </w:r>
-      <w:hyperlink w:anchor="_Toc232428493" w:history="1">
+      <w:hyperlink w:anchor="_Toc232431303" w:history="1">
         <w:r>
           <w:rPr>
             <w:rStyle w:val="Hyperlink"/>
@@ -176,7 +176,7 @@
             <w:noProof/>
             <w:webHidden/>
           </w:rPr>
-          <w:instrText xml:space="preserve"> PAGEREF _Toc232428493 \h </w:instrText>
+          <w:instrText xml:space="preserve"> PAGEREF _Toc232431303 \h </w:instrText>
         </w:r>
         <w:r>
           <w:rPr>
@@ -222,7 +222,7 @@
           <w14:ligatures w14:val="standardContextual"/>
         </w:rPr>
       </w:pPr>
-      <w:hyperlink w:anchor="_Toc232428494" w:history="1">
+      <w:hyperlink w:anchor="_Toc232431304" w:history="1">
         <w:r>
           <w:rPr>
             <w:rStyle w:val="Hyperlink"/>
@@ -249,7 +249,7 @@
             <w:noProof/>
             <w:webHidden/>
           </w:rPr>
-          <w:instrText xml:space="preserve"> PAGEREF _Toc232428494 \h </w:instrText>
+          <w:instrText xml:space="preserve"> PAGEREF _Toc232431304 \h </w:instrText>
         </w:r>
         <w:r>
           <w:rPr>
@@ -295,7 +295,7 @@
           <w14:ligatures w14:val="standardContextual"/>
         </w:rPr>
       </w:pPr>
-      <w:hyperlink w:anchor="_Toc232428495" w:history="1">
+      <w:hyperlink w:anchor="_Toc232431305" w:history="1">
         <w:r>
           <w:rPr>
             <w:rStyle w:val="Hyperlink"/>
@@ -322,7 +322,7 @@
             <w:noProof/>
             <w:webHidden/>
           </w:rPr>
-          <w:instrText xml:space="preserve"> PAGEREF _Toc232428495 \h </w:instrText>
+          <w:instrText xml:space="preserve"> PAGEREF _Toc232431305 \h </w:instrText>
         </w:r>
         <w:r>
           <w:rPr>
@@ -368,7 +368,7 @@
           <w14:ligatures w14:val="standardContextual"/>
         </w:rPr>
       </w:pPr>
-      <w:hyperlink w:anchor="_Toc232428496" w:history="1">
+      <w:hyperlink w:anchor="_Toc232431306" w:history="1">
         <w:r>
           <w:rPr>
             <w:rStyle w:val="Hyperlink"/>
@@ -395,7 +395,7 @@
             <w:noProof/>
             <w:webHidden/>
           </w:rPr>
-          <w:instrText xml:space="preserve"> PAGEREF _Toc232428496 \h </w:instrText>
+          <w:instrText xml:space="preserve"> PAGEREF _Toc232431306 \h </w:instrText>
         </w:r>
         <w:r>
           <w:rPr>
@@ -441,11 +441,85 @@
           <w14:ligatures w14:val="standardContextual"/>
         </w:rPr>
       </w:pPr>
-      <w:hyperlink w:anchor="_Toc232428497" w:history="1">
+      <w:hyperlink w:anchor="_Toc232431307" w:history="1">
         <w:r>
           <w:rPr>
             <w:rStyle w:val="Hyperlink"/>
             <w:noProof/>
+            <w:highlight w:val="yellow"/>
+          </w:rPr>
+          <w:t>ACKNOWLEDGEMENT OF AI ASSISTANCE</w:t>
+        </w:r>
+        <w:r>
+          <w:rPr>
+            <w:noProof/>
+            <w:webHidden/>
+          </w:rPr>
+          <w:tab/>
+        </w:r>
+        <w:r>
+          <w:rPr>
+            <w:noProof/>
+            <w:webHidden/>
+          </w:rPr>
+          <w:fldChar w:fldCharType="begin"/>
+        </w:r>
+        <w:r>
+          <w:rPr>
+            <w:noProof/>
+            <w:webHidden/>
+          </w:rPr>
+          <w:instrText xml:space="preserve"> PAGEREF _Toc232431307 \h </w:instrText>
+        </w:r>
+        <w:r>
+          <w:rPr>
+            <w:noProof/>
+            <w:webHidden/>
+          </w:rPr>
+        </w:r>
+        <w:r>
+          <w:rPr>
+            <w:noProof/>
+            <w:webHidden/>
+          </w:rPr>
+          <w:fldChar w:fldCharType="separate"/>
+        </w:r>
+        <w:r>
+          <w:rPr>
+            <w:noProof/>
+            <w:webHidden/>
+          </w:rPr>
+          <w:t>10</w:t>
+        </w:r>
+        <w:r>
+          <w:rPr>
+            <w:noProof/>
+            <w:webHidden/>
+          </w:rPr>
+          <w:fldChar w:fldCharType="end"/>
+        </w:r>
+      </w:hyperlink>
+    </w:p>
+    <w:p>
+      <w:pPr>
+        <w:pStyle w:val="TOC1"/>
+        <w:tabs>
+          <w:tab w:val="right" w:leader="dot" w:pos="9396"/>
+        </w:tabs>
+        <w:rPr>
+          <w:rFonts w:asciiTheme="minorHAnsi" w:hAnsiTheme="minorHAnsi"/>
+          <w:noProof/>
+          <w:kern w:val="2"/>
+          <w:szCs w:val="24"/>
+          <w:lang w:val="en-GB" w:eastAsia="en-GB"/>
+          <w14:ligatures w14:val="standardContextual"/>
+        </w:rPr>
+      </w:pPr>
+      <w:hyperlink w:anchor="_Toc232431308" w:history="1">
+        <w:r>
+          <w:rPr>
+            <w:rStyle w:val="Hyperlink"/>
+            <w:noProof/>
           </w:rPr>
           <w:t>CHAPTER ONE: INTRODUCTION</w:t>
         </w:r>
@@ -468,7 +542,7 @@
             <w:noProof/>
             <w:webHidden/>
           </w:rPr>
-          <w:instrText xml:space="preserve"> PAGEREF _Toc232428497 \h </w:instrText>
+          <w:instrText xml:space="preserve"> PAGEREF _Toc232431308 \h </w:instrText>
         </w:r>
         <w:r>
           <w:rPr>
@@ -514,7 +588,7 @@
           <w14:ligatures w14:val="standardContextual"/>
         </w:rPr>
       </w:pPr>
-      <w:hyperlink w:anchor="_Toc232428498" w:history="1">
+      <w:hyperlink w:anchor="_Toc232431309" w:history="1">
         <w:r>
           <w:rPr>
             <w:rStyle w:val="Hyperlink"/>
@@ -541,7 +615,7 @@
             <w:noProof/>
             <w:webHidden/>
           </w:rPr>
-          <w:instrText xml:space="preserve"> PAGEREF _Toc232428498 \h </w:instrText>
+          <w:instrText xml:space="preserve"> PAGEREF _Toc232431309 \h </w:instrText>
         </w:r>
         <w:r>
           <w:rPr>
@@ -587,7 +661,7 @@
           <w14:ligatures w14:val="standardContextual"/>
         </w:rPr>
       </w:pPr>
-      <w:hyperlink w:anchor="_Toc232428499" w:history="1">
+      <w:hyperlink w:anchor="_Toc232431310" w:history="1">
         <w:r>
           <w:rPr>
             <w:rStyle w:val="Hyperlink"/>
@@ -614,7 +688,7 @@
             <w:noProof/>
             <w:webHidden/>
           </w:rPr>
-          <w:instrText xml:space="preserve"> PAGEREF _Toc232428499 \h </w:instrText>
+          <w:instrText xml:space="preserve"> PAGEREF _Toc232431310 \h </w:instrText>
         </w:r>
         <w:r>
           <w:rPr>
@@ -660,7 +734,7 @@
           <w14:ligatures w14:val="standardContextual"/>
         </w:rPr>
       </w:pPr>
-      <w:hyperlink w:anchor="_Toc232428500" w:history="1">
+      <w:hyperlink w:anchor="_Toc232431311" w:history="1">
         <w:r>
           <w:rPr>
             <w:rStyle w:val="Hyperlink"/>
@@ -687,7 +761,7 @@
             <w:noProof/>
             <w:webHidden/>
           </w:rPr>
-          <w:instrText xml:space="preserve"> PAGEREF _Toc232428500 \h </w:instrText>
+          <w:instrText xml:space="preserve"> PAGEREF _Toc232431311 \h </w:instrText>
         </w:r>
         <w:r>
           <w:rPr>
@@ -707,7 +781,7 @@
             <w:noProof/>
             <w:webHidden/>
           </w:rPr>
-          <w:t>11</w:t>
+          <w:t>12</w:t>
         </w:r>
         <w:r>
           <w:rPr>
@@ -733,7 +807,7 @@
           <w14:ligatures w14:val="standardContextual"/>
         </w:rPr>
       </w:pPr>
-      <w:hyperlink w:anchor="_Toc232428501" w:history="1">
+      <w:hyperlink w:anchor="_Toc232431312" w:history="1">
         <w:r>
           <w:rPr>
             <w:rStyle w:val="Hyperlink"/>
@@ -761,7 +835,7 @@
             <w:noProof/>
             <w:webHidden/>
           </w:rPr>
-          <w:instrText xml:space="preserve"> PAGEREF _Toc232428501 \h </w:instrText>
+          <w:instrText xml:space="preserve"> PAGEREF _Toc232431312 \h </w:instrText>
         </w:r>
         <w:r>
           <w:rPr>
@@ -807,7 +881,7 @@
           <w14:ligatures w14:val="standardContextual"/>
         </w:rPr>
       </w:pPr>
-      <w:hyperlink w:anchor="_Toc232428502" w:history="1">
+      <w:hyperlink w:anchor="_Toc232431313" w:history="1">
         <w:r>
           <w:rPr>
             <w:rStyle w:val="Hyperlink"/>
@@ -834,7 +908,7 @@
             <w:noProof/>
             <w:webHidden/>
           </w:rPr>
-          <w:instrText xml:space="preserve"> PAGEREF _Toc232428502 \h </w:instrText>
+          <w:instrText xml:space="preserve"> PAGEREF _Toc232431313 \h </w:instrText>
         </w:r>
         <w:r>
           <w:rPr>
@@ -880,7 +954,7 @@
           <w14:ligatures w14:val="standardContextual"/>
         </w:rPr>
       </w:pPr>
-      <w:hyperlink w:anchor="_Toc232428503" w:history="1">
+      <w:hyperlink w:anchor="_Toc232431314" w:history="1">
         <w:r>
           <w:rPr>
             <w:rStyle w:val="Hyperlink"/>
@@ -907,7 +981,7 @@
             <w:noProof/>
             <w:webHidden/>
           </w:rPr>
-          <w:instrText xml:space="preserve"> PAGEREF _Toc232428503 \h </w:instrText>
+          <w:instrText xml:space="preserve"> PAGEREF _Toc232431314 \h </w:instrText>
         </w:r>
         <w:r>
           <w:rPr>
@@ -953,7 +1027,7 @@
           <w14:ligatures w14:val="standardContextual"/>
         </w:rPr>
       </w:pPr>
-      <w:hyperlink w:anchor="_Toc232428504" w:history="1">
+      <w:hyperlink w:anchor="_Toc232431315" w:history="1">
         <w:r>
           <w:rPr>
             <w:rStyle w:val="Hyperlink"/>
@@ -980,7 +1054,7 @@
             <w:noProof/>
             <w:webHidden/>
           </w:rPr>
-          <w:instrText xml:space="preserve"> PAGEREF _Toc232428504 \h </w:instrText>
+          <w:instrText xml:space="preserve"> PAGEREF _Toc232431315 \h </w:instrText>
         </w:r>
         <w:r>
           <w:rPr>
@@ -1000,7 +1074,7 @@
             <w:noProof/>
             <w:webHidden/>
           </w:rPr>
-          <w:t>13</w:t>
+          <w:t>14</w:t>
         </w:r>
         <w:r>
           <w:rPr>
@@ -1026,7 +1100,7 @@
           <w14:ligatures w14:val="standardContextual"/>
         </w:rPr>
       </w:pPr>
-      <w:hyperlink w:anchor="_Toc232428505" w:history="1">
+      <w:hyperlink w:anchor="_Toc232431316" w:history="1">
         <w:r>
           <w:rPr>
             <w:rStyle w:val="Hyperlink"/>
@@ -1053,7 +1127,7 @@
             <w:noProof/>
             <w:webHidden/>
           </w:rPr>
-          <w:instrText xml:space="preserve"> PAGEREF _Toc232428505 \h </w:instrText>
+          <w:instrText xml:space="preserve"> PAGEREF _Toc232431316 \h </w:instrText>
         </w:r>
         <w:r>
           <w:rPr>
@@ -1099,7 +1173,7 @@
           <w14:ligatures w14:val="standardContextual"/>
         </w:rPr>
       </w:pPr>
-      <w:hyperlink w:anchor="_Toc232428506" w:history="1">
+      <w:hyperlink w:anchor="_Toc232431317" w:history="1">
         <w:r>
           <w:rPr>
             <w:rStyle w:val="Hyperlink"/>
@@ -1126,7 +1200,7 @@
             <w:noProof/>
             <w:webHidden/>
           </w:rPr>
-          <w:instrText xml:space="preserve"> PAGEREF _Toc232428506 \h </w:instrText>
+          <w:instrText xml:space="preserve"> PAGEREF _Toc232431317 \h </w:instrText>
         </w:r>
         <w:r>
           <w:rPr>
@@ -1172,7 +1246,7 @@
           <w14:ligatures w14:val="standardContextual"/>
         </w:rPr>
       </w:pPr>
-      <w:hyperlink w:anchor="_Toc232428507" w:history="1">
+      <w:hyperlink w:anchor="_Toc232431318" w:history="1">
         <w:r>
           <w:rPr>
             <w:rStyle w:val="Hyperlink"/>
@@ -1199,7 +1273,7 @@
             <w:noProof/>
             <w:webHidden/>
           </w:rPr>
-          <w:instrText xml:space="preserve"> PAGEREF _Toc232428507 \h </w:instrText>
+          <w:instrText xml:space="preserve"> PAGEREF _Toc232431318 \h </w:instrText>
         </w:r>
         <w:r>
           <w:rPr>
@@ -1219,7 +1293,7 @@
             <w:noProof/>
             <w:webHidden/>
           </w:rPr>
-          <w:t>16</w:t>
+          <w:t>17</w:t>
         </w:r>
         <w:r>
           <w:rPr>
@@ -1245,7 +1319,7 @@
           <w14:ligatures w14:val="standardContextual"/>
         </w:rPr>
       </w:pPr>
-      <w:hyperlink w:anchor="_Toc232428508" w:history="1">
+      <w:hyperlink w:anchor="_Toc232431319" w:history="1">
         <w:r>
           <w:rPr>
             <w:rStyle w:val="Hyperlink"/>
@@ -1272,7 +1346,7 @@
             <w:noProof/>
             <w:webHidden/>
           </w:rPr>
-          <w:instrText xml:space="preserve"> PAGEREF _Toc232428508 \h </w:instrText>
+          <w:instrText xml:space="preserve"> PAGEREF _Toc232431319 \h </w:instrText>
         </w:r>
         <w:r>
           <w:rPr>
@@ -1292,7 +1366,7 @@
             <w:noProof/>
             <w:webHidden/>
           </w:rPr>
-          <w:t>16</w:t>
+          <w:t>17</w:t>
         </w:r>
         <w:r>
           <w:rPr>
@@ -1318,7 +1392,7 @@
           <w14:ligatures w14:val="standardContextual"/>
         </w:rPr>
       </w:pPr>
-      <w:hyperlink w:anchor="_Toc232428509" w:history="1">
+      <w:hyperlink w:anchor="_Toc232431320" w:history="1">
         <w:r>
           <w:rPr>
             <w:rStyle w:val="Hyperlink"/>
@@ -1345,7 +1419,7 @@
             <w:noProof/>
             <w:webHidden/>
           </w:rPr>
-          <w:instrText xml:space="preserve"> PAGEREF _Toc232428509 \h </w:instrText>
+          <w:instrText xml:space="preserve"> PAGEREF _Toc232431320 \h </w:instrText>
         </w:r>
         <w:r>
           <w:rPr>
@@ -1365,7 +1439,7 @@
             <w:noProof/>
             <w:webHidden/>
           </w:rPr>
-          <w:t>16</w:t>
+          <w:t>17</w:t>
         </w:r>
         <w:r>
           <w:rPr>
@@ -1391,7 +1465,7 @@
           <w14:ligatures w14:val="standardContextual"/>
         </w:rPr>
       </w:pPr>
-      <w:hyperlink w:anchor="_Toc232428510" w:history="1">
+      <w:hyperlink w:anchor="_Toc232431321" w:history="1">
         <w:r>
           <w:rPr>
             <w:rStyle w:val="Hyperlink"/>
@@ -1418,7 +1492,7 @@
             <w:noProof/>
             <w:webHidden/>
           </w:rPr>
-          <w:instrText xml:space="preserve"> PAGEREF _Toc232428510 \h </w:instrText>
+          <w:instrText xml:space="preserve"> PAGEREF _Toc232431321 \h </w:instrText>
         </w:r>
         <w:r>
           <w:rPr>
@@ -1438,7 +1512,7 @@
             <w:noProof/>
             <w:webHidden/>
           </w:rPr>
-          <w:t>17</w:t>
+          <w:t>18</w:t>
         </w:r>
         <w:r>
           <w:rPr>
@@ -1464,7 +1538,7 @@
           <w14:ligatures w14:val="standardContextual"/>
         </w:rPr>
       </w:pPr>
-      <w:hyperlink w:anchor="_Toc232428511" w:history="1">
+      <w:hyperlink w:anchor="_Toc232431322" w:history="1">
         <w:r>
           <w:rPr>
             <w:rStyle w:val="Hyperlink"/>
@@ -1491,7 +1565,7 @@
             <w:noProof/>
             <w:webHidden/>
           </w:rPr>
-          <w:instrText xml:space="preserve"> PAGEREF _Toc232428511 \h </w:instrText>
+          <w:instrText xml:space="preserve"> PAGEREF _Toc232431322 \h </w:instrText>
         </w:r>
         <w:r>
           <w:rPr>
@@ -1511,7 +1585,7 @@
             <w:noProof/>
             <w:webHidden/>
           </w:rPr>
-          <w:t>17</w:t>
+          <w:t>18</w:t>
         </w:r>
         <w:r>
           <w:rPr>
@@ -1537,7 +1611,7 @@
           <w14:ligatures w14:val="standardContextual"/>
         </w:rPr>
       </w:pPr>
-      <w:hyperlink w:anchor="_Toc232428512" w:history="1">
+      <w:hyperlink w:anchor="_Toc232431323" w:history="1">
         <w:r>
           <w:rPr>
             <w:rStyle w:val="Hyperlink"/>
@@ -1564,7 +1638,7 @@
             <w:noProof/>
             <w:webHidden/>
           </w:rPr>
-          <w:instrText xml:space="preserve"> PAGEREF _Toc232428512 \h </w:instrText>
+          <w:instrText xml:space="preserve"> PAGEREF _Toc232431323 \h </w:instrText>
         </w:r>
         <w:r>
           <w:rPr>
@@ -1584,7 +1658,7 @@
             <w:noProof/>
             <w:webHidden/>
           </w:rPr>
-          <w:t>19</w:t>
+          <w:t>20</w:t>
         </w:r>
         <w:r>
           <w:rPr>
@@ -1610,7 +1684,7 @@
           <w14:ligatures w14:val="standardContextual"/>
         </w:rPr>
       </w:pPr>
-      <w:hyperlink w:anchor="_Toc232428513" w:history="1">
+      <w:hyperlink w:anchor="_Toc232431324" w:history="1">
         <w:r>
           <w:rPr>
             <w:rStyle w:val="Hyperlink"/>
@@ -1637,7 +1711,7 @@
             <w:noProof/>
             <w:webHidden/>
           </w:rPr>
-          <w:instrText xml:space="preserve"> PAGEREF _Toc232428513 \h </w:instrText>
+          <w:instrText xml:space="preserve"> PAGEREF _Toc232431324 \h </w:instrText>
         </w:r>
         <w:r>
           <w:rPr>
@@ -1657,7 +1731,7 @@
             <w:noProof/>
             <w:webHidden/>
           </w:rPr>
-          <w:t>20</w:t>
+          <w:t>21</w:t>
         </w:r>
         <w:r>
           <w:rPr>
@@ -1683,7 +1757,7 @@
           <w14:ligatures w14:val="standardContextual"/>
         </w:rPr>
       </w:pPr>
-      <w:hyperlink w:anchor="_Toc232428514" w:history="1">
+      <w:hyperlink w:anchor="_Toc232431325" w:history="1">
         <w:r>
           <w:rPr>
             <w:rStyle w:val="Hyperlink"/>
@@ -1711,7 +1785,7 @@
             <w:noProof/>
             <w:webHidden/>
           </w:rPr>
-          <w:instrText xml:space="preserve"> PAGEREF _Toc232428514 \h </w:instrText>
+          <w:instrText xml:space="preserve"> PAGEREF _Toc232431325 \h </w:instrText>
         </w:r>
         <w:r>
           <w:rPr>
@@ -1731,7 +1805,7 @@
             <w:noProof/>
             <w:webHidden/>
           </w:rPr>
-          <w:t>20</w:t>
+          <w:t>21</w:t>
         </w:r>
         <w:r>
           <w:rPr>
@@ -1757,7 +1831,7 @@
           <w14:ligatures w14:val="standardContextual"/>
         </w:rPr>
       </w:pPr>
-      <w:hyperlink w:anchor="_Toc232428515" w:history="1">
+      <w:hyperlink w:anchor="_Toc232431326" w:history="1">
         <w:r>
           <w:rPr>
             <w:rStyle w:val="Hyperlink"/>
@@ -1785,7 +1859,7 @@
             <w:noProof/>
             <w:webHidden/>
           </w:rPr>
-          <w:instrText xml:space="preserve"> PAGEREF _Toc232428515 \h </w:instrText>
+          <w:instrText xml:space="preserve"> PAGEREF _Toc232431326 \h </w:instrText>
         </w:r>
         <w:r>
           <w:rPr>
@@ -1805,7 +1879,7 @@
             <w:noProof/>
             <w:webHidden/>
           </w:rPr>
-          <w:t>21</w:t>
+          <w:t>22</w:t>
         </w:r>
         <w:r>
           <w:rPr>
@@ -1831,7 +1905,7 @@
           <w14:ligatures w14:val="standardContextual"/>
         </w:rPr>
       </w:pPr>
-      <w:hyperlink w:anchor="_Toc232428516" w:history="1">
+      <w:hyperlink w:anchor="_Toc232431327" w:history="1">
         <w:r>
           <w:rPr>
             <w:rStyle w:val="Hyperlink"/>
@@ -1859,7 +1933,7 @@
             <w:noProof/>
             <w:webHidden/>
           </w:rPr>
-          <w:instrText xml:space="preserve"> PAGEREF _Toc232428516 \h </w:instrText>
+          <w:instrText xml:space="preserve"> PAGEREF _Toc232431327 \h </w:instrText>
         </w:r>
         <w:r>
           <w:rPr>
@@ -1879,7 +1953,7 @@
             <w:noProof/>
             <w:webHidden/>
           </w:rPr>
-          <w:t>22</w:t>
+          <w:t>23</w:t>
         </w:r>
         <w:r>
           <w:rPr>
@@ -1905,7 +1979,7 @@
           <w14:ligatures w14:val="standardContextual"/>
         </w:rPr>
       </w:pPr>
-      <w:hyperlink w:anchor="_Toc232428517" w:history="1">
+      <w:hyperlink w:anchor="_Toc232431328" w:history="1">
         <w:r>
           <w:rPr>
             <w:rStyle w:val="Hyperlink"/>
@@ -1932,7 +2006,7 @@
             <w:noProof/>
             <w:webHidden/>
           </w:rPr>
-          <w:instrText xml:space="preserve"> PAGEREF _Toc232428517 \h </w:instrText>
+          <w:instrText xml:space="preserve"> PAGEREF _Toc232431328 \h </w:instrText>
         </w:r>
         <w:r>
           <w:rPr>
@@ -1952,7 +2026,7 @@
             <w:noProof/>
             <w:webHidden/>
           </w:rPr>
-          <w:t>22</w:t>
+          <w:t>23</w:t>
         </w:r>
         <w:r>
           <w:rPr>
@@ -1978,7 +2052,7 @@
           <w14:ligatures w14:val="standardContextual"/>
         </w:rPr>
       </w:pPr>
-      <w:hyperlink w:anchor="_Toc232428518" w:history="1">
+      <w:hyperlink w:anchor="_Toc232431329" w:history="1">
         <w:r>
           <w:rPr>
             <w:rStyle w:val="Hyperlink"/>
@@ -2005,7 +2079,7 @@
             <w:noProof/>
             <w:webHidden/>
           </w:rPr>
-          <w:instrText xml:space="preserve"> PAGEREF _Toc232428518 \h </w:instrText>
+          <w:instrText xml:space="preserve"> PAGEREF _Toc232431329 \h </w:instrText>
         </w:r>
         <w:r>
           <w:rPr>
@@ -2025,7 +2099,7 @@
             <w:noProof/>
             <w:webHidden/>
           </w:rPr>
-          <w:t>23</w:t>
+          <w:t>24</w:t>
         </w:r>
         <w:r>
           <w:rPr>
@@ -2051,7 +2125,7 @@
           <w14:ligatures w14:val="standardContextual"/>
         </w:rPr>
       </w:pPr>
-      <w:hyperlink w:anchor="_Toc232428519" w:history="1">
+      <w:hyperlink w:anchor="_Toc232431330" w:history="1">
         <w:r>
           <w:rPr>
             <w:rStyle w:val="Hyperlink"/>
@@ -2078,7 +2152,7 @@
             <w:noProof/>
             <w:webHidden/>
           </w:rPr>
-          <w:instrText xml:space="preserve"> PAGEREF _Toc232428519 \h </w:instrText>
+          <w:instrText xml:space="preserve"> PAGEREF _Toc232431330 \h </w:instrText>
         </w:r>
         <w:r>
           <w:rPr>
@@ -2098,7 +2172,7 @@
             <w:noProof/>
             <w:webHidden/>
           </w:rPr>
-          <w:t>23</w:t>
+          <w:t>24</w:t>
         </w:r>
         <w:r>
           <w:rPr>
@@ -2124,7 +2198,7 @@
           <w14:ligatures w14:val="standardContextual"/>
         </w:rPr>
       </w:pPr>
-      <w:hyperlink w:anchor="_Toc232428520" w:history="1">
+      <w:hyperlink w:anchor="_Toc232431331" w:history="1">
         <w:r>
           <w:rPr>
             <w:rStyle w:val="Hyperlink"/>
@@ -2151,7 +2225,7 @@
             <w:noProof/>
             <w:webHidden/>
           </w:rPr>
-          <w:instrText xml:space="preserve"> PAGEREF _Toc232428520 \h </w:instrText>
+          <w:instrText xml:space="preserve"> PAGEREF _Toc232431331 \h </w:instrText>
         </w:r>
         <w:r>
           <w:rPr>
@@ -2171,7 +2245,7 @@
             <w:noProof/>
             <w:webHidden/>
           </w:rPr>
-          <w:t>23</w:t>
+          <w:t>24</w:t>
         </w:r>
         <w:r>
           <w:rPr>
@@ -2197,7 +2271,7 @@
           <w14:ligatures w14:val="standardContextual"/>
         </w:rPr>
       </w:pPr>
-      <w:hyperlink w:anchor="_Toc232428521" w:history="1">
+      <w:hyperlink w:anchor="_Toc232431332" w:history="1">
         <w:r>
           <w:rPr>
             <w:rStyle w:val="Hyperlink"/>
@@ -2225,7 +2299,7 @@
             <w:noProof/>
             <w:webHidden/>
           </w:rPr>
-          <w:instrText xml:space="preserve"> PAGEREF _Toc232428521 \h </w:instrText>
+          <w:instrText xml:space="preserve"> PAGEREF _Toc232431332 \h </w:instrText>
         </w:r>
         <w:r>
           <w:rPr>
@@ -2245,7 +2319,7 @@
             <w:noProof/>
             <w:webHidden/>
           </w:rPr>
-          <w:t>23</w:t>
+          <w:t>24</w:t>
         </w:r>
         <w:r>
           <w:rPr>
@@ -2271,7 +2345,7 @@
           <w14:ligatures w14:val="standardContextual"/>
         </w:rPr>
       </w:pPr>
-      <w:hyperlink w:anchor="_Toc232428522" w:history="1">
+      <w:hyperlink w:anchor="_Toc232431333" w:history="1">
         <w:r>
           <w:rPr>
             <w:rStyle w:val="Hyperlink"/>
@@ -2298,7 +2372,7 @@
             <w:noProof/>
             <w:webHidden/>
           </w:rPr>
-          <w:instrText xml:space="preserve"> PAGEREF _Toc232428522 \h </w:instrText>
+          <w:instrText xml:space="preserve"> PAGEREF _Toc232431333 \h </w:instrText>
         </w:r>
         <w:r>
           <w:rPr>
@@ -2318,7 +2392,7 @@
             <w:noProof/>
             <w:webHidden/>
           </w:rPr>
-          <w:t>24</w:t>
+          <w:t>25</w:t>
         </w:r>
         <w:r>
           <w:rPr>
@@ -2344,7 +2418,7 @@
           <w14:ligatures w14:val="standardContextual"/>
         </w:rPr>
       </w:pPr>
-      <w:hyperlink w:anchor="_Toc232428523" w:history="1">
+      <w:hyperlink w:anchor="_Toc232431334" w:history="1">
         <w:r>
           <w:rPr>
             <w:rStyle w:val="Hyperlink"/>
@@ -2372,7 +2446,7 @@
             <w:noProof/>
             <w:webHidden/>
           </w:rPr>
-          <w:instrText xml:space="preserve"> PAGEREF _Toc232428523 \h </w:instrText>
+          <w:instrText xml:space="preserve"> PAGEREF _Toc232431334 \h </w:instrText>
         </w:r>
         <w:r>
           <w:rPr>
@@ -2392,7 +2466,7 @@
             <w:noProof/>
             <w:webHidden/>
           </w:rPr>
-          <w:t>24</w:t>
+          <w:t>25</w:t>
         </w:r>
         <w:r>
           <w:rPr>
@@ -2418,7 +2492,7 @@
           <w14:ligatures w14:val="standardContextual"/>
         </w:rPr>
       </w:pPr>
-      <w:hyperlink w:anchor="_Toc232428524" w:history="1">
+      <w:hyperlink w:anchor="_Toc232431335" w:history="1">
         <w:r>
           <w:rPr>
             <w:rStyle w:val="Hyperlink"/>
@@ -2446,7 +2520,7 @@
             <w:noProof/>
             <w:webHidden/>
           </w:rPr>
-          <w:instrText xml:space="preserve"> PAGEREF _Toc232428524 \h </w:instrText>
+          <w:instrText xml:space="preserve"> PAGEREF _Toc232431335 \h </w:instrText>
         </w:r>
         <w:r>
           <w:rPr>
@@ -2466,7 +2540,7 @@
             <w:noProof/>
             <w:webHidden/>
           </w:rPr>
-          <w:t>25</w:t>
+          <w:t>26</w:t>
         </w:r>
         <w:r>
           <w:rPr>
@@ -2492,7 +2566,7 @@
           <w14:ligatures w14:val="standardContextual"/>
         </w:rPr>
       </w:pPr>
-      <w:hyperlink w:anchor="_Toc232428525" w:history="1">
+      <w:hyperlink w:anchor="_Toc232431336" w:history="1">
         <w:r>
           <w:rPr>
             <w:rStyle w:val="Hyperlink"/>
@@ -2519,7 +2593,7 @@
             <w:noProof/>
             <w:webHidden/>
           </w:rPr>
-          <w:instrText xml:space="preserve"> PAGEREF _Toc232428525 \h </w:instrText>
+          <w:instrText xml:space="preserve"> PAGEREF _Toc232431336 \h </w:instrText>
         </w:r>
         <w:r>
           <w:rPr>
@@ -2539,7 +2613,7 @@
             <w:noProof/>
             <w:webHidden/>
           </w:rPr>
-          <w:t>25</w:t>
+          <w:t>26</w:t>
         </w:r>
         <w:r>
           <w:rPr>
@@ -2565,7 +2639,7 @@
           <w14:ligatures w14:val="standardContextual"/>
         </w:rPr>
       </w:pPr>
-      <w:hyperlink w:anchor="_Toc232428526" w:history="1">
+      <w:hyperlink w:anchor="_Toc232431337" w:history="1">
         <w:r>
           <w:rPr>
             <w:rStyle w:val="Hyperlink"/>
@@ -2593,7 +2667,7 @@
             <w:noProof/>
             <w:webHidden/>
           </w:rPr>
-          <w:instrText xml:space="preserve"> PAGEREF _Toc232428526 \h </w:instrText>
+          <w:instrText xml:space="preserve"> PAGEREF _Toc232431337 \h </w:instrText>
         </w:r>
         <w:r>
           <w:rPr>
@@ -2613,7 +2687,7 @@
             <w:noProof/>
             <w:webHidden/>
           </w:rPr>
-          <w:t>26</w:t>
+          <w:t>27</w:t>
         </w:r>
         <w:r>
           <w:rPr>
@@ -2639,7 +2713,7 @@
           <w14:ligatures w14:val="standardContextual"/>
         </w:rPr>
       </w:pPr>
-      <w:hyperlink w:anchor="_Toc232428527" w:history="1">
+      <w:hyperlink w:anchor="_Toc232431338" w:history="1">
         <w:r>
           <w:rPr>
             <w:rStyle w:val="Hyperlink"/>
@@ -2667,7 +2741,7 @@
             <w:noProof/>
             <w:webHidden/>
           </w:rPr>
-          <w:instrText xml:space="preserve"> PAGEREF _Toc232428527 \h </w:instrText>
+          <w:instrText xml:space="preserve"> PAGEREF _Toc232431338 \h </w:instrText>
         </w:r>
         <w:r>
           <w:rPr>
@@ -2687,7 +2761,7 @@
             <w:noProof/>
             <w:webHidden/>
           </w:rPr>
-          <w:t>27</w:t>
+          <w:t>28</w:t>
         </w:r>
         <w:r>
           <w:rPr>
@@ -2713,7 +2787,7 @@
           <w14:ligatures w14:val="standardContextual"/>
         </w:rPr>
       </w:pPr>
-      <w:hyperlink w:anchor="_Toc232428528" w:history="1">
+      <w:hyperlink w:anchor="_Toc232431339" w:history="1">
         <w:r>
           <w:rPr>
             <w:rStyle w:val="Hyperlink"/>
@@ -2741,7 +2815,7 @@
             <w:noProof/>
             <w:webHidden/>
           </w:rPr>
-          <w:instrText xml:space="preserve"> PAGEREF _Toc232428528 \h </w:instrText>
+          <w:instrText xml:space="preserve"> PAGEREF _Toc232431339 \h </w:instrText>
         </w:r>
         <w:r>
           <w:rPr>
@@ -2761,7 +2835,7 @@
             <w:noProof/>
             <w:webHidden/>
           </w:rPr>
-          <w:t>28</w:t>
+          <w:t>29</w:t>
         </w:r>
         <w:r>
           <w:rPr>
@@ -2787,7 +2861,7 @@
           <w14:ligatures w14:val="standardContextual"/>
         </w:rPr>
       </w:pPr>
-      <w:hyperlink w:anchor="_Toc232428529" w:history="1">
+      <w:hyperlink w:anchor="_Toc232431340" w:history="1">
         <w:r>
           <w:rPr>
             <w:rStyle w:val="Hyperlink"/>
@@ -2815,7 +2889,7 @@
             <w:noProof/>
             <w:webHidden/>
           </w:rPr>
-          <w:instrText xml:space="preserve"> PAGEREF _Toc232428529 \h </w:instrText>
+          <w:instrText xml:space="preserve"> PAGEREF _Toc232431340 \h </w:instrText>
         </w:r>
         <w:r>
           <w:rPr>
@@ -2835,7 +2909,7 @@
             <w:noProof/>
             <w:webHidden/>
           </w:rPr>
-          <w:t>29</w:t>
+          <w:t>30</w:t>
         </w:r>
         <w:r>
           <w:rPr>
@@ -2861,7 +2935,7 @@
           <w14:ligatures w14:val="standardContextual"/>
         </w:rPr>
       </w:pPr>
-      <w:hyperlink w:anchor="_Toc232428530" w:history="1">
+      <w:hyperlink w:anchor="_Toc232431341" w:history="1">
         <w:r>
           <w:rPr>
             <w:rStyle w:val="Hyperlink"/>
@@ -2889,7 +2963,7 @@
             <w:noProof/>
             <w:webHidden/>
           </w:rPr>
-          <w:instrText xml:space="preserve"> PAGEREF _Toc232428530 \h </w:instrText>
+          <w:instrText xml:space="preserve"> PAGEREF _Toc232431341 \h </w:instrText>
         </w:r>
         <w:r>
           <w:rPr>
@@ -2909,7 +2983,7 @@
             <w:noProof/>
             <w:webHidden/>
           </w:rPr>
-          <w:t>30</w:t>
+          <w:t>31</w:t>
         </w:r>
         <w:r>
           <w:rPr>
@@ -2935,7 +3009,7 @@
           <w14:ligatures w14:val="standardContextual"/>
         </w:rPr>
       </w:pPr>
-      <w:hyperlink w:anchor="_Toc232428531" w:history="1">
+      <w:hyperlink w:anchor="_Toc232431342" w:history="1">
         <w:r>
           <w:rPr>
             <w:rStyle w:val="Hyperlink"/>
@@ -2962,7 +3036,7 @@
             <w:noProof/>
             <w:webHidden/>
           </w:rPr>
-          <w:instrText xml:space="preserve"> PAGEREF _Toc232428531 \h </w:instrText>
+          <w:instrText xml:space="preserve"> PAGEREF _Toc232431342 \h </w:instrText>
         </w:r>
         <w:r>
           <w:rPr>
@@ -2982,7 +3056,7 @@
             <w:noProof/>
             <w:webHidden/>
           </w:rPr>
-          <w:t>31</w:t>
+          <w:t>32</w:t>
         </w:r>
         <w:r>
           <w:rPr>
@@ -3008,7 +3082,7 @@
           <w14:ligatures w14:val="standardContextual"/>
         </w:rPr>
       </w:pPr>
-      <w:hyperlink w:anchor="_Toc232428532" w:history="1">
+      <w:hyperlink w:anchor="_Toc232431343" w:history="1">
         <w:r>
           <w:rPr>
             <w:rStyle w:val="Hyperlink"/>
@@ -3036,7 +3110,7 @@
             <w:noProof/>
             <w:webHidden/>
           </w:rPr>
-          <w:instrText xml:space="preserve"> PAGEREF _Toc232428532 \h </w:instrText>
+          <w:instrText xml:space="preserve"> PAGEREF _Toc232431343 \h </w:instrText>
         </w:r>
         <w:r>
           <w:rPr>
@@ -3056,7 +3130,7 @@
             <w:noProof/>
             <w:webHidden/>
           </w:rPr>
-          <w:t>31</w:t>
+          <w:t>32</w:t>
         </w:r>
         <w:r>
           <w:rPr>
@@ -3082,7 +3156,7 @@
           <w14:ligatures w14:val="standardContextual"/>
         </w:rPr>
       </w:pPr>
-      <w:hyperlink w:anchor="_Toc232428533" w:history="1">
+      <w:hyperlink w:anchor="_Toc232431344" w:history="1">
         <w:r>
           <w:rPr>
             <w:rStyle w:val="Hyperlink"/>
@@ -3110,7 +3184,7 @@
             <w:noProof/>
             <w:webHidden/>
           </w:rPr>
-          <w:instrText xml:space="preserve"> PAGEREF _Toc232428533 \h </w:instrText>
+          <w:instrText xml:space="preserve"> PAGEREF _Toc232431344 \h </w:instrText>
         </w:r>
         <w:r>
           <w:rPr>
@@ -3130,7 +3204,7 @@
             <w:noProof/>
             <w:webHidden/>
           </w:rPr>
-          <w:t>31</w:t>
+          <w:t>32</w:t>
         </w:r>
         <w:r>
           <w:rPr>
@@ -3156,7 +3230,7 @@
           <w14:ligatures w14:val="standardContextual"/>
         </w:rPr>
       </w:pPr>
-      <w:hyperlink w:anchor="_Toc232428534" w:history="1">
+      <w:hyperlink w:anchor="_Toc232431345" w:history="1">
         <w:r>
           <w:rPr>
             <w:rStyle w:val="Hyperlink"/>
@@ -3184,7 +3258,7 @@
             <w:noProof/>
             <w:webHidden/>
           </w:rPr>
-          <w:instrText xml:space="preserve"> PAGEREF _Toc232428534 \h </w:instrText>
+          <w:instrText xml:space="preserve"> PAGEREF _Toc232431345 \h </w:instrText>
         </w:r>
         <w:r>
           <w:rPr>
@@ -3204,7 +3278,7 @@
             <w:noProof/>
             <w:webHidden/>
           </w:rPr>
-          <w:t>32</w:t>
+          <w:t>33</w:t>
         </w:r>
         <w:r>
           <w:rPr>
@@ -3230,7 +3304,7 @@
           <w14:ligatures w14:val="standardContextual"/>
         </w:rPr>
       </w:pPr>
-      <w:hyperlink w:anchor="_Toc232428535" w:history="1">
+      <w:hyperlink w:anchor="_Toc232431346" w:history="1">
         <w:r>
           <w:rPr>
             <w:rStyle w:val="Hyperlink"/>
@@ -3258,7 +3332,7 @@
             <w:noProof/>
             <w:webHidden/>
           </w:rPr>
-          <w:instrText xml:space="preserve"> PAGEREF _Toc232428535 \h </w:instrText>
+          <w:instrText xml:space="preserve"> PAGEREF _Toc232431346 \h </w:instrText>
         </w:r>
         <w:r>
           <w:rPr>
@@ -3278,7 +3352,7 @@
             <w:noProof/>
             <w:webHidden/>
           </w:rPr>
-          <w:t>33</w:t>
+          <w:t>34</w:t>
         </w:r>
         <w:r>
           <w:rPr>
@@ -3304,7 +3378,7 @@
           <w14:ligatures w14:val="standardContextual"/>
         </w:rPr>
       </w:pPr>
-      <w:hyperlink w:anchor="_Toc232428536" w:history="1">
+      <w:hyperlink w:anchor="_Toc232431347" w:history="1">
         <w:r>
           <w:rPr>
             <w:rStyle w:val="Hyperlink"/>
@@ -3332,7 +3406,7 @@
             <w:noProof/>
             <w:webHidden/>
           </w:rPr>
-          <w:instrText xml:space="preserve"> PAGEREF _Toc232428536 \h </w:instrText>
+          <w:instrText xml:space="preserve"> PAGEREF _Toc232431347 \h </w:instrText>
         </w:r>
         <w:r>
           <w:rPr>
@@ -3352,7 +3426,7 @@
             <w:noProof/>
             <w:webHidden/>
           </w:rPr>
-          <w:t>34</w:t>
+          <w:t>35</w:t>
         </w:r>
         <w:r>
           <w:rPr>
@@ -3378,7 +3452,7 @@
           <w14:ligatures w14:val="standardContextual"/>
         </w:rPr>
       </w:pPr>
-      <w:hyperlink w:anchor="_Toc232428537" w:history="1">
+      <w:hyperlink w:anchor="_Toc232431348" w:history="1">
         <w:r>
           <w:rPr>
             <w:rStyle w:val="Hyperlink"/>
@@ -3405,7 +3479,7 @@
             <w:noProof/>
             <w:webHidden/>
           </w:rPr>
-          <w:instrText xml:space="preserve"> PAGEREF _Toc232428537 \h </w:instrText>
+          <w:instrText xml:space="preserve"> PAGEREF _Toc232431348 \h </w:instrText>
         </w:r>
         <w:r>
           <w:rPr>
@@ -3425,7 +3499,7 @@
             <w:noProof/>
             <w:webHidden/>
           </w:rPr>
-          <w:t>35</w:t>
+          <w:t>36</w:t>
         </w:r>
         <w:r>
           <w:rPr>
@@ -3451,7 +3525,7 @@
           <w14:ligatures w14:val="standardContextual"/>
         </w:rPr>
       </w:pPr>
-      <w:hyperlink w:anchor="_Toc232428538" w:history="1">
+      <w:hyperlink w:anchor="_Toc232431349" w:history="1">
         <w:r>
           <w:rPr>
             <w:rStyle w:val="Hyperlink"/>
@@ -3478,7 +3552,7 @@
             <w:noProof/>
             <w:webHidden/>
           </w:rPr>
-          <w:instrText xml:space="preserve"> PAGEREF _Toc232428538 \h </w:instrText>
+          <w:instrText xml:space="preserve"> PAGEREF _Toc232431349 \h </w:instrText>
         </w:r>
         <w:r>
           <w:rPr>
@@ -3498,7 +3572,7 @@
             <w:noProof/>
             <w:webHidden/>
           </w:rPr>
-          <w:t>37</w:t>
+          <w:t>38</w:t>
         </w:r>
         <w:r>
           <w:rPr>
@@ -3524,7 +3598,7 @@
           <w14:ligatures w14:val="standardContextual"/>
         </w:rPr>
       </w:pPr>
-      <w:hyperlink w:anchor="_Toc232428539" w:history="1">
+      <w:hyperlink w:anchor="_Toc232431350" w:history="1">
         <w:r>
           <w:rPr>
             <w:rStyle w:val="Hyperlink"/>
@@ -3551,7 +3625,7 @@
             <w:noProof/>
             <w:webHidden/>
           </w:rPr>
-          <w:instrText xml:space="preserve"> PAGEREF _Toc232428539 \h </w:instrText>
+          <w:instrText xml:space="preserve"> PAGEREF _Toc232431350 \h </w:instrText>
         </w:r>
         <w:r>
           <w:rPr>
@@ -3571,7 +3645,7 @@
             <w:noProof/>
             <w:webHidden/>
           </w:rPr>
-          <w:t>37</w:t>
+          <w:t>38</w:t>
         </w:r>
         <w:r>
           <w:rPr>
@@ -3597,7 +3671,7 @@
           <w14:ligatures w14:val="standardContextual"/>
         </w:rPr>
       </w:pPr>
-      <w:hyperlink w:anchor="_Toc232428540" w:history="1">
+      <w:hyperlink w:anchor="_Toc232431351" w:history="1">
         <w:r>
           <w:rPr>
             <w:rStyle w:val="Hyperlink"/>
@@ -3624,7 +3698,7 @@
             <w:noProof/>
             <w:webHidden/>
           </w:rPr>
-          <w:instrText xml:space="preserve"> PAGEREF _Toc232428540 \h </w:instrText>
+          <w:instrText xml:space="preserve"> PAGEREF _Toc232431351 \h </w:instrText>
         </w:r>
         <w:r>
           <w:rPr>
@@ -3644,7 +3718,7 @@
             <w:noProof/>
             <w:webHidden/>
           </w:rPr>
-          <w:t>37</w:t>
+          <w:t>38</w:t>
         </w:r>
         <w:r>
           <w:rPr>
@@ -3670,7 +3744,7 @@
           <w14:ligatures w14:val="standardContextual"/>
         </w:rPr>
       </w:pPr>
-      <w:hyperlink w:anchor="_Toc232428541" w:history="1">
+      <w:hyperlink w:anchor="_Toc232431352" w:history="1">
         <w:r>
           <w:rPr>
             <w:rStyle w:val="Hyperlink"/>
@@ -3697,7 +3771,7 @@
             <w:noProof/>
             <w:webHidden/>
           </w:rPr>
-          <w:instrText xml:space="preserve"> PAGEREF _Toc232428541 \h </w:instrText>
+          <w:instrText xml:space="preserve"> PAGEREF _Toc232431352 \h </w:instrText>
         </w:r>
         <w:r>
           <w:rPr>
@@ -3717,7 +3791,7 @@
             <w:noProof/>
             <w:webHidden/>
           </w:rPr>
-          <w:t>37</w:t>
+          <w:t>38</w:t>
         </w:r>
         <w:r>
           <w:rPr>
@@ -3743,7 +3817,7 @@
           <w14:ligatures w14:val="standardContextual"/>
         </w:rPr>
       </w:pPr>
-      <w:hyperlink w:anchor="_Toc232428542" w:history="1">
+      <w:hyperlink w:anchor="_Toc232431353" w:history="1">
         <w:r>
           <w:rPr>
             <w:rStyle w:val="Hyperlink"/>
@@ -3770,7 +3844,7 @@
             <w:noProof/>
             <w:webHidden/>
           </w:rPr>
-          <w:instrText xml:space="preserve"> PAGEREF _Toc232428542 \h </w:instrText>
+          <w:instrText xml:space="preserve"> PAGEREF _Toc232431353 \h </w:instrText>
         </w:r>
         <w:r>
           <w:rPr>
@@ -3790,7 +3864,7 @@
             <w:noProof/>
             <w:webHidden/>
           </w:rPr>
-          <w:t>38</w:t>
+          <w:t>39</w:t>
         </w:r>
         <w:r>
           <w:rPr>
@@ -3816,7 +3890,7 @@
           <w14:ligatures w14:val="standardContextual"/>
         </w:rPr>
       </w:pPr>
-      <w:hyperlink w:anchor="_Toc232428543" w:history="1">
+      <w:hyperlink w:anchor="_Toc232431354" w:history="1">
         <w:r>
           <w:rPr>
             <w:rStyle w:val="Hyperlink"/>
@@ -3843,7 +3917,7 @@
             <w:noProof/>
             <w:webHidden/>
           </w:rPr>
-          <w:instrText xml:space="preserve"> PAGEREF _Toc232428543 \h </w:instrText>
+          <w:instrText xml:space="preserve"> PAGEREF _Toc232431354 \h </w:instrText>
         </w:r>
         <w:r>
           <w:rPr>
@@ -3863,7 +3937,7 @@
             <w:noProof/>
             <w:webHidden/>
           </w:rPr>
-          <w:t>38</w:t>
+          <w:t>41</w:t>
         </w:r>
         <w:r>
           <w:rPr>
@@ -3889,7 +3963,7 @@
           <w14:ligatures w14:val="standardContextual"/>
         </w:rPr>
       </w:pPr>
-      <w:hyperlink w:anchor="_Toc232428544" w:history="1">
+      <w:hyperlink w:anchor="_Toc232431355" w:history="1">
         <w:r>
           <w:rPr>
             <w:rStyle w:val="Hyperlink"/>
@@ -3916,7 +3990,7 @@
             <w:noProof/>
             <w:webHidden/>
           </w:rPr>
-          <w:instrText xml:space="preserve"> PAGEREF _Toc232428544 \h </w:instrText>
+          <w:instrText xml:space="preserve"> PAGEREF _Toc232431355 \h </w:instrText>
         </w:r>
         <w:r>
           <w:rPr>
@@ -3936,7 +4010,7 @@
             <w:noProof/>
             <w:webHidden/>
           </w:rPr>
-          <w:t>38</w:t>
+          <w:t>41</w:t>
         </w:r>
         <w:r>
           <w:rPr>
@@ -3962,7 +4036,7 @@
           <w14:ligatures w14:val="standardContextual"/>
         </w:rPr>
       </w:pPr>
-      <w:hyperlink w:anchor="_Toc232428545" w:history="1">
+      <w:hyperlink w:anchor="_Toc232431356" w:history="1">
         <w:r>
           <w:rPr>
             <w:rStyle w:val="Hyperlink"/>
@@ -3989,7 +4063,7 @@
             <w:noProof/>
             <w:webHidden/>
           </w:rPr>
-          <w:instrText xml:space="preserve"> PAGEREF _Toc232428545 \h </w:instrText>
+          <w:instrText xml:space="preserve"> PAGEREF _Toc232431356 \h </w:instrText>
         </w:r>
         <w:r>
           <w:rPr>
@@ -4009,7 +4083,7 @@
             <w:noProof/>
             <w:webHidden/>
           </w:rPr>
-          <w:t>39</w:t>
+          <w:t>42</w:t>
         </w:r>
         <w:r>
           <w:rPr>
@@ -4035,7 +4109,7 @@
           <w14:ligatures w14:val="standardContextual"/>
         </w:rPr>
       </w:pPr>
-      <w:hyperlink w:anchor="_Toc232428546" w:history="1">
+      <w:hyperlink w:anchor="_Toc232431357" w:history="1">
         <w:r>
           <w:rPr>
             <w:rStyle w:val="Hyperlink"/>
@@ -4062,7 +4136,7 @@
             <w:noProof/>
             <w:webHidden/>
           </w:rPr>
-          <w:instrText xml:space="preserve"> PAGEREF _Toc232428546 \h </w:instrText>
+          <w:instrText xml:space="preserve"> PAGEREF _Toc232431357 \h </w:instrText>
         </w:r>
         <w:r>
           <w:rPr>
@@ -4082,7 +4156,7 @@
             <w:noProof/>
             <w:webHidden/>
           </w:rPr>
-          <w:t>39</w:t>
+          <w:t>43</w:t>
         </w:r>
         <w:r>
           <w:rPr>
@@ -4108,7 +4182,7 @@
           <w14:ligatures w14:val="standardContextual"/>
         </w:rPr>
       </w:pPr>
-      <w:hyperlink w:anchor="_Toc232428547" w:history="1">
+      <w:hyperlink w:anchor="_Toc232431358" w:history="1">
         <w:r>
           <w:rPr>
             <w:rStyle w:val="Hyperlink"/>
@@ -4135,7 +4209,7 @@
             <w:noProof/>
             <w:webHidden/>
           </w:rPr>
-          <w:instrText xml:space="preserve"> PAGEREF _Toc232428547 \h </w:instrText>
+          <w:instrText xml:space="preserve"> PAGEREF _Toc232431358 \h </w:instrText>
         </w:r>
         <w:r>
           <w:rPr>
@@ -4155,7 +4229,7 @@
             <w:noProof/>
             <w:webHidden/>
           </w:rPr>
-          <w:t>39</w:t>
+          <w:t>43</w:t>
         </w:r>
         <w:r>
           <w:rPr>
@@ -4181,7 +4255,7 @@
           <w14:ligatures w14:val="standardContextual"/>
         </w:rPr>
       </w:pPr>
-      <w:hyperlink w:anchor="_Toc232428548" w:history="1">
+      <w:hyperlink w:anchor="_Toc232431359" w:history="1">
         <w:r>
           <w:rPr>
             <w:rStyle w:val="Hyperlink"/>
@@ -4208,7 +4282,7 @@
             <w:noProof/>
             <w:webHidden/>
           </w:rPr>
-          <w:instrText xml:space="preserve"> PAGEREF _Toc232428548 \h </w:instrText>
+          <w:instrText xml:space="preserve"> PAGEREF _Toc232431359 \h </w:instrText>
         </w:r>
         <w:r>
           <w:rPr>
@@ -4228,7 +4302,7 @@
             <w:noProof/>
             <w:webHidden/>
           </w:rPr>
-          <w:t>39</w:t>
+          <w:t>43</w:t>
         </w:r>
         <w:r>
           <w:rPr>
@@ -4254,7 +4328,7 @@
           <w14:ligatures w14:val="standardContextual"/>
         </w:rPr>
       </w:pPr>
-      <w:hyperlink w:anchor="_Toc232428549" w:history="1">
+      <w:hyperlink w:anchor="_Toc232431360" w:history="1">
         <w:r>
           <w:rPr>
             <w:rStyle w:val="Hyperlink"/>
@@ -4281,7 +4355,7 @@
             <w:noProof/>
             <w:webHidden/>
           </w:rPr>
-          <w:instrText xml:space="preserve"> PAGEREF _Toc232428549 \h </w:instrText>
+          <w:instrText xml:space="preserve"> PAGEREF _Toc232431360 \h </w:instrText>
         </w:r>
         <w:r>
           <w:rPr>
@@ -4301,7 +4375,7 @@
             <w:noProof/>
             <w:webHidden/>
           </w:rPr>
-          <w:t>40</w:t>
+          <w:t>43</w:t>
         </w:r>
         <w:r>
           <w:rPr>
@@ -4327,7 +4401,7 @@
           <w14:ligatures w14:val="standardContextual"/>
         </w:rPr>
       </w:pPr>
-      <w:hyperlink w:anchor="_Toc232428550" w:history="1">
+      <w:hyperlink w:anchor="_Toc232431361" w:history="1">
         <w:r>
           <w:rPr>
             <w:rStyle w:val="Hyperlink"/>
@@ -4354,7 +4428,7 @@
             <w:noProof/>
             <w:webHidden/>
           </w:rPr>
-          <w:instrText xml:space="preserve"> PAGEREF _Toc232428550 \h </w:instrText>
+          <w:instrText xml:space="preserve"> PAGEREF _Toc232431361 \h </w:instrText>
         </w:r>
         <w:r>
           <w:rPr>
@@ -4374,7 +4448,7 @@
             <w:noProof/>
             <w:webHidden/>
           </w:rPr>
-          <w:t>40</w:t>
+          <w:t>43</w:t>
         </w:r>
         <w:r>
           <w:rPr>
@@ -4400,7 +4474,7 @@
           <w14:ligatures w14:val="standardContextual"/>
         </w:rPr>
       </w:pPr>
-      <w:hyperlink w:anchor="_Toc232428551" w:history="1">
+      <w:hyperlink w:anchor="_Toc232431362" w:history="1">
         <w:r>
           <w:rPr>
             <w:rStyle w:val="Hyperlink"/>
@@ -4427,7 +4501,7 @@
             <w:noProof/>
             <w:webHidden/>
           </w:rPr>
-          <w:instrText xml:space="preserve"> PAGEREF _Toc232428551 \h </w:instrText>
+          <w:instrText xml:space="preserve"> PAGEREF _Toc232431362 \h </w:instrText>
         </w:r>
         <w:r>
           <w:rPr>
@@ -4447,7 +4521,7 @@
             <w:noProof/>
             <w:webHidden/>
           </w:rPr>
-          <w:t>40</w:t>
+          <w:t>44</w:t>
         </w:r>
         <w:r>
           <w:rPr>
@@ -4473,7 +4547,7 @@
           <w14:ligatures w14:val="standardContextual"/>
         </w:rPr>
       </w:pPr>
-      <w:hyperlink w:anchor="_Toc232428552" w:history="1">
+      <w:hyperlink w:anchor="_Toc232431363" w:history="1">
         <w:r>
           <w:rPr>
             <w:rStyle w:val="Hyperlink"/>
@@ -4500,7 +4574,7 @@
             <w:noProof/>
             <w:webHidden/>
           </w:rPr>
-          <w:instrText xml:space="preserve"> PAGEREF _Toc232428552 \h </w:instrText>
+          <w:instrText xml:space="preserve"> PAGEREF _Toc232431363 \h </w:instrText>
         </w:r>
         <w:r>
           <w:rPr>
@@ -4520,7 +4594,7 @@
             <w:noProof/>
             <w:webHidden/>
           </w:rPr>
-          <w:t>40</w:t>
+          <w:t>44</w:t>
         </w:r>
         <w:r>
           <w:rPr>
@@ -4546,7 +4620,7 @@
           <w14:ligatures w14:val="standardContextual"/>
         </w:rPr>
       </w:pPr>
-      <w:hyperlink w:anchor="_Toc232428553" w:history="1">
+      <w:hyperlink w:anchor="_Toc232431364" w:history="1">
         <w:r>
           <w:rPr>
             <w:rStyle w:val="Hyperlink"/>
@@ -4573,7 +4647,7 @@
             <w:noProof/>
             <w:webHidden/>
           </w:rPr>
-          <w:instrText xml:space="preserve"> PAGEREF _Toc232428553 \h </w:instrText>
+          <w:instrText xml:space="preserve"> PAGEREF _Toc232431364 \h </w:instrText>
         </w:r>
         <w:r>
           <w:rPr>
@@ -4593,7 +4667,7 @@
             <w:noProof/>
             <w:webHidden/>
           </w:rPr>
-          <w:t>41</w:t>
+          <w:t>44</w:t>
         </w:r>
         <w:r>
           <w:rPr>
@@ -4620,7 +4694,7 @@
         <w:spacing w:before="0" w:after="240"/>
         <w:jc w:val="center"/>
       </w:pPr>
-      <w:bookmarkStart w:id="0" w:name="_Toc232428493"/>
+      <w:bookmarkStart w:id="0" w:name="_Toc232431303"/>
       <w:r>
         <w:rPr>
           <w:rFonts w:ascii="Times New Roman" w:hAnsi="Times New Roman"/>
@@ -4839,7 +4913,7 @@
         <w:spacing w:before="0" w:after="240"/>
         <w:jc w:val="center"/>
       </w:pPr>
-      <w:bookmarkStart w:id="1" w:name="_Toc232428494"/>
+      <w:bookmarkStart w:id="1" w:name="_Toc232431304"/>
       <w:r>
         <w:rPr>
           <w:rFonts w:ascii="Times New Roman" w:hAnsi="Times New Roman"/>
@@ -5004,7 +5078,7 @@
         <w:spacing w:before="0" w:after="240"/>
         <w:jc w:val="center"/>
       </w:pPr>
-      <w:bookmarkStart w:id="2" w:name="_Toc232428495"/>
+      <w:bookmarkStart w:id="2" w:name="_Toc232431305"/>
       <w:r>
         <w:rPr>
           <w:rFonts w:ascii="Times New Roman" w:hAnsi="Times New Roman"/>
@@ -5545,7 +5619,7 @@
         <w:spacing w:before="0" w:after="240"/>
         <w:jc w:val="center"/>
       </w:pPr>
-      <w:bookmarkStart w:id="3" w:name="_Toc232428496"/>
+      <w:bookmarkStart w:id="3" w:name="_Toc232431306"/>
       <w:r>
         <w:rPr>
           <w:rFonts w:ascii="Times New Roman" w:hAnsi="Times New Roman"/>
@@ -5560,16 +5634,7 @@
         <w:jc w:val="both"/>
       </w:pPr>
       <w:r>
-        <w:t>Rwanda's urban and peri-urban catchments face recurrent flood risk driven by intense rainfall, steep slopes, informal settlement, poor drainage and land-cover change. Existing flood-risk resources, official hazard maps and climate platforms, are valuable but largely static: they identify generally vulnerable zones yet do not show how flood pressure changes from day to day after rainfall. This research proposes the design and development of a geospatial machine-learning and Hidden Markov Model (HMM) framewor</w:t>
-      </w:r>
-      <w:r>
-        <w:t>k that fuses real daily rainfall, terrain, hydrology and urban-exposure data to estimate low, moderate and high flood-pressure states over time for a defined flood-prone corridor in Kigali, the Nyabugogo-Mpazi catchment. The study follows an iterative agile-scrum methodology over nine weeks (24 May - 28 July 2026). The selected area is divided into a 100-250 m grid; each cell-day is linked to rainfall accumulation features (1-, 3-, 7- and 14-day totals) from CHIRPS and Meteo Rwanda, terrain features (elevat</w:t>
-      </w:r>
-      <w:r>
-        <w:t>ion, slope) from SRTM, hydrology and exposure features from OpenStreetMap, and intersection with official flood-risk polygons. A supervised classifier (Random Forest, XGBoost) scores each cell-day as low, moderate or high flood pressure, and an HMM temporal layer estimates daily state transitions. The framework is hypothesised to achieve a macro F1-score of at least 0.75, a high-pressure recall of at least 0.80, and spatial agreement in which at least 70% of predicted high-pressure cells fall within officia</w:t>
-      </w:r>
-      <w:r>
-        <w:t>l flood-risk polygons. The project is framed honestly as flood-pressure estimation and risk screening rather than confirmed flood-event prediction, contributing a reproducible, time-aware geospatial workflow for decision support in data-scarce East African cities.</w:t>
+        <w:t>Rwanda's urban and peri-urban catchments face recurrent flood risk driven by intense rainfall, steep slopes, informal settlement, poor drainage and land-cover change. Existing flood-risk resources, official hazard maps and climate platforms, are valuable but largely static: they identify generally vulnerable zones yet do not show how flood pressure changes from day to day after rainfall. This research proposes the design and development of a geospatial machine-learning and Hidden Markov Model (HMM) framework that fuses real daily rainfall, terrain, hydrology and urban-exposure data to estimate low, moderate and high flood-pressure states over time for a defined flood-prone corridor in Kigali, the Nyabugogo-Mpazi catchment. The study follows an iterative agile-scrum methodology over nine weeks (24 May - 28 July 2026). The selected area is divided into a 100-250 m grid; each cell-day is linked to rainfall accumulation features (1-, 3-, 7- and 14-day totals) from CHIRPS and Meteo Rwanda, terrain features (elevation, slope) from SRTM, hydrology and exposure features from OpenStreetMap, and intersection with official flood-risk polygons. A supervised classifier (Random Forest, XGBoost) scores each cell-day as low, moderate or high flood pressure, and an HMM temporal layer estimates daily state transitions. The framework is hypothesised to achieve a macro F1-score of at least 0.75, a high-pressure recall of at least 0.80, and spatial agreement in which at least 70% of predicted high-pressure cells fall within official flood-risk polygons. The project is framed honestly as flood-pressure estimation and risk screening rather than confirmed flood-event prediction, contributing a reproducible, time-aware geospatial workflow for decision support in data-scarce East African cities.</w:t>
       </w:r>
     </w:p>
     <w:p>
@@ -5592,368 +5657,386 @@
     <w:p>
       <w:pPr>
         <w:pStyle w:val="Heading1"/>
+      </w:pPr>
+      <w:bookmarkStart w:id="4" w:name="_Toc232431307"/>
+      <w:r>
+        <w:rPr>
+          <w:highlight w:val="yellow"/>
+        </w:rPr>
+        <w:lastRenderedPageBreak/>
+        <w:t>ACKNOWLEDGEMENT OF AI ASSISTANCE</w:t>
+      </w:r>
+      <w:bookmarkEnd w:id="4"/>
+    </w:p>
+    <w:p>
+      <w:pPr>
+        <w:jc w:val="both"/>
+      </w:pPr>
+      <w:r>
+        <w:rPr>
+          <w:highlight w:val="yellow"/>
+        </w:rPr>
+        <w:t>This capstone was developed with the assistance of an AI coding assistant (Anthropic Claude). The tool was used to help implement the data-acquisition and modelling pipeline, generate figures, and draft portions of this document. All design decisions, data sources, methods, results and their interpretation were reviewed, reproduced and are understood by the author, who takes full responsibility for the work. AI assistance was used as a productivity and learning aid, and the analyses are reproducible from th</w:t>
+      </w:r>
+      <w:r>
+        <w:rPr>
+          <w:highlight w:val="yellow"/>
+        </w:rPr>
+        <w:t>e accompanying source code.</w:t>
+      </w:r>
+    </w:p>
+    <w:p>
+      <w:pPr>
+        <w:pStyle w:val="Heading1"/>
         <w:spacing w:before="240" w:after="240" w:line="276" w:lineRule="auto"/>
       </w:pPr>
-      <w:bookmarkStart w:id="4" w:name="_Toc232428497"/>
+      <w:bookmarkStart w:id="5" w:name="_Toc232431308"/>
+      <w:r>
+        <w:rPr>
+          <w:rFonts w:ascii="Times New Roman" w:hAnsi="Times New Roman"/>
+        </w:rPr>
+        <w:t>CHAPTER ONE: INTRODUCTION</w:t>
+      </w:r>
+      <w:bookmarkEnd w:id="5"/>
+    </w:p>
+    <w:p>
+      <w:pPr>
+        <w:pStyle w:val="Heading2"/>
+        <w:spacing w:before="240" w:after="120" w:line="276" w:lineRule="auto"/>
+      </w:pPr>
+      <w:bookmarkStart w:id="6" w:name="_Toc232431309"/>
+      <w:r>
+        <w:rPr>
+          <w:rFonts w:ascii="Times New Roman" w:hAnsi="Times New Roman"/>
+        </w:rPr>
+        <w:t>1.1 Introduction and Background</w:t>
+      </w:r>
+      <w:bookmarkEnd w:id="6"/>
+    </w:p>
+    <w:p>
+      <w:pPr>
+        <w:ind w:firstLine="340"/>
+        <w:jc w:val="both"/>
+      </w:pPr>
+      <w:r>
+        <w:t>Rwanda, the 'land of a thousand hills', combines steep topography, dense settlement and an increasingly variable rainfall regime, a combination that places its towns and cities at persistent risk of flooding. The Intergovernmental Panel on Climate Change identifies East Africa as a hotspot for rainfall irregularity and intensifying extreme-precipitation events (IPCC, 2022), and downscaled projections released by the Rwanda Meteorology Agency (2022) confirm rising intra-seasonal variability and heavier short-duration storms. When such storms fall on steep, poorly drained urban catchments, surface runoff concentrates rapidly, producing inundation, road disruption, property damage and loss of life.</w:t>
+      </w:r>
+    </w:p>
+    <w:p>
+      <w:pPr>
+        <w:ind w:firstLine="340"/>
+        <w:jc w:val="both"/>
+      </w:pPr>
+      <w:r>
+        <w:t>The human cost is well documented. In a single month in 2023, heavy rainfall triggered floods and landslides that killed more than 120 people and damaged hundreds of homes across northern and western Rwanda, and the Ministry in charge of Emergency Management records flooding among the most frequent and damaging hazards in its annual disaster statistics (MINEMA, 2023). In Kigali, flood-prone corridors cluster near streams, wetlands and low-lying settlements; the Nyabugogo-Mpazi catchment in particular has been studied for decades as an emblematic urban flood plain where informal settlement and commercial activity coexist with recurrent inundation (MINEMA, 2023; The New Times, 2026).</w:t>
+      </w:r>
+    </w:p>
+    <w:p>
+      <w:pPr>
+        <w:ind w:firstLine="340"/>
+        <w:jc w:val="both"/>
+      </w:pPr>
+      <w:r>
+        <w:t xml:space="preserve">A growing body of work shows that geographic information systems (GIS) and machine learning (ML) can map where flooding is likely. Mind'je et al. (2019) modelled national flood susceptibility for Rwanda using logistic regression over ten terrain, hydrological and land-cover factors, while Mind'je et al. (2021) coupled geospatial analysis with hydrological modelling to </w:t>
+      </w:r>
+      <w:r>
+        <w:lastRenderedPageBreak/>
+        <w:t>simulate peak flow and volume in the Nyabarongo catchment. Internationally, systematic reviews report that ensemble learners such as Random Forest and gradient boosting are among the most consistent performers for flood-susceptibility and flood-risk tasks (Mosavi, Ozturk, &amp; Chau, 2018). These approaches, however, typically produce a single static map. They answer 'where is generally vulnerable?' but not the sharper, more operational question this research addresses: given recent rainfall and the fixed geography of a place, how does its flood pressure move between low, moderate and high states from one day to the next?</w:t>
+      </w:r>
+    </w:p>
+    <w:p>
+      <w:pPr>
+        <w:pStyle w:val="Heading2"/>
+        <w:spacing w:before="240" w:after="120" w:line="276" w:lineRule="auto"/>
+      </w:pPr>
+      <w:bookmarkStart w:id="7" w:name="_Toc232431310"/>
+      <w:r>
+        <w:rPr>
+          <w:rFonts w:ascii="Times New Roman" w:hAnsi="Times New Roman"/>
+        </w:rPr>
+        <w:t>1.2 Problem Statement</w:t>
+      </w:r>
+      <w:bookmarkEnd w:id="7"/>
+    </w:p>
+    <w:p>
+      <w:pPr>
+        <w:ind w:firstLine="340"/>
+        <w:jc w:val="both"/>
+      </w:pPr>
+      <w:r>
+        <w:t>First, existing flood-risk resources for Rwanda are predominantly static. Official hazard layers and susceptibility maps (Mind'je et al., 2019) identify vulnerable zones effectively, but they are spatial snapshots that do not show how flood pressure changes day to day following rainfall events. A community living beside the Mpazi drain is 'in a flood-risk zone' every day of the year on a static map, which gives responders little help in deciding when that zone is most dangerous.</w:t>
+      </w:r>
+    </w:p>
+    <w:p>
+      <w:pPr>
+        <w:ind w:firstLine="340"/>
+        <w:jc w:val="both"/>
+      </w:pPr>
+      <w:r>
+        <w:t>Second, climate services provide rainfall information, but rainfall values alone do not directly explain how a specific urban catchment moves between levels of flood pressure. Datasets such as CHIRPS (Climate Hazards Center, 2024) and the national ENACTS rainfall products offer long, gridded daily series, yet translating accumulated rainfall into a per-cell, time-varying flood-pressure state requires fusing it with terrain, drainage proximity and exposure, and modelling the temporal dynamics explicitly.</w:t>
+      </w:r>
+    </w:p>
+    <w:p>
+      <w:pPr>
+        <w:ind w:firstLine="340"/>
+        <w:jc w:val="both"/>
+      </w:pPr>
+      <w:r>
+        <w:t>Third, although machine-learning flood studies are now common, most classify flood susceptibility from terrain, land cover and distance-to-river features without a temporal state model (Khosravi et al., 2018; Ma et al., 2021). There is therefore a documented gap for a localised, reproducible workflow that integrates real daily climate data, official flood-risk spatial layers, terrain features and urban-exposure indicators into a single time-aware model of flood-pressure states.</w:t>
+      </w:r>
+    </w:p>
+    <w:p>
+      <w:pPr>
+        <w:ind w:firstLine="340"/>
+        <w:jc w:val="both"/>
+      </w:pPr>
+      <w:r>
+        <w:t xml:space="preserve">This research proposes a geospatial ML and Hidden Markov Model framework that: (i) divides a selected flood-prone corridor in Kigali into grid cells linked to daily rainfall and static spatial features; (ii) derives and classifies low, moderate and high flood-pressure states with supervised models; and (iii) applies an HMM as a temporal layer that estimates how those states transition over a daily time step. To remain academically honest, the system claims to estimate </w:t>
+      </w:r>
+      <w:r>
+        <w:lastRenderedPageBreak/>
+        <w:t>derived flood-pressure states validated against official flood-risk polygons, not to predict confirmed flood events, unless verified daily incident records become available.</w:t>
+      </w:r>
+    </w:p>
+    <w:p>
+      <w:pPr>
+        <w:pStyle w:val="Heading2"/>
+        <w:spacing w:before="240" w:after="120" w:line="276" w:lineRule="auto"/>
+      </w:pPr>
+      <w:bookmarkStart w:id="8" w:name="_Toc232431311"/>
+      <w:r>
+        <w:rPr>
+          <w:rFonts w:ascii="Times New Roman" w:hAnsi="Times New Roman"/>
+        </w:rPr>
+        <w:t>1.3 Project Main Objective</w:t>
+      </w:r>
+      <w:bookmarkEnd w:id="8"/>
+    </w:p>
+    <w:p>
+      <w:pPr>
+        <w:ind w:firstLine="340"/>
+        <w:jc w:val="both"/>
+      </w:pPr>
+      <w:r>
+        <w:t>To develop and evaluate a geospatial machine-learning and Hidden Markov Model framework that uses real rainfall and spatial data to estimate daily flood-pressure states for a selected flood-prone area in Rwanda, the Nyabugogo-Mpazi corridor in Kigali, and to validate those estimates against official flood-risk spatial information.</w:t>
+      </w:r>
+    </w:p>
+    <w:p>
+      <w:pPr>
+        <w:pStyle w:val="Heading3"/>
+        <w:spacing w:before="160" w:after="80" w:line="276" w:lineRule="auto"/>
+      </w:pPr>
+      <w:bookmarkStart w:id="9" w:name="_Toc232431312"/>
+      <w:r>
+        <w:rPr>
+          <w:rFonts w:ascii="Times New Roman" w:hAnsi="Times New Roman"/>
+          <w:i/>
+        </w:rPr>
+        <w:t>1.3.1 Specific Objectives (SMART)</w:t>
+      </w:r>
+      <w:bookmarkEnd w:id="9"/>
+    </w:p>
+    <w:p>
+      <w:pPr>
+        <w:pStyle w:val="ListNumber"/>
+        <w:spacing w:after="60"/>
+      </w:pPr>
+      <w:r>
+        <w:t>To define a flood-prone study area in Kigali (the Nyabugogo-Mpazi corridor) and prepare a 100-250 m grid-based spatial unit, and to acquire and preprocess daily rainfall (CHIRPS / Meteo Rwanda, 2018-2024), SRTM elevation, OpenStreetMap geolocation data and official flood-risk polygons for that area, completed by 21 June 2026.</w:t>
+      </w:r>
+    </w:p>
+    <w:p>
+      <w:pPr>
+        <w:pStyle w:val="ListNumber"/>
+        <w:spacing w:after="60"/>
+      </w:pPr>
+      <w:r>
+        <w:t>To engineer daily rainfall accumulation features (1-, 3-, 7- and 14-day totals) and static geospatial features (elevation, slope, distance-to-river, road and building density, flood-polygon intersection) into a reproducible grid-cell-by-day modelling table, and to derive low, moderate and high flood-pressure labels, by 28 June 2026.</w:t>
+      </w:r>
+    </w:p>
+    <w:p>
+      <w:pPr>
+        <w:pStyle w:val="ListNumber"/>
+        <w:spacing w:after="60"/>
+      </w:pPr>
+      <w:r>
+        <w:t>To train and benchmark at least three supervised models (a Logistic Regression / Decision Tree baseline, Random Forest and XGBoost) against a rainfall-threshold baseline and a static flood-polygon baseline, achieving a macro F1-score of at least 0.75 and a high-pressure-state recall of at least 0.80 on a held-out period, by 12 July 2026.</w:t>
+      </w:r>
+    </w:p>
+    <w:p>
+      <w:pPr>
+        <w:pStyle w:val="ListNumber"/>
+        <w:spacing w:after="60"/>
+      </w:pPr>
+      <w:r>
+        <w:t>To integrate a Hidden Markov Model temporal layer that estimates daily transitions between flood-pressure states, and to evaluate it on next-step accuracy and on spatial concordance with official flood-risk polygons, targeting an enrichment (lift) of at least 1.4 and an inside-versus-outside odds ratio of at least 1.5 for predicted high-pressure cells, by 22 July 2026.</w:t>
+      </w:r>
+    </w:p>
+    <w:p>
+      <w:pPr>
+        <w:pStyle w:val="ListNumber"/>
+        <w:spacing w:after="60"/>
+      </w:pPr>
+      <w:r>
+        <w:t>To produce flood-pressure risk maps, a reproducible notebook/dashboard for inspecting results by date and location, and a final report and defence presentation evidencing the framework's value for decision support, by 28 July 2026.</w:t>
+      </w:r>
+    </w:p>
+    <w:p>
+      <w:pPr>
+        <w:pStyle w:val="Heading2"/>
+        <w:spacing w:before="240" w:after="120" w:line="276" w:lineRule="auto"/>
+      </w:pPr>
+      <w:bookmarkStart w:id="10" w:name="_Toc232431313"/>
+      <w:r>
+        <w:rPr>
+          <w:rFonts w:ascii="Times New Roman" w:hAnsi="Times New Roman"/>
+        </w:rPr>
+        <w:t>1.4 Research Questions</w:t>
+      </w:r>
+      <w:bookmarkEnd w:id="10"/>
+    </w:p>
+    <w:p>
+      <w:pPr>
+        <w:pStyle w:val="ListNumber"/>
+        <w:spacing w:after="60"/>
+      </w:pPr>
+      <w:r>
+        <w:t>How can daily rainfall data and geospatial features be combined to estimate flood-pressure states in a selected flood-prone area in Kigali, Rwanda?</w:t>
+      </w:r>
+    </w:p>
+    <w:p>
+      <w:pPr>
+        <w:pStyle w:val="ListNumber"/>
+        <w:spacing w:after="60"/>
+      </w:pPr>
+      <w:r>
+        <w:lastRenderedPageBreak/>
+        <w:t>Which geospatial features, such as slope, elevation, river proximity, building density, road density and official flood-risk intersection, contribute most to flood-pressure classification?</w:t>
+      </w:r>
+    </w:p>
+    <w:p>
+      <w:pPr>
+        <w:pStyle w:val="ListNumber"/>
+        <w:spacing w:after="60"/>
+      </w:pPr>
+      <w:r>
+        <w:t>How well does a geospatial ML classifier separate low, moderate and high flood-pressure states compared with a rule-based rainfall-threshold baseline and a static flood-polygon baseline?</w:t>
+      </w:r>
+    </w:p>
+    <w:p>
+      <w:pPr>
+        <w:pStyle w:val="ListNumber"/>
+        <w:spacing w:after="60"/>
+      </w:pPr>
+      <w:r>
+        <w:t>How does a Hidden Markov Model represent transitions between flood-pressure states over a daily observation interval, and does temporal smoothing improve next-step stability?</w:t>
+      </w:r>
+    </w:p>
+    <w:p>
+      <w:pPr>
+        <w:pStyle w:val="ListNumber"/>
+        <w:spacing w:after="60"/>
+      </w:pPr>
+      <w:r>
+        <w:t>How closely do predicted high-pressure cells align with official flood-risk polygons or any available incident records?</w:t>
+      </w:r>
+    </w:p>
+    <w:p>
+      <w:pPr>
+        <w:pStyle w:val="Heading2"/>
+        <w:spacing w:before="240" w:after="120" w:line="276" w:lineRule="auto"/>
+      </w:pPr>
+      <w:bookmarkStart w:id="11" w:name="_Toc232431314"/>
+      <w:r>
+        <w:rPr>
+          <w:rFonts w:ascii="Times New Roman" w:hAnsi="Times New Roman"/>
+        </w:rPr>
+        <w:t>1.5 Project Scope</w:t>
+      </w:r>
+      <w:bookmarkEnd w:id="11"/>
+    </w:p>
+    <w:p>
+      <w:pPr>
+        <w:ind w:firstLine="340"/>
+        <w:jc w:val="both"/>
+      </w:pPr>
+      <w:r>
+        <w:t>Geographically, the study is confined to one clearly defined flood-prone catchment, the Nyabugogo-Mpazi corridor in Kigali, selected for its strong urban flood-risk relevance, steep slopes, drainage pressure and dense settlement and infrastructure exposure. The area is small enough to allow grid-based modelling and detailed feature engineering at a 100-250 m resolution, depending on data resolution and computational capacity.</w:t>
+      </w:r>
+    </w:p>
+    <w:p>
+      <w:pPr>
+        <w:ind w:firstLine="340"/>
+        <w:jc w:val="both"/>
+      </w:pPr>
+      <w:r>
+        <w:t>Temporally, the modelling period covers 2018-2024, or another window for which continuous daily rainfall data is available. The model focuses on derived flood-pressure states rather than confirmed disaster events. A flood-pressure state is a condition derived from rainfall accumulation, terrain, proximity to rivers and exposure indicators; a confirmed flood event requires observed incident data. Where verified, dated and geolocated incident records are unavailable, claims remain limited to flood-pressure modelling and official flood-risk polygon agreement.</w:t>
+      </w:r>
+    </w:p>
+    <w:p>
+      <w:pPr>
+        <w:ind w:firstLine="340"/>
+        <w:jc w:val="both"/>
+      </w:pPr>
+      <w:r>
+        <w:t>Technically, the deliverable is a reproducible data-and-model pipeline with maps and a lightweight notebook or dashboard. The project excludes physically based hydrodynamic engineering models, official early-warning issuance, and real-time sensor networks, which are noted as future work. The system is positioned as a decision-support and risk-screening framework that complements, rather than replaces, official warning systems.</w:t>
+      </w:r>
+    </w:p>
+    <w:p>
+      <w:pPr>
+        <w:pStyle w:val="Heading2"/>
+        <w:spacing w:before="240" w:after="120" w:line="276" w:lineRule="auto"/>
+      </w:pPr>
+      <w:bookmarkStart w:id="12" w:name="_Toc232431315"/>
       <w:r>
         <w:rPr>
           <w:rFonts w:ascii="Times New Roman" w:hAnsi="Times New Roman"/>
         </w:rPr>
         <w:lastRenderedPageBreak/>
-        <w:t>CHAPTER ONE: INTRODUCTION</w:t>
-      </w:r>
-      <w:bookmarkEnd w:id="4"/>
+        <w:t>1.6 Significance and Justification</w:t>
+      </w:r>
+      <w:bookmarkEnd w:id="12"/>
+    </w:p>
+    <w:p>
+      <w:pPr>
+        <w:ind w:firstLine="340"/>
+        <w:jc w:val="both"/>
+      </w:pPr>
+      <w:r>
+        <w:t>For disaster managers and city authorities, the proposed framework moves beyond static hazard maps toward a time-aware view of flood pressure, helping prioritise inspection, drainage maintenance and community alerts in the days following heavy rainfall. By grounding estimates in official flood-risk polygons, it produces outputs that are interpretable alongside resources already trusted by MINEMA and Kigali City.</w:t>
+      </w:r>
+    </w:p>
+    <w:p>
+      <w:pPr>
+        <w:ind w:firstLine="340"/>
+        <w:jc w:val="both"/>
+      </w:pPr>
+      <w:r>
+        <w:t>For the research and software-engineering community, the project contributes a reproducible integration of supervised geospatial ML with a Hidden Markov temporal layer for an African urban catchment, an under-explored pairing that most flood-susceptibility studies omit (Mosavi et al., 2018; Khosravi et al., 2018). Aligned with Sustainable Development Goals 11 (Sustainable Cities) and 13 (Climate Action) and Rwanda's Vision 2050 resilience priorities, it offers a low-cost, open-data blueprint transferable to other data-scarce East African cities.</w:t>
+      </w:r>
+    </w:p>
+    <w:p>
+      <w:pPr>
+        <w:ind w:firstLine="340"/>
+        <w:jc w:val="both"/>
+      </w:pPr>
+      <w:r>
+        <w:t>For affected communities, the longer-term significance lies in screening: a transparent, data-grounded indication of when and where flood pressure is building can support the local, community-based disaster-risk-reduction approaches that have proven effective in Rwanda.</w:t>
+      </w:r>
     </w:p>
     <w:p>
       <w:pPr>
         <w:pStyle w:val="Heading2"/>
         <w:spacing w:before="240" w:after="120" w:line="276" w:lineRule="auto"/>
       </w:pPr>
-      <w:bookmarkStart w:id="5" w:name="_Toc232428498"/>
-      <w:r>
-        <w:rPr>
-          <w:rFonts w:ascii="Times New Roman" w:hAnsi="Times New Roman"/>
-        </w:rPr>
-        <w:t>1.1 Introduction and Background</w:t>
-      </w:r>
-      <w:bookmarkEnd w:id="5"/>
-    </w:p>
-    <w:p>
-      <w:pPr>
-        <w:ind w:firstLine="340"/>
-        <w:jc w:val="both"/>
-      </w:pPr>
-      <w:r>
-        <w:t>Rwanda, the 'land of a thousand hills', combines steep topography, dense settlement and an increasingly variable rainfall regime, a combination that places its towns and cities at persistent risk of flooding. The Intergovernmental Panel on Climate Change identifies East Africa as a hotspot for rainfall irregularity and intensifying extreme-precipitation events (IPCC, 2022), and downscaled projections released by the Rwanda Meteorology Agency (2022) confirm rising intra-seasonal variability and heavier short</w:t>
-      </w:r>
-      <w:r>
-        <w:t>-duration storms. When such storms fall on steep, poorly drained urban catchments, surface runoff concentrates rapidly, producing inundation, road disruption, property damage and loss of life.</w:t>
-      </w:r>
-    </w:p>
-    <w:p>
-      <w:pPr>
-        <w:ind w:firstLine="340"/>
-        <w:jc w:val="both"/>
-      </w:pPr>
-      <w:r>
-        <w:t>The human cost is well documented. In a single month in 2023, heavy rainfall triggered floods and landslides that killed more than 120 people and damaged hundreds of homes across northern and western Rwanda, and the Ministry in charge of Emergency Management records flooding among the most frequent and damaging hazards in its annual disaster statistics (MINEMA, 2023). In Kigali, flood-prone corridors cluster near streams, wetlands and low-lying settlements; the Nyabugogo-Mpazi catchment in particular has be</w:t>
-      </w:r>
-      <w:r>
-        <w:t>en studied for decades as an emblematic urban flood plain where informal settlement and commercial activity coexist with recurrent inundation (MINEMA, 2023; The New Times, 2026).</w:t>
-      </w:r>
-    </w:p>
-    <w:p>
-      <w:pPr>
-        <w:ind w:firstLine="340"/>
-        <w:jc w:val="both"/>
-      </w:pPr>
-      <w:r>
-        <w:t>A growing body of work shows that geographic information systems (GIS) and machine learning (ML) can map where flooding is likely. Mind'je et al. (2019) modelled national flood susceptibility for Rwanda using logistic regression over ten terrain, hydrological and land-cover factors, while Mind'je et al. (2021) coupled geospatial analysis with hydrological modelling to simulate peak flow and volume in the Nyabarongo catchment. Internationally, systematic reviews report that ensemble learners such as Random F</w:t>
-      </w:r>
-      <w:r>
-        <w:t>orest and gradient boosting are among the most consistent performers for flood-susceptibility and flood-risk tasks (Mosavi, Ozturk, &amp; Chau, 2018). These approaches, however, typically produce a single static map. They answer 'where is generally vulnerable?' but not the sharper, more operational question this research addresses: given recent rainfall and the fixed geography of a place, how does its flood pressure move between low, moderate and high states from one day to the next?</w:t>
-      </w:r>
-    </w:p>
-    <w:p>
-      <w:pPr>
-        <w:pStyle w:val="Heading2"/>
-        <w:spacing w:before="240" w:after="120" w:line="276" w:lineRule="auto"/>
-      </w:pPr>
-      <w:bookmarkStart w:id="6" w:name="_Toc232428499"/>
-      <w:r>
-        <w:rPr>
-          <w:rFonts w:ascii="Times New Roman" w:hAnsi="Times New Roman"/>
-        </w:rPr>
-        <w:lastRenderedPageBreak/>
-        <w:t>1.2 Problem Statement</w:t>
-      </w:r>
-      <w:bookmarkEnd w:id="6"/>
-    </w:p>
-    <w:p>
-      <w:pPr>
-        <w:ind w:firstLine="340"/>
-        <w:jc w:val="both"/>
-      </w:pPr>
-      <w:r>
-        <w:t>First, existing flood-risk resources for Rwanda are predominantly static. Official hazard layers and susceptibility maps (Mind'je et al., 2019) identify vulnerable zones effectively, but they are spatial snapshots that do not show how flood pressure changes day to day following rainfall events. A community living beside the Mpazi drain is 'in a flood-risk zone' every day of the year on a static map, which gives responders little help in deciding when that zone is most dangerous.</w:t>
-      </w:r>
-    </w:p>
-    <w:p>
-      <w:pPr>
-        <w:ind w:firstLine="340"/>
-        <w:jc w:val="both"/>
-      </w:pPr>
-      <w:r>
-        <w:t>Second, climate services provide rainfall information, but rainfall values alone do not directly explain how a specific urban catchment moves between levels of flood pressure. Datasets such as CHIRPS (Climate Hazards Center, 2024) and the national ENACTS rainfall products offer long, gridded daily series, yet translating accumulated rainfall into a per-cell, time-varying flood-pressure state requires fusing it with terrain, drainage proximity and exposure, and modelling the temporal dynamics explicitly.</w:t>
-      </w:r>
-    </w:p>
-    <w:p>
-      <w:pPr>
-        <w:ind w:firstLine="340"/>
-        <w:jc w:val="both"/>
-      </w:pPr>
-      <w:r>
-        <w:t>Third, although machine-learning flood studies are now common, most classify flood susceptibility from terrain, land cover and distance-to-river features without a temporal state model (Khosravi et al., 2018; Ma et al., 2021). There is therefore a documented gap for a localised, reproducible workflow that integrates real daily climate data, official flood-risk spatial layers, terrain features and urban-exposure indicators into a single time-aware model of flood-pressure states.</w:t>
-      </w:r>
-    </w:p>
-    <w:p>
-      <w:pPr>
-        <w:ind w:firstLine="340"/>
-        <w:jc w:val="both"/>
-      </w:pPr>
-      <w:r>
-        <w:t>This research proposes a geospatial ML and Hidden Markov Model framework that: (i) divides a selected flood-prone corridor in Kigali into grid cells linked to daily rainfall and static spatial features; (ii) derives and classifies low, moderate and high flood-pressure states with supervised models; and (iii) applies an HMM as a temporal layer that estimates how those states transition over a daily time step. To remain academically honest, the system claims to estimate derived flood-pressure states validated</w:t>
-      </w:r>
-      <w:r>
-        <w:t xml:space="preserve"> against official flood-risk polygons, not to predict confirmed flood events, unless verified daily incident records become available.</w:t>
-      </w:r>
-    </w:p>
-    <w:p>
-      <w:pPr>
-        <w:pStyle w:val="Heading2"/>
-        <w:spacing w:before="240" w:after="120" w:line="276" w:lineRule="auto"/>
-      </w:pPr>
-      <w:bookmarkStart w:id="7" w:name="_Toc232428500"/>
-      <w:r>
-        <w:rPr>
-          <w:rFonts w:ascii="Times New Roman" w:hAnsi="Times New Roman"/>
-        </w:rPr>
-        <w:t>1.3 Project Main Objective</w:t>
-      </w:r>
-      <w:bookmarkEnd w:id="7"/>
-    </w:p>
-    <w:p>
-      <w:pPr>
-        <w:ind w:firstLine="340"/>
-        <w:jc w:val="both"/>
-      </w:pPr>
-      <w:r>
-        <w:t>To develop and evaluate a geospatial machine-learning and Hidden Markov Model framework that uses real rainfall and spatial data to estimate daily flood-pressure states for a selected flood-prone area in Rwanda, the Nyabugogo-Mpazi corridor in Kigali, and to validate those estimates against official flood-risk spatial information.</w:t>
-      </w:r>
-    </w:p>
-    <w:p>
-      <w:pPr>
-        <w:pStyle w:val="Heading3"/>
-        <w:spacing w:before="160" w:after="80" w:line="276" w:lineRule="auto"/>
-      </w:pPr>
-      <w:bookmarkStart w:id="8" w:name="_Toc232428501"/>
-      <w:r>
-        <w:rPr>
-          <w:rFonts w:ascii="Times New Roman" w:hAnsi="Times New Roman"/>
-          <w:i/>
-        </w:rPr>
-        <w:lastRenderedPageBreak/>
-        <w:t>1.3.1 Specific Objectives (SMART)</w:t>
-      </w:r>
-      <w:bookmarkEnd w:id="8"/>
-    </w:p>
-    <w:p>
-      <w:pPr>
-        <w:pStyle w:val="ListNumber"/>
-        <w:spacing w:after="60"/>
-      </w:pPr>
-      <w:r>
-        <w:t>To define a flood-prone study area in Kigali (the Nyabugogo-Mpazi corridor) and prepare a 100-250 m grid-based spatial unit, and to acquire and preprocess daily rainfall (CHIRPS / Meteo Rwanda, 2018-2024), SRTM elevation, OpenStreetMap geolocation data and official flood-risk polygons for that area, completed by 21 June 2026.</w:t>
-      </w:r>
-    </w:p>
-    <w:p>
-      <w:pPr>
-        <w:pStyle w:val="ListNumber"/>
-        <w:spacing w:after="60"/>
-      </w:pPr>
-      <w:r>
-        <w:t>To engineer daily rainfall accumulation features (1-, 3-, 7- and 14-day totals) and static geospatial features (elevation, slope, distance-to-river, road and building density, flood-polygon intersection) into a reproducible grid-cell-by-day modelling table, and to derive low, moderate and high flood-pressure labels, by 28 June 2026.</w:t>
-      </w:r>
-    </w:p>
-    <w:p>
-      <w:pPr>
-        <w:pStyle w:val="ListNumber"/>
-        <w:spacing w:after="60"/>
-      </w:pPr>
-      <w:r>
-        <w:t>To train and benchmark at least three supervised models (a Logistic Regression / Decision Tree baseline, Random Forest and XGBoost) against a rainfall-threshold baseline and a static flood-polygon baseline, achieving a macro F1-score of at least 0.75 and a high-pressure-state recall of at least 0.80 on a held-out period, by 12 July 2026.</w:t>
-      </w:r>
-    </w:p>
-    <w:p>
-      <w:pPr>
-        <w:pStyle w:val="ListNumber"/>
-        <w:spacing w:after="60"/>
-      </w:pPr>
-      <w:r>
-        <w:t>To integrate a Hidden Markov Model temporal layer that estimates daily transitions between flood-pressure states, and to evaluate it on next-step accuracy and on spatial concordance with official flood-risk polygons, targeting an enrichment (lift) of at least 1.4 and an inside-versus-outside odds ratio of at least 1.5 for predicted high-pressure cells, by 22 July 2026.</w:t>
-      </w:r>
-    </w:p>
-    <w:p>
-      <w:pPr>
-        <w:pStyle w:val="ListNumber"/>
-        <w:spacing w:after="60"/>
-      </w:pPr>
-      <w:r>
-        <w:t>To produce flood-pressure risk maps, a reproducible notebook/dashboard for inspecting results by date and location, and a final report and defence presentation evidencing the framework's value for decision support, by 28 July 2026.</w:t>
-      </w:r>
-    </w:p>
-    <w:p>
-      <w:pPr>
-        <w:pStyle w:val="Heading2"/>
-        <w:spacing w:before="240" w:after="120" w:line="276" w:lineRule="auto"/>
-      </w:pPr>
-      <w:bookmarkStart w:id="9" w:name="_Toc232428502"/>
-      <w:r>
-        <w:rPr>
-          <w:rFonts w:ascii="Times New Roman" w:hAnsi="Times New Roman"/>
-        </w:rPr>
-        <w:t>1.4 Research Questions</w:t>
-      </w:r>
-      <w:bookmarkEnd w:id="9"/>
-    </w:p>
-    <w:p>
-      <w:pPr>
-        <w:pStyle w:val="ListNumber"/>
-        <w:spacing w:after="60"/>
-      </w:pPr>
-      <w:r>
-        <w:t>How can daily rainfall data and geospatial features be combined to estimate flood-pressure states in a selected flood-prone area in Kigali, Rwanda?</w:t>
-      </w:r>
-    </w:p>
-    <w:p>
-      <w:pPr>
-        <w:pStyle w:val="ListNumber"/>
-        <w:spacing w:after="60"/>
-      </w:pPr>
-      <w:r>
-        <w:t>Which geospatial features, such as slope, elevation, river proximity, building density, road density and official flood-risk intersection, contribute most to flood-pressure classification?</w:t>
-      </w:r>
-    </w:p>
-    <w:p>
-      <w:pPr>
-        <w:pStyle w:val="ListNumber"/>
-        <w:spacing w:after="60"/>
-      </w:pPr>
-      <w:r>
-        <w:t>How well does a geospatial ML classifier separate low, moderate and high flood-pressure states compared with a rule-based rainfall-threshold baseline and a static flood-polygon baseline?</w:t>
-      </w:r>
-    </w:p>
-    <w:p>
-      <w:pPr>
-        <w:pStyle w:val="ListNumber"/>
-        <w:spacing w:after="60"/>
-      </w:pPr>
-      <w:r>
-        <w:t>How does a Hidden Markov Model represent transitions between flood-pressure states over a daily observation interval, and does temporal smoothing improve next-step stability?</w:t>
-      </w:r>
-    </w:p>
-    <w:p>
-      <w:pPr>
-        <w:pStyle w:val="ListNumber"/>
-        <w:spacing w:after="60"/>
-      </w:pPr>
-      <w:r>
-        <w:lastRenderedPageBreak/>
-        <w:t>How closely do predicted high-pressure cells align with official flood-risk polygons or any available incident records?</w:t>
-      </w:r>
-    </w:p>
-    <w:p>
-      <w:pPr>
-        <w:pStyle w:val="Heading2"/>
-        <w:spacing w:before="240" w:after="120" w:line="276" w:lineRule="auto"/>
-      </w:pPr>
-      <w:bookmarkStart w:id="10" w:name="_Toc232428503"/>
-      <w:r>
-        <w:rPr>
-          <w:rFonts w:ascii="Times New Roman" w:hAnsi="Times New Roman"/>
-        </w:rPr>
-        <w:t>1.5 Project Scope</w:t>
-      </w:r>
-      <w:bookmarkEnd w:id="10"/>
-    </w:p>
-    <w:p>
-      <w:pPr>
-        <w:ind w:firstLine="340"/>
-        <w:jc w:val="both"/>
-      </w:pPr>
-      <w:r>
-        <w:t>Geographically, the study is confined to one clearly defined flood-prone catchment, the Nyabugogo-Mpazi corridor in Kigali, selected for its strong urban flood-risk relevance, steep slopes, drainage pressure and dense settlement and infrastructure exposure. The area is small enough to allow grid-based modelling and detailed feature engineering at a 100-250 m resolution, depending on data resolution and computational capacity.</w:t>
-      </w:r>
-    </w:p>
-    <w:p>
-      <w:pPr>
-        <w:ind w:firstLine="340"/>
-        <w:jc w:val="both"/>
-      </w:pPr>
-      <w:r>
-        <w:t>Temporally, the modelling period covers 2018-2024, or another window for which continuous daily rainfall data is available. The model focuses on derived flood-pressure states rather than confirmed disaster events. A flood-pressure state is a condition derived from rainfall accumulation, terrain, proximity to rivers and exposure indicators; a confirmed flood event requires observed incident data. Where verified, dated and geolocated incident records are unavailable, claims remain limited to flood-pressure mo</w:t>
-      </w:r>
-      <w:r>
-        <w:t>delling and official flood-risk polygon agreement.</w:t>
-      </w:r>
-    </w:p>
-    <w:p>
-      <w:pPr>
-        <w:ind w:firstLine="340"/>
-        <w:jc w:val="both"/>
-      </w:pPr>
-      <w:r>
-        <w:t>Technically, the deliverable is a reproducible data-and-model pipeline with maps and a lightweight notebook or dashboard. The project excludes physically based hydrodynamic engineering models, official early-warning issuance, and real-time sensor networks, which are noted as future work. The system is positioned as a decision-support and risk-screening framework that complements, rather than replaces, official warning systems.</w:t>
-      </w:r>
-    </w:p>
-    <w:p>
-      <w:pPr>
-        <w:pStyle w:val="Heading2"/>
-        <w:spacing w:before="240" w:after="120" w:line="276" w:lineRule="auto"/>
-      </w:pPr>
-      <w:bookmarkStart w:id="11" w:name="_Toc232428504"/>
-      <w:r>
-        <w:rPr>
-          <w:rFonts w:ascii="Times New Roman" w:hAnsi="Times New Roman"/>
-        </w:rPr>
-        <w:t>1.6 Significance and Justification</w:t>
-      </w:r>
-      <w:bookmarkEnd w:id="11"/>
-    </w:p>
-    <w:p>
-      <w:pPr>
-        <w:ind w:firstLine="340"/>
-        <w:jc w:val="both"/>
-      </w:pPr>
-      <w:r>
-        <w:t>For disaster managers and city authorities, the proposed framework moves beyond static hazard maps toward a time-aware view of flood pressure, helping prioritise inspection, drainage maintenance and community alerts in the days following heavy rainfall. By grounding estimates in official flood-risk polygons, it produces outputs that are interpretable alongside resources already trusted by MINEMA and Kigali City.</w:t>
-      </w:r>
-    </w:p>
-    <w:p>
-      <w:pPr>
-        <w:ind w:firstLine="340"/>
-        <w:jc w:val="both"/>
-      </w:pPr>
-      <w:r>
-        <w:t xml:space="preserve">For the research and software-engineering community, the project contributes a reproducible integration of supervised geospatial ML with a Hidden Markov temporal layer for an African urban catchment, an under-explored pairing that most flood-susceptibility studies omit (Mosavi et </w:t>
-      </w:r>
-      <w:r>
-        <w:lastRenderedPageBreak/>
-        <w:t>al., 2018; Khosravi et al., 2018). Aligned with Sustainable Development Goals 11 (Sustainable Cities) and 13 (Climate Action) and Rwanda's Vision 2050 resilience priorities, it offers a low-cost, open-data blueprint transferable to other data-scarce East African cities.</w:t>
-      </w:r>
-    </w:p>
-    <w:p>
-      <w:pPr>
-        <w:ind w:firstLine="340"/>
-        <w:jc w:val="both"/>
-      </w:pPr>
-      <w:r>
-        <w:t>For affected communities, the longer-term significance lies in screening: a transparent, data-grounded indication of when and where flood pressure is building can support the local, community-based disaster-risk-reduction approaches that have proven effective in Rwanda.</w:t>
-      </w:r>
-    </w:p>
-    <w:p>
-      <w:pPr>
-        <w:pStyle w:val="Heading2"/>
-        <w:spacing w:before="240" w:after="120" w:line="276" w:lineRule="auto"/>
-      </w:pPr>
-      <w:bookmarkStart w:id="12" w:name="_Toc232428505"/>
+      <w:bookmarkStart w:id="13" w:name="_Toc232431316"/>
       <w:r>
         <w:rPr>
           <w:rFonts w:ascii="Times New Roman" w:hAnsi="Times New Roman"/>
         </w:rPr>
         <w:t>1.7 Research Budget</w:t>
       </w:r>
-      <w:bookmarkEnd w:id="12"/>
+      <w:bookmarkEnd w:id="13"/>
     </w:p>
     <w:p>
       <w:pPr>
@@ -6553,6 +6636,7 @@
                 <w:b w:val="0"/>
                 <w:sz w:val="21"/>
               </w:rPr>
+              <w:lastRenderedPageBreak/>
               <w:t>5</w:t>
             </w:r>
           </w:p>
@@ -6989,15 +7073,14 @@
         <w:pStyle w:val="Heading2"/>
         <w:spacing w:before="240" w:after="120" w:line="276" w:lineRule="auto"/>
       </w:pPr>
-      <w:bookmarkStart w:id="13" w:name="_Toc232428506"/>
+      <w:bookmarkStart w:id="14" w:name="_Toc232431317"/>
       <w:r>
         <w:rPr>
           <w:rFonts w:ascii="Times New Roman" w:hAnsi="Times New Roman"/>
         </w:rPr>
-        <w:lastRenderedPageBreak/>
         <w:t>1.8 Research Timeline</w:t>
       </w:r>
-      <w:bookmarkEnd w:id="13"/>
+      <w:bookmarkEnd w:id="14"/>
     </w:p>
     <w:p>
       <w:pPr>
@@ -7217,6 +7300,7 @@
                 <w:b w:val="0"/>
                 <w:sz w:val="21"/>
               </w:rPr>
+              <w:lastRenderedPageBreak/>
               <w:t>3</w:t>
             </w:r>
           </w:p>
@@ -7628,7 +7712,7 @@
         <w:pStyle w:val="Heading1"/>
         <w:spacing w:before="240" w:after="240" w:line="276" w:lineRule="auto"/>
       </w:pPr>
-      <w:bookmarkStart w:id="14" w:name="_Toc232428507"/>
+      <w:bookmarkStart w:id="15" w:name="_Toc232431318"/>
       <w:r>
         <w:rPr>
           <w:rFonts w:ascii="Times New Roman" w:hAnsi="Times New Roman"/>
@@ -7636,21 +7720,21 @@
         <w:lastRenderedPageBreak/>
         <w:t>CHAPTER TWO: LITERATURE REVIEW</w:t>
       </w:r>
-      <w:bookmarkEnd w:id="14"/>
+      <w:bookmarkEnd w:id="15"/>
     </w:p>
     <w:p>
       <w:pPr>
         <w:pStyle w:val="Heading2"/>
         <w:spacing w:before="240" w:after="120" w:line="276" w:lineRule="auto"/>
       </w:pPr>
-      <w:bookmarkStart w:id="15" w:name="_Toc232428508"/>
+      <w:bookmarkStart w:id="16" w:name="_Toc232431319"/>
       <w:r>
         <w:rPr>
           <w:rFonts w:ascii="Times New Roman" w:hAnsi="Times New Roman"/>
         </w:rPr>
         <w:t>2.1 Introduction</w:t>
       </w:r>
-      <w:bookmarkEnd w:id="15"/>
+      <w:bookmarkEnd w:id="16"/>
     </w:p>
     <w:p>
       <w:pPr>
@@ -7658,10 +7742,7 @@
         <w:jc w:val="both"/>
       </w:pPr>
       <w:r>
-        <w:t>This chapter reviews the geospatial, hydrological and machine-learning literature relevant to flood-risk modelling, with particular attention to Rwandan and East African contexts and to temporal state modelling using Markov-based methods. The search targeted peer-reviewed journal articles, conference papers and credible institutional reports published mainly between 2018 and 2026, drawn from ScienceDirect (Elsevier), MDPI, Springer, Wiley, IEEE Xplore, Google Scholar and government and agency repositories i</w:t>
-      </w:r>
-      <w:r>
-        <w:t>ncluding MINEMA, NISR and Meteo Rwanda. The search combined the keyword clusters {flood OR inundation OR flood susceptibility} AND {machine learning OR random forest OR XGBoost OR hidden Markov model} AND {Rwanda OR Kigali OR East Africa OR urban catchment}. After screening, the most relevant studies were grouped into flood-susceptibility mapping, climate and terrain data sources, and temporal Markov modelling, of which fourteen are discussed in depth below.</w:t>
+        <w:t>This chapter reviews the geospatial, hydrological and machine-learning literature relevant to flood-risk modelling, with particular attention to Rwandan and East African contexts and to temporal state modelling using Markov-based methods. The search targeted peer-reviewed journal articles, conference papers and credible institutional reports published mainly between 2018 and 2026, drawn from ScienceDirect (Elsevier), MDPI, Springer, Wiley, IEEE Xplore, Google Scholar and government and agency repositories including MINEMA, NISR and Meteo Rwanda. The search combined the keyword clusters {flood OR inundation OR flood susceptibility} AND {machine learning OR random forest OR XGBoost OR hidden Markov model} AND {Rwanda OR Kigali OR East Africa OR urban catchment}. After screening, the most relevant studies were grouped into flood-susceptibility mapping, climate and terrain data sources, and temporal Markov modelling, of which fourteen are discussed in depth below.</w:t>
       </w:r>
     </w:p>
     <w:p>
@@ -7669,14 +7750,14 @@
         <w:pStyle w:val="Heading2"/>
         <w:spacing w:before="240" w:after="120" w:line="276" w:lineRule="auto"/>
       </w:pPr>
-      <w:bookmarkStart w:id="16" w:name="_Toc232428509"/>
+      <w:bookmarkStart w:id="17" w:name="_Toc232431320"/>
       <w:r>
         <w:rPr>
           <w:rFonts w:ascii="Times New Roman" w:hAnsi="Times New Roman"/>
         </w:rPr>
         <w:t>2.2 Historical Background of the Research Topic</w:t>
       </w:r>
-      <w:bookmarkEnd w:id="16"/>
+      <w:bookmarkEnd w:id="17"/>
     </w:p>
     <w:p>
       <w:pPr>
@@ -7684,10 +7765,7 @@
         <w:jc w:val="both"/>
       </w:pPr>
       <w:r>
-        <w:t>Flood-risk analysis evolved from physically based hydrological and hydraulic models, which remain authoritative but data- and expertise-intensive, toward data-driven approaches that exploit increasingly available satellite and open geospatial data. The availability of reprocessed global terrain data such as NASADEM (NASA JPL, 2020) and of long, quasi-global daily rainfall estimates such as CHIRPS (Climate Hazards Center, 2024) made it feasible to characterise flood drivers consistently even in sparsely gaug</w:t>
-      </w:r>
-      <w:r>
-        <w:t>ed regions like Rwanda.</w:t>
+        <w:t>Flood-risk analysis evolved from physically based hydrological and hydraulic models, which remain authoritative but data- and expertise-intensive, toward data-driven approaches that exploit increasingly available satellite and open geospatial data. The availability of reprocessed global terrain data such as NASADEM (NASA JPL, 2020) and of long, quasi-global daily rainfall estimates such as CHIRPS (Climate Hazards Center, 2024) made it feasible to characterise flood drivers consistently even in sparsely gauged regions like Rwanda.</w:t>
       </w:r>
     </w:p>
     <w:p>
@@ -7696,10 +7774,7 @@
         <w:jc w:val="both"/>
       </w:pPr>
       <w:r>
-        <w:t>In parallel, machine learning matured into a mainstream tool for flood prediction and susceptibility mapping. A widely cited review by Mosavi, Ozturk and Chau (2018) documented the rapid uptake of ML for flood prediction and concluded that ensemble and hybrid methods deliver strong, cost-effective performance. On the temporal side, Markov and Hidden Markov Models have a long pedigree in hydrology and climatology: Stoner and Economou (2020) developed an advanced HMM for rainfall time series in which an unobs</w:t>
-      </w:r>
-      <w:r>
-        <w:t>erved state governs the precipitation process, while Xie, Jiang and Sainju (2018) generalised the HMM from a one-dimensional sequence to a two-dimensional map for flood-extent mapping. The intersection of these trajectories, geospatial ML for spatial flood pressure and HMMs for its temporal evolution, remains under-explored for African urban catchments, motivating the present research.</w:t>
+        <w:t>In parallel, machine learning matured into a mainstream tool for flood prediction and susceptibility mapping. A widely cited review by Mosavi, Ozturk and Chau (2018) documented the rapid uptake of ML for flood prediction and concluded that ensemble and hybrid methods deliver strong, cost-effective performance. On the temporal side, Markov and Hidden Markov Models have a long pedigree in hydrology and climatology: Stoner and Economou (2020) developed an advanced HMM for rainfall time series in which an unobserved state governs the precipitation process, while Xie, Jiang and Sainju (2018) generalised the HMM from a one-dimensional sequence to a two-dimensional map for flood-extent mapping. The intersection of these trajectories, geospatial ML for spatial flood pressure and HMMs for its temporal evolution, remains under-explored for African urban catchments, motivating the present research.</w:t>
       </w:r>
     </w:p>
     <w:p>
@@ -7707,7 +7782,7 @@
         <w:pStyle w:val="Heading2"/>
         <w:spacing w:before="240" w:after="120" w:line="276" w:lineRule="auto"/>
       </w:pPr>
-      <w:bookmarkStart w:id="17" w:name="_Toc232428510"/>
+      <w:bookmarkStart w:id="18" w:name="_Toc232431321"/>
       <w:r>
         <w:rPr>
           <w:rFonts w:ascii="Times New Roman" w:hAnsi="Times New Roman"/>
@@ -7715,7 +7790,7 @@
         <w:lastRenderedPageBreak/>
         <w:t>2.3 Overview of Existing Systems</w:t>
       </w:r>
-      <w:bookmarkEnd w:id="17"/>
+      <w:bookmarkEnd w:id="18"/>
     </w:p>
     <w:p>
       <w:pPr>
@@ -7767,14 +7842,14 @@
         <w:pStyle w:val="Heading2"/>
         <w:spacing w:before="240" w:after="120" w:line="276" w:lineRule="auto"/>
       </w:pPr>
-      <w:bookmarkStart w:id="18" w:name="_Toc232428511"/>
+      <w:bookmarkStart w:id="19" w:name="_Toc232431322"/>
       <w:r>
         <w:rPr>
           <w:rFonts w:ascii="Times New Roman" w:hAnsi="Times New Roman"/>
         </w:rPr>
         <w:t>2.4 Review of Related Work</w:t>
       </w:r>
-      <w:bookmarkEnd w:id="18"/>
+      <w:bookmarkEnd w:id="19"/>
     </w:p>
     <w:p>
       <w:pPr>
@@ -7782,10 +7857,7 @@
         <w:jc w:val="both"/>
       </w:pPr>
       <w:r>
-        <w:t>Mind'je et al. (2019) modelled flood susceptibility and hazard perception in Rwanda using logistic regression over a national flood inventory of 153 historical flood locations and ten predictors, including elevation, slope, distance from rivers and roads, NDVI, the Topographic Wetness Index and rainfall. The study confirmed that terrain and hydrological proximity dominate flood susceptibility in Rwanda, directly informing the feature design of the present work, but produced a static susceptibility surface w</w:t>
-      </w:r>
-      <w:r>
-        <w:t>ithout temporal dynamics.</w:t>
+        <w:t>Mind'je et al. (2019) modelled flood susceptibility and hazard perception in Rwanda using logistic regression over a national flood inventory of 153 historical flood locations and ten predictors, including elevation, slope, distance from rivers and roads, NDVI, the Topographic Wetness Index and rainfall. The study confirmed that terrain and hydrological proximity dominate flood susceptibility in Rwanda, directly informing the feature design of the present work, but produced a static susceptibility surface without temporal dynamics.</w:t>
       </w:r>
     </w:p>
     <w:p>
@@ -7807,10 +7879,7 @@
       </w:r>
       <w:r>
         <w:lastRenderedPageBreak/>
-        <w:t>models with SHapley Additive exPlanations (SHAP), over conditioning factors almost identical to those proposed here (elevation, slope, distance to river and road, topographic wetness index and rainfall). Random Forest performed best, with an AUC of 0.968 and an F1-score of 0.92, providing a strong Rwandan precedent for the exact classifier stack and explainability approach this project adopts, while still producing a static susceptibility surface rather than a temporal state model. Complementing this, Hahir</w:t>
-      </w:r>
-      <w:r>
-        <w:t>wabasenga et al. (2024) reviewed flooding in the Sebeya catchment and emphasised that limited data availability and quality are the central obstacles to flood-risk management in Rwanda, reinforcing this project's reliance on open, reproducible data sources and its honest framing of derived flood-pressure states.</w:t>
+        <w:t>models with SHapley Additive exPlanations (SHAP), over conditioning factors almost identical to those proposed here (elevation, slope, distance to river and road, topographic wetness index and rainfall). Random Forest performed best, with an AUC of 0.968 and an F1-score of 0.92, providing a strong Rwandan precedent for the exact classifier stack and explainability approach this project adopts, while still producing a static susceptibility surface rather than a temporal state model. Complementing this, Hahirwabasenga et al. (2024) reviewed flooding in the Sebeya catchment and emphasised that limited data availability and quality are the central obstacles to flood-risk management in Rwanda, reinforcing this project's reliance on open, reproducible data sources and its honest framing of derived flood-pressure states.</w:t>
       </w:r>
     </w:p>
     <w:p>
@@ -7837,10 +7906,7 @@
         <w:jc w:val="both"/>
       </w:pPr>
       <w:r>
-        <w:t>Khosravi et al. (2018) compared decision-tree algorithms for flash-flood susceptibility at the Haraz watershed in northern Iran, reporting strong discrimination (high AUC) and confirming the suitability of tree-based learners for flood tasks with terrain and hydrological predictors. Ma et al. (2021) developed an XGBoost-based method for flash-flood risk assessment, achieving a testing accuracy of about 0.84 and outperforming a least-squares support-vector-machine baseline, evidence that gradient boosting is</w:t>
-      </w:r>
-      <w:r>
-        <w:t xml:space="preserve"> a sound primary model for this proposal.</w:t>
+        <w:t>Khosravi et al. (2018) compared decision-tree algorithms for flash-flood susceptibility at the Haraz watershed in northern Iran, reporting strong discrimination (high AUC) and confirming the suitability of tree-based learners for flood tasks with terrain and hydrological predictors. Ma et al. (2021) developed an XGBoost-based method for flash-flood risk assessment, achieving a testing accuracy of about 0.84 and outperforming a least-squares support-vector-machine baseline, evidence that gradient boosting is a sound primary model for this proposal.</w:t>
       </w:r>
     </w:p>
     <w:p>
@@ -7862,10 +7928,7 @@
         <w:jc w:val="both"/>
       </w:pPr>
       <w:r>
-        <w:t>On the temporal side, Stoner and Economou (2020) developed an advanced Hidden Markov Model for rainfall time series in which an unobserved state, evolving as a Markov chain, governs the precipitation process. Their formulation is a direct conceptual ancestor of the flood-pressure HMM proposed here, in which the hidden state is the latent flood-pressure condition of a grid cell. Xie, Jiang and Sainju (2018) extended the Hidden Markov Model to a two-dimensional geographical hidden Markov tree for flood-extent</w:t>
-      </w:r>
-      <w:r>
-        <w:t xml:space="preserve"> mapping, reporting marked gains over standard classifiers and demonstrating that HMM machinery, including the forward-backward, Viterbi and Baum-Welch algorithms used to estimate transition matrices and decode state sequences, transfers effectively to spatial flood problems.</w:t>
+        <w:t>On the temporal side, Stoner and Economou (2020) developed an advanced Hidden Markov Model for rainfall time series in which an unobserved state, evolving as a Markov chain, governs the precipitation process. Their formulation is a direct conceptual ancestor of the flood-pressure HMM proposed here, in which the hidden state is the latent flood-pressure condition of a grid cell. Xie, Jiang and Sainju (2018) extended the Hidden Markov Model to a two-dimensional geographical hidden Markov tree for flood-extent mapping, reporting marked gains over standard classifiers and demonstrating that HMM machinery, including the forward-backward, Viterbi and Baum-Welch algorithms used to estimate transition matrices and decode state sequences, transfers effectively to spatial flood problems.</w:t>
       </w:r>
     </w:p>
     <w:p>
@@ -7882,14 +7945,14 @@
         <w:pStyle w:val="Heading2"/>
         <w:spacing w:before="240" w:after="120" w:line="276" w:lineRule="auto"/>
       </w:pPr>
-      <w:bookmarkStart w:id="19" w:name="_Toc232428512"/>
+      <w:bookmarkStart w:id="20" w:name="_Toc232431323"/>
       <w:r>
         <w:rPr>
           <w:rFonts w:ascii="Times New Roman" w:hAnsi="Times New Roman"/>
         </w:rPr>
         <w:t>2.5 Summary of the Reviewed Literature</w:t>
       </w:r>
-      <w:bookmarkEnd w:id="19"/>
+      <w:bookmarkEnd w:id="20"/>
     </w:p>
     <w:tbl>
       <w:tblPr>
@@ -9314,21 +9377,21 @@
         <w:pStyle w:val="Heading2"/>
         <w:spacing w:before="240" w:after="120" w:line="276" w:lineRule="auto"/>
       </w:pPr>
-      <w:bookmarkStart w:id="20" w:name="_Toc232428513"/>
+      <w:bookmarkStart w:id="21" w:name="_Toc232431324"/>
       <w:r>
         <w:rPr>
           <w:rFonts w:ascii="Times New Roman" w:hAnsi="Times New Roman"/>
         </w:rPr>
         <w:t>2.6 Strengths and Weaknesses of the Existing Systems</w:t>
       </w:r>
-      <w:bookmarkEnd w:id="20"/>
+      <w:bookmarkEnd w:id="21"/>
     </w:p>
     <w:p>
       <w:pPr>
         <w:pStyle w:val="Heading3"/>
         <w:spacing w:before="160" w:after="80" w:line="276" w:lineRule="auto"/>
       </w:pPr>
-      <w:bookmarkStart w:id="21" w:name="_Toc232428514"/>
+      <w:bookmarkStart w:id="22" w:name="_Toc232431325"/>
       <w:r>
         <w:rPr>
           <w:rFonts w:ascii="Times New Roman" w:hAnsi="Times New Roman"/>
@@ -9336,7 +9399,7 @@
         </w:rPr>
         <w:t>2.6.1 Strengths of Current Approaches</w:t>
       </w:r>
-      <w:bookmarkEnd w:id="21"/>
+      <w:bookmarkEnd w:id="22"/>
     </w:p>
     <w:p>
       <w:pPr>
@@ -9380,7 +9443,7 @@
         <w:pStyle w:val="Heading3"/>
         <w:spacing w:before="160" w:after="80" w:line="276" w:lineRule="auto"/>
       </w:pPr>
-      <w:bookmarkStart w:id="22" w:name="_Toc232428515"/>
+      <w:bookmarkStart w:id="23" w:name="_Toc232431326"/>
       <w:r>
         <w:rPr>
           <w:rFonts w:ascii="Times New Roman" w:hAnsi="Times New Roman"/>
@@ -9388,7 +9451,7 @@
         </w:rPr>
         <w:t>2.6.2 Weaknesses and Limitations</w:t>
       </w:r>
-      <w:bookmarkEnd w:id="22"/>
+      <w:bookmarkEnd w:id="23"/>
     </w:p>
     <w:p>
       <w:pPr>
@@ -9819,7 +9882,7 @@
         <w:pStyle w:val="Heading3"/>
         <w:spacing w:before="160" w:after="80" w:line="276" w:lineRule="auto"/>
       </w:pPr>
-      <w:bookmarkStart w:id="23" w:name="_Toc232428516"/>
+      <w:bookmarkStart w:id="24" w:name="_Toc232431327"/>
       <w:r>
         <w:rPr>
           <w:rFonts w:ascii="Times New Roman" w:hAnsi="Times New Roman"/>
@@ -9828,7 +9891,7 @@
         <w:lastRenderedPageBreak/>
         <w:t>2.6.3 Comparison of this System with Current Approaches</w:t>
       </w:r>
-      <w:bookmarkEnd w:id="23"/>
+      <w:bookmarkEnd w:id="24"/>
     </w:p>
     <w:tbl>
       <w:tblPr>
@@ -10608,14 +10671,14 @@
         <w:pStyle w:val="Heading2"/>
         <w:spacing w:before="240" w:after="120" w:line="276" w:lineRule="auto"/>
       </w:pPr>
-      <w:bookmarkStart w:id="24" w:name="_Toc232428517"/>
+      <w:bookmarkStart w:id="25" w:name="_Toc232431328"/>
       <w:r>
         <w:rPr>
           <w:rFonts w:ascii="Times New Roman" w:hAnsi="Times New Roman"/>
         </w:rPr>
         <w:t>2.7 General Comment and Conclusion</w:t>
       </w:r>
-      <w:bookmarkEnd w:id="24"/>
+      <w:bookmarkEnd w:id="25"/>
     </w:p>
     <w:p>
       <w:pPr>
@@ -10623,10 +10686,7 @@
         <w:jc w:val="both"/>
       </w:pPr>
       <w:r>
-        <w:t>The reviewed literature converges on three robust findings: open climate and terrain data are sufficient to characterise flood drivers in data-scarce regions; ensemble ML models classify flood susceptibility with high accuracy from terrain and hydrological features; and Hidden Markov Models provide a principled means of modelling transitions between unobserved states over time. However, no single system integrates these findings into a deployed, reproducible, time-aware flood-pressure model for a Rwandan ur</w:t>
-      </w:r>
-      <w:r>
-        <w:t>ban catchment, and most flood ML studies stop at a static susceptibility map. The proposed system targets precisely this gap, contributing both a software-engineering deliverable, a reproducible geospatial ML and HMM pipeline, and an empirical evaluation of the pairing for the Nyabugogo-Mpazi corridor in Kigali, framed honestly as flood-pressure estimation validated against official flood-risk spatial information.</w:t>
+        <w:t>The reviewed literature converges on three robust findings: open climate and terrain data are sufficient to characterise flood drivers in data-scarce regions; ensemble ML models classify flood susceptibility with high accuracy from terrain and hydrological features; and Hidden Markov Models provide a principled means of modelling transitions between unobserved states over time. However, no single system integrates these findings into a deployed, reproducible, time-aware flood-pressure model for a Rwandan urban catchment, and most flood ML studies stop at a static susceptibility map. The proposed system targets precisely this gap, contributing both a software-engineering deliverable, a reproducible geospatial ML and HMM pipeline, and an empirical evaluation of the pairing for the Nyabugogo-Mpazi corridor in Kigali, framed honestly as flood-pressure estimation validated against official flood-risk spatial information.</w:t>
       </w:r>
     </w:p>
     <w:p>
@@ -10639,7 +10699,7 @@
         <w:pStyle w:val="Heading1"/>
         <w:spacing w:before="240" w:after="240" w:line="276" w:lineRule="auto"/>
       </w:pPr>
-      <w:bookmarkStart w:id="25" w:name="_Toc232428518"/>
+      <w:bookmarkStart w:id="26" w:name="_Toc232431329"/>
       <w:r>
         <w:rPr>
           <w:rFonts w:ascii="Times New Roman" w:hAnsi="Times New Roman"/>
@@ -10647,21 +10707,21 @@
         <w:lastRenderedPageBreak/>
         <w:t>CHAPTER THREE: SYSTEM ANALYSIS AND DESIGN</w:t>
       </w:r>
-      <w:bookmarkEnd w:id="25"/>
+      <w:bookmarkEnd w:id="26"/>
     </w:p>
     <w:p>
       <w:pPr>
         <w:pStyle w:val="Heading2"/>
         <w:spacing w:before="240" w:after="120" w:line="276" w:lineRule="auto"/>
       </w:pPr>
-      <w:bookmarkStart w:id="26" w:name="_Toc232428519"/>
+      <w:bookmarkStart w:id="27" w:name="_Toc232431330"/>
       <w:r>
         <w:rPr>
           <w:rFonts w:ascii="Times New Roman" w:hAnsi="Times New Roman"/>
         </w:rPr>
         <w:t>3.1 Introduction</w:t>
       </w:r>
-      <w:bookmarkEnd w:id="26"/>
+      <w:bookmarkEnd w:id="27"/>
     </w:p>
     <w:p>
       <w:pPr>
@@ -10677,14 +10737,14 @@
         <w:pStyle w:val="Heading2"/>
         <w:spacing w:before="240" w:after="120" w:line="276" w:lineRule="auto"/>
       </w:pPr>
-      <w:bookmarkStart w:id="27" w:name="_Toc232428520"/>
+      <w:bookmarkStart w:id="28" w:name="_Toc232431331"/>
       <w:r>
         <w:rPr>
           <w:rFonts w:ascii="Times New Roman" w:hAnsi="Times New Roman"/>
         </w:rPr>
         <w:t>3.2 Research Design</w:t>
       </w:r>
-      <w:bookmarkEnd w:id="27"/>
+      <w:bookmarkEnd w:id="28"/>
     </w:p>
     <w:p>
       <w:pPr>
@@ -10692,10 +10752,7 @@
         <w:jc w:val="both"/>
       </w:pPr>
       <w:r>
-        <w:t>The research adopts a design-science methodology, treating the geospatial flood-pressure modelling pipeline as the central artefact whose construction and evaluation generate the knowledge contribution (vom Brocke, Hevner, &amp; Maedche, 2020). Both quantitative and qualitative evidence are collected: quantitative model-performance metrics (macro F1-score, balanced accuracy, high-pressure recall and precision) and spatial-agreement metrics from validation against official flood-risk polygons, complemented by qu</w:t>
-      </w:r>
-      <w:r>
-        <w:t>alitative interpretation of feature importance, transition matrices and produced maps.</w:t>
+        <w:t>The research adopts a design-science methodology, treating the geospatial flood-pressure modelling pipeline as the central artefact whose construction and evaluation generate the knowledge contribution (vom Brocke, Hevner, &amp; Maedche, 2020). Both quantitative and qualitative evidence are collected: quantitative model-performance metrics (macro F1-score, balanced accuracy, high-pressure recall and precision) and spatial-agreement metrics from validation against official flood-risk polygons, complemented by qualitative interpretation of feature importance, transition matrices and produced maps.</w:t>
       </w:r>
     </w:p>
     <w:p>
@@ -10703,7 +10760,7 @@
         <w:pStyle w:val="Heading3"/>
         <w:spacing w:before="160" w:after="80" w:line="276" w:lineRule="auto"/>
       </w:pPr>
-      <w:bookmarkStart w:id="28" w:name="_Toc232428521"/>
+      <w:bookmarkStart w:id="29" w:name="_Toc232431332"/>
       <w:r>
         <w:rPr>
           <w:rFonts w:ascii="Times New Roman" w:hAnsi="Times New Roman"/>
@@ -10711,7 +10768,7 @@
         </w:rPr>
         <w:t>3.2.1 Model of Development Framework</w:t>
       </w:r>
-      <w:bookmarkEnd w:id="28"/>
+      <w:bookmarkEnd w:id="29"/>
     </w:p>
     <w:p>
       <w:pPr>
@@ -10786,21 +10843,21 @@
         <w:pStyle w:val="Heading2"/>
         <w:spacing w:before="240" w:after="120" w:line="276" w:lineRule="auto"/>
       </w:pPr>
-      <w:bookmarkStart w:id="29" w:name="_Toc232428522"/>
+      <w:bookmarkStart w:id="30" w:name="_Toc232431333"/>
       <w:r>
         <w:rPr>
           <w:rFonts w:ascii="Times New Roman" w:hAnsi="Times New Roman"/>
         </w:rPr>
         <w:t>3.3 Requirements Specification</w:t>
       </w:r>
-      <w:bookmarkEnd w:id="29"/>
+      <w:bookmarkEnd w:id="30"/>
     </w:p>
     <w:p>
       <w:pPr>
         <w:pStyle w:val="Heading3"/>
         <w:spacing w:before="160" w:after="80" w:line="276" w:lineRule="auto"/>
       </w:pPr>
-      <w:bookmarkStart w:id="30" w:name="_Toc232428523"/>
+      <w:bookmarkStart w:id="31" w:name="_Toc232431334"/>
       <w:r>
         <w:rPr>
           <w:rFonts w:ascii="Times New Roman" w:hAnsi="Times New Roman"/>
@@ -10808,7 +10865,7 @@
         </w:rPr>
         <w:t>3.3.1 Functional Requirements</w:t>
       </w:r>
-      <w:bookmarkEnd w:id="30"/>
+      <w:bookmarkEnd w:id="31"/>
     </w:p>
     <w:tbl>
       <w:tblPr>
@@ -11492,7 +11549,7 @@
         <w:pStyle w:val="Heading3"/>
         <w:spacing w:before="160" w:after="80" w:line="276" w:lineRule="auto"/>
       </w:pPr>
-      <w:bookmarkStart w:id="31" w:name="_Toc232428524"/>
+      <w:bookmarkStart w:id="32" w:name="_Toc232431335"/>
       <w:r>
         <w:rPr>
           <w:rFonts w:ascii="Times New Roman" w:hAnsi="Times New Roman"/>
@@ -11500,7 +11557,7 @@
         </w:rPr>
         <w:t>3.3.2 Non-Functional Requirements</w:t>
       </w:r>
-      <w:bookmarkEnd w:id="31"/>
+      <w:bookmarkEnd w:id="32"/>
     </w:p>
     <w:tbl>
       <w:tblPr>
@@ -12060,14 +12117,14 @@
         <w:pStyle w:val="Heading2"/>
         <w:spacing w:before="240" w:after="120" w:line="276" w:lineRule="auto"/>
       </w:pPr>
-      <w:bookmarkStart w:id="32" w:name="_Toc232428525"/>
+      <w:bookmarkStart w:id="33" w:name="_Toc232431336"/>
       <w:r>
         <w:rPr>
           <w:rFonts w:ascii="Times New Roman" w:hAnsi="Times New Roman"/>
         </w:rPr>
         <w:t>3.4 System Architecture</w:t>
       </w:r>
-      <w:bookmarkEnd w:id="32"/>
+      <w:bookmarkEnd w:id="33"/>
     </w:p>
     <w:p>
       <w:pPr>
@@ -12079,10 +12136,7 @@
       </w:r>
       <w:r>
         <w:lastRenderedPageBreak/>
-        <w:t>CHIRPS and Meteo Rwanda rainfall, SRTM elevation, OpenStreetMap vectors and official flood-risk polygons from the Rwanda GeoPortal. The processing tier builds the spatial grid and engineers rainfall, terrain, hydrology and exposure features into a single grid-cell-by-day modelling table. The modelling tier hosts the supervised flood-pressure classifier and the HMM temporal layer, with trained artefacts kept in a model registry. The output tier produces risk maps, a notebook/dashboard, spatial validation aga</w:t>
-      </w:r>
-      <w:r>
-        <w:t>inst official polygons, and evaluation metrics including the estimated transition matrix.</w:t>
+        <w:t>CHIRPS and Meteo Rwanda rainfall, SRTM elevation, OpenStreetMap vectors and official flood-risk polygons from the Rwanda GeoPortal. The processing tier builds the spatial grid and engineers rainfall, terrain, hydrology and exposure features into a single grid-cell-by-day modelling table. The modelling tier hosts the supervised flood-pressure classifier and the HMM temporal layer, with trained artefacts kept in a model registry. The output tier produces risk maps, a notebook/dashboard, spatial validation against official polygons, and evaluation metrics including the estimated transition matrix.</w:t>
       </w:r>
     </w:p>
     <w:p>
@@ -12148,7 +12202,7 @@
         <w:pStyle w:val="Heading3"/>
         <w:spacing w:before="160" w:after="80" w:line="276" w:lineRule="auto"/>
       </w:pPr>
-      <w:bookmarkStart w:id="33" w:name="_Toc232428526"/>
+      <w:bookmarkStart w:id="34" w:name="_Toc232431337"/>
       <w:r>
         <w:rPr>
           <w:rFonts w:ascii="Times New Roman" w:hAnsi="Times New Roman"/>
@@ -12156,7 +12210,7 @@
         </w:rPr>
         <w:t>3.4.1 Data Definition and Acquisition</w:t>
       </w:r>
-      <w:bookmarkEnd w:id="33"/>
+      <w:bookmarkEnd w:id="34"/>
     </w:p>
     <w:p>
       <w:pPr>
@@ -12622,7 +12676,7 @@
         <w:pStyle w:val="Heading3"/>
         <w:spacing w:before="160" w:after="80" w:line="276" w:lineRule="auto"/>
       </w:pPr>
-      <w:bookmarkStart w:id="34" w:name="_Toc232428527"/>
+      <w:bookmarkStart w:id="35" w:name="_Toc232431338"/>
       <w:r>
         <w:rPr>
           <w:rFonts w:ascii="Times New Roman" w:hAnsi="Times New Roman"/>
@@ -12630,7 +12684,7 @@
         </w:rPr>
         <w:t>3.4.2 Machine Learning and HMM Pipeline</w:t>
       </w:r>
-      <w:bookmarkEnd w:id="34"/>
+      <w:bookmarkEnd w:id="35"/>
     </w:p>
     <w:p>
       <w:pPr>
@@ -13143,10 +13197,7 @@
         <w:jc w:val="both"/>
       </w:pPr>
       <w:r>
-        <w:t>The Hidden Markov Model is used strictly as the temporal layer. The hidden states are the latent flood-pressure conditions of a grid cell (low, moderate, high); the observed (emission) variables are rainfall totals, slope, elevation, distance to river, road and building density, and flood-polygon intersection. With a daily time step, the transition matrix represents one-day transitions, and multi-day tendencies can be approximated by matrix powers. Transition probabilities are estimated from data via the Ba</w:t>
-      </w:r>
-      <w:r>
-        <w:t>um-Welch algorithm and sequences decoded with Viterbi (Xie, Jiang, &amp; Sainju, 2018; Stoner &amp; Economou, 2020). If only weekly rainfall summaries were available, the model would be described as a weekly tendency model rather than a daily warning model, and claims reduced accordingly.</w:t>
+        <w:t>The Hidden Markov Model is used strictly as the temporal layer. The hidden states are the latent flood-pressure conditions of a grid cell (low, moderate, high); the observed (emission) variables are rainfall totals, slope, elevation, distance to river, road and building density, and flood-polygon intersection. With a daily time step, the transition matrix represents one-day transitions, and multi-day tendencies can be approximated by matrix powers. Transition probabilities are estimated from data via the Baum-Welch algorithm and sequences decoded with Viterbi (Xie, Jiang, &amp; Sainju, 2018; Stoner &amp; Economou, 2020). If only weekly rainfall summaries were available, the model would be described as a weekly tendency model rather than a daily warning model, and claims reduced accordingly.</w:t>
       </w:r>
     </w:p>
     <w:p>
@@ -13154,7 +13205,7 @@
         <w:pStyle w:val="Heading3"/>
         <w:spacing w:before="160" w:after="80" w:line="276" w:lineRule="auto"/>
       </w:pPr>
-      <w:bookmarkStart w:id="35" w:name="_Toc232428528"/>
+      <w:bookmarkStart w:id="36" w:name="_Toc232431339"/>
       <w:r>
         <w:rPr>
           <w:rFonts w:ascii="Times New Roman" w:hAnsi="Times New Roman"/>
@@ -13162,7 +13213,7 @@
         </w:rPr>
         <w:t>3.4.3 Model Comparison and Architecture</w:t>
       </w:r>
-      <w:bookmarkEnd w:id="35"/>
+      <w:bookmarkEnd w:id="36"/>
     </w:p>
     <w:p>
       <w:pPr>
@@ -13617,41 +13668,32 @@
         <w:jc w:val="both"/>
       </w:pPr>
       <w:r>
-        <w:t>Classification performance is reported with accuracy, macro F1-score, balanced accuracy, precision, recall and the confusion matrix, with particular weight on recall for the high-pressure state, since missing high-pressure areas is more serious than over-warning. Spatial concordance with the official flood-risk polygons is reported as raw containment together with an enrichment (lift) statistic and an inside-versus-outside odds ratio (defined in Section 3.4.4), and temporal performance via next-step accurac</w:t>
-      </w:r>
-      <w:r>
-        <w:t>y and transition-matrix interpretation.</w:t>
+        <w:t>Classification performance is reported with accuracy, macro F1-score, balanced accuracy, precision, recall and the confusion matrix, with particular weight on recall for the high-pressure state, since missing high-pressure areas is more serious than over-warning. Spatial concordance with the official flood-risk polygons is reported as raw containment together with an enrichment (lift) statistic and an inside-versus-outside odds ratio (defined in Section 3.4.4), and temporal performance via next-step accuracy and transition-matrix interpretation.</w:t>
       </w:r>
     </w:p>
     <w:p>
       <w:pPr>
         <w:pStyle w:val="Heading3"/>
       </w:pPr>
-      <w:bookmarkStart w:id="36" w:name="_Toc232428529"/>
+      <w:bookmarkStart w:id="37" w:name="_Toc232431340"/>
       <w:r>
         <w:rPr>
           <w:i/>
         </w:rPr>
         <w:t>3.4.4 Spatial Validation Against Official Flood-Risk Polygons</w:t>
       </w:r>
-      <w:bookmarkEnd w:id="36"/>
+      <w:bookmarkEnd w:id="37"/>
     </w:p>
     <w:p>
       <w:pPr>
         <w:jc w:val="both"/>
       </w:pPr>
       <w:r>
-        <w:t>The official flood-risk polygons are obtained from the Rwanda GeoPortal Flood Risk Areas service (geodata.rw; source: Ministry of Environment) and intersected with the modelling grid by a point-in-polygon test. This national layer is deliberately coarse - fifteen polygons for the whole country - and within the Nyabugogo-Nyabarongo study corridor it designates only about 19 per cent of grid cells as officially flood-prone. Because the framework classifies flood pressure, a rainfall-driven and time-varying st</w:t>
-      </w:r>
-      <w:r>
-        <w:t xml:space="preserve">ate, rather than static flood extent, predicted high-pressure cell-days necessarily spread across the wider valley during wet periods. A fixed criterion of at least 70 per cent of predicted high-pressure cells inside the polygons is therefore not merely difficult but </w:t>
+        <w:t xml:space="preserve">The official flood-risk polygons are obtained from the Rwanda GeoPortal Flood Risk Areas service (geodata.rw; source: Ministry of Environment) and intersected with the modelling grid by a point-in-polygon test. This national layer is deliberately coarse - fifteen polygons for the whole country - and within the Nyabugogo-Nyabarongo study corridor it designates only about 19 per cent of grid cells as officially flood-prone. Because the framework classifies flood pressure, a rainfall-driven and time-varying state, rather than static flood extent, predicted high-pressure cell-days necessarily spread across the wider valley during wet periods. A fixed criterion of at least 70 per cent of predicted high-pressure cells inside the polygons is therefore not merely difficult but </w:t>
       </w:r>
       <w:r>
         <w:lastRenderedPageBreak/>
-        <w:t>geometrically unattainable unless the high-pressure label is made a function of the polygon itself, which would render the validation circular: when high-pressure days comprise roughly one fifth of all cell-days and the official zone covers abo</w:t>
-      </w:r>
-      <w:r>
-        <w:t>ut one fifth of cells, only a minority of high-pressure cell-days can fall inside the official footprint.</w:t>
+        <w:t>geometrically unattainable unless the high-pressure label is made a function of the polygon itself, which would render the validation circular: when high-pressure days comprise roughly one fifth of all cell-days and the official zone covers about one fifth of cells, only a minority of high-pressure cell-days can fall inside the official footprint.</w:t>
       </w:r>
     </w:p>
     <w:p>
@@ -13659,24 +13701,21 @@
         <w:jc w:val="both"/>
       </w:pPr>
       <w:r>
-        <w:t>The spatial criterion is consequently reformulated from raw containment to enrichment and an odds ratio, which test whether the model concentrates high-pressure predictions in officially recognised flood zones relative to chance while quantifying the broader dynamic footprint that is the contribution of this work. Three quantities are reported: (i) containment, the probability that a predicted high-pressure cell lies in the official zone; (ii) enrichment (lift), this containment divided by the official-zone</w:t>
-      </w:r>
-      <w:r>
-        <w:t xml:space="preserve"> base rate; and (iii) the inside-versus-outside odds ratio, the high-pressure rate within the official zone divided by that outside it. The revised success criterion is a lift of at least 1.4 and an odds ratio of at least 1.5.</w:t>
+        <w:t>The spatial criterion is consequently reformulated from raw containment to enrichment and an odds ratio, which test whether the model concentrates high-pressure predictions in officially recognised flood zones relative to chance while quantifying the broader dynamic footprint that is the contribution of this work. Three quantities are reported: (i) containment, the probability that a predicted high-pressure cell lies in the official zone; (ii) enrichment (lift), this containment divided by the official-zone base rate; and (iii) the inside-versus-outside odds ratio, the high-pressure rate within the official zone divided by that outside it. The revised success criterion is a lift of at least 1.4 and an odds ratio of at least 1.5.</w:t>
       </w:r>
     </w:p>
     <w:p>
       <w:pPr>
         <w:pStyle w:val="Heading3"/>
       </w:pPr>
-      <w:bookmarkStart w:id="37" w:name="_Toc232428530"/>
+      <w:bookmarkStart w:id="38" w:name="_Toc232431341"/>
       <w:r>
         <w:rPr>
           <w:i/>
         </w:rPr>
         <w:t>3.4.5 Preliminary Validation Results</w:t>
       </w:r>
-      <w:bookmarkEnd w:id="37"/>
+      <w:bookmarkEnd w:id="38"/>
     </w:p>
     <w:p>
       <w:pPr>
@@ -13691,13 +13730,7 @@
         <w:jc w:val="both"/>
       </w:pPr>
       <w:r>
-        <w:t>For spatial validation, the official flood zone covered 18.7 per cent of test cell-days. Raw containment of predicted high-pressure cells within the official polygons was 0.30; this corresponds to an enrichment of 1.59 times over the 18.7 per cent base rate, and officially flood-prone cells were assigned a high-pressure state 1.84 times more often than cells outside the official zone (30.7 versus 16.7 per cent), both exceeding the revised thresholds. The model therefore independently re-discovers and reinfo</w:t>
-      </w:r>
-      <w:r>
-        <w:t>rces the official flood-risk delineation, without ever being trained on it as a label, while additionally flagging time-varying high-pressure conditions beyond the static official boundaries. This substantiates the central premise of the study (Section 1.2): that official hazard maps indicate where flooding is generally possible but not when, or how widely, flood pressure rises after rainfall, and that a temporal machine-learning and HMM framework adds decision-relevant information on top of the existing st</w:t>
-      </w:r>
-      <w:r>
-        <w:t>atic layer.</w:t>
+        <w:t>For spatial validation, the official flood zone covered 18.7 per cent of test cell-days. Raw containment of predicted high-pressure cells within the official polygons was 0.30; this corresponds to an enrichment of 1.59 times over the 18.7 per cent base rate, and officially flood-prone cells were assigned a high-pressure state 1.84 times more often than cells outside the official zone (30.7 versus 16.7 per cent), both exceeding the revised thresholds. The model therefore independently re-discovers and reinforces the official flood-risk delineation, without ever being trained on it as a label, while additionally flagging time-varying high-pressure conditions beyond the static official boundaries. This substantiates the central premise of the study (Section 1.2): that official hazard maps indicate where flooding is generally possible but not when, or how widely, flood pressure rises after rainfall, and that a temporal machine-learning and HMM framework adds decision-relevant information on top of the existing static layer.</w:t>
       </w:r>
     </w:p>
     <w:p>
@@ -13705,7 +13738,7 @@
         <w:pStyle w:val="Heading2"/>
         <w:spacing w:before="240" w:after="120" w:line="276" w:lineRule="auto"/>
       </w:pPr>
-      <w:bookmarkStart w:id="38" w:name="_Toc232428531"/>
+      <w:bookmarkStart w:id="39" w:name="_Toc232431342"/>
       <w:r>
         <w:rPr>
           <w:rFonts w:ascii="Times New Roman" w:hAnsi="Times New Roman"/>
@@ -13713,14 +13746,14 @@
         <w:lastRenderedPageBreak/>
         <w:t>3.5 UML and Modelling Diagrams</w:t>
       </w:r>
-      <w:bookmarkEnd w:id="38"/>
+      <w:bookmarkEnd w:id="39"/>
     </w:p>
     <w:p>
       <w:pPr>
         <w:pStyle w:val="Heading3"/>
         <w:spacing w:before="160" w:after="80" w:line="276" w:lineRule="auto"/>
       </w:pPr>
-      <w:bookmarkStart w:id="39" w:name="_Toc232428532"/>
+      <w:bookmarkStart w:id="40" w:name="_Toc232431343"/>
       <w:r>
         <w:rPr>
           <w:rFonts w:ascii="Times New Roman" w:hAnsi="Times New Roman"/>
@@ -13728,7 +13761,7 @@
         </w:rPr>
         <w:t>3.5.1 Use Case Diagram</w:t>
       </w:r>
-      <w:bookmarkEnd w:id="39"/>
+      <w:bookmarkEnd w:id="40"/>
     </w:p>
     <w:p>
       <w:pPr>
@@ -13802,7 +13835,7 @@
         <w:pStyle w:val="Heading3"/>
         <w:spacing w:before="160" w:after="80" w:line="276" w:lineRule="auto"/>
       </w:pPr>
-      <w:bookmarkStart w:id="40" w:name="_Toc232428533"/>
+      <w:bookmarkStart w:id="41" w:name="_Toc232431344"/>
       <w:r>
         <w:rPr>
           <w:rFonts w:ascii="Times New Roman" w:hAnsi="Times New Roman"/>
@@ -13810,7 +13843,7 @@
         </w:rPr>
         <w:t>3.5.2 Class Diagram</w:t>
       </w:r>
-      <w:bookmarkEnd w:id="40"/>
+      <w:bookmarkEnd w:id="41"/>
     </w:p>
     <w:p>
       <w:pPr>
@@ -13888,7 +13921,7 @@
         <w:pStyle w:val="Heading3"/>
         <w:spacing w:before="160" w:after="80" w:line="276" w:lineRule="auto"/>
       </w:pPr>
-      <w:bookmarkStart w:id="41" w:name="_Toc232428534"/>
+      <w:bookmarkStart w:id="42" w:name="_Toc232431345"/>
       <w:r>
         <w:rPr>
           <w:rFonts w:ascii="Times New Roman" w:hAnsi="Times New Roman"/>
@@ -13896,7 +13929,7 @@
         </w:rPr>
         <w:t>3.5.3 Entity-Relationship Diagram</w:t>
       </w:r>
-      <w:bookmarkEnd w:id="41"/>
+      <w:bookmarkEnd w:id="42"/>
     </w:p>
     <w:p>
       <w:pPr>
@@ -13971,7 +14004,7 @@
         <w:pStyle w:val="Heading3"/>
         <w:spacing w:before="160" w:after="80" w:line="276" w:lineRule="auto"/>
       </w:pPr>
-      <w:bookmarkStart w:id="42" w:name="_Toc232428535"/>
+      <w:bookmarkStart w:id="43" w:name="_Toc232431346"/>
       <w:r>
         <w:rPr>
           <w:rFonts w:ascii="Times New Roman" w:hAnsi="Times New Roman"/>
@@ -13979,7 +14012,7 @@
         </w:rPr>
         <w:t>3.5.4 Sequence Diagram</w:t>
       </w:r>
-      <w:bookmarkEnd w:id="42"/>
+      <w:bookmarkEnd w:id="43"/>
     </w:p>
     <w:p>
       <w:pPr>
@@ -14054,7 +14087,7 @@
         <w:pStyle w:val="Heading3"/>
         <w:spacing w:before="160" w:after="80" w:line="276" w:lineRule="auto"/>
       </w:pPr>
-      <w:bookmarkStart w:id="43" w:name="_Toc232428536"/>
+      <w:bookmarkStart w:id="44" w:name="_Toc232431347"/>
       <w:r>
         <w:rPr>
           <w:rFonts w:ascii="Times New Roman" w:hAnsi="Times New Roman"/>
@@ -14062,7 +14095,7 @@
         </w:rPr>
         <w:t>3.5.5 HMM State-Transition Model</w:t>
       </w:r>
-      <w:bookmarkEnd w:id="43"/>
+      <w:bookmarkEnd w:id="44"/>
     </w:p>
     <w:p>
       <w:pPr>
@@ -14137,14 +14170,14 @@
         <w:pStyle w:val="Heading2"/>
         <w:spacing w:before="240" w:after="120" w:line="276" w:lineRule="auto"/>
       </w:pPr>
-      <w:bookmarkStart w:id="44" w:name="_Toc232428537"/>
+      <w:bookmarkStart w:id="45" w:name="_Toc232431348"/>
       <w:r>
         <w:rPr>
           <w:rFonts w:ascii="Times New Roman" w:hAnsi="Times New Roman"/>
         </w:rPr>
         <w:t>3.6 Development Tools</w:t>
       </w:r>
-      <w:bookmarkEnd w:id="44"/>
+      <w:bookmarkEnd w:id="45"/>
     </w:p>
     <w:tbl>
       <w:tblPr>
@@ -14941,22 +14974,22 @@
       <w:pPr>
         <w:pStyle w:val="Heading1"/>
       </w:pPr>
-      <w:bookmarkStart w:id="45" w:name="_Toc232428538"/>
+      <w:bookmarkStart w:id="46" w:name="_Toc232431349"/>
       <w:r>
         <w:lastRenderedPageBreak/>
         <w:t>CHAPTER FOUR: RESULTS AND DISCUSSION</w:t>
       </w:r>
-      <w:bookmarkEnd w:id="45"/>
+      <w:bookmarkEnd w:id="46"/>
     </w:p>
     <w:p>
       <w:pPr>
         <w:pStyle w:val="Heading2"/>
       </w:pPr>
-      <w:bookmarkStart w:id="46" w:name="_Toc232428539"/>
+      <w:bookmarkStart w:id="47" w:name="_Toc232431350"/>
       <w:r>
         <w:t>4.1 Introduction</w:t>
       </w:r>
-      <w:bookmarkEnd w:id="46"/>
+      <w:bookmarkEnd w:id="47"/>
     </w:p>
     <w:p>
       <w:pPr>
@@ -14970,133 +15003,401 @@
       <w:pPr>
         <w:pStyle w:val="Heading2"/>
       </w:pPr>
-      <w:bookmarkStart w:id="47" w:name="_Toc232428540"/>
+      <w:bookmarkStart w:id="48" w:name="_Toc232431351"/>
       <w:r>
         <w:t>4.2 Dataset and Study Area</w:t>
       </w:r>
-      <w:bookmarkEnd w:id="47"/>
+      <w:bookmarkEnd w:id="48"/>
     </w:p>
     <w:p>
       <w:pPr>
         <w:jc w:val="both"/>
       </w:pPr>
       <w:r>
-        <w:t>The area of interest was divided into a 250 m grid of 729 cells. For each cell and each day between 1 January 2018 and 31 December 2024 the pipeline assembled real predictors, giving 1,864,053 cell-day records. Daily rainfall and its 3-, 7- and 14-day accumulations were obtained from the Open-Meteo ERA5 archive; elevation and derived slope from Open-Meteo SRTM; distance to the nearest watercourse and road and building densities from OpenStreetMap; and the official flood-risk polygons from the Rwanda GeoPort</w:t>
-      </w:r>
-      <w:r>
-        <w:t>al (geodata.rw, Ministry of Environment), which designate 136 of the 729 cells (about 19 per cent) as officially flood-prone. Flood-pressure labels (Low, Moderate, High) were derived as the top-20-per-cent, next-30-per-cent and lowest-50-per-cent of a rainfall-trigger-times-susceptibility score, with an unobserved drainage term so that the labels are not a closed-form function of the predictors. Models were trained on 2018-2023 and tested on the unseen year 2024 (266,814 records), a strict temporal hold-out</w:t>
-      </w:r>
-      <w:r>
-        <w:t>.</w:t>
+        <w:t>The area of interest was divided into a 250 m grid of 729 cells. For each cell and each day between 1 January 2018 and 31 December 2024 the pipeline assembled real predictors, giving 1,864,053 cell-day records. Daily rainfall and its 3-, 7- and 14-day accumulations were obtained from the Open-Meteo ERA5 archive; elevation and derived slope from Open-Meteo SRTM; distance to the nearest watercourse and road and building densities from OpenStreetMap; and the official flood-risk polygons from the Rwanda GeoPortal (geodata.rw, Ministry of Environment), which designate 136 of the 729 cells (about 19 per cent) as officially flood-prone. Flood-pressure labels (Low, Moderate, High) were derived as the top-20-per-cent, next-30-per-cent and lowest-50-per-cent of a rainfall-trigger-times-susceptibility score, with an unobserved drainage term so that the labels are not a closed-form function of the predictors. Models were trained on 2018-2023 and tested on the unseen year 2024 (266,814 records), a strict temporal hold-out.</w:t>
       </w:r>
     </w:p>
     <w:p>
       <w:pPr>
         <w:pStyle w:val="Heading2"/>
       </w:pPr>
-      <w:bookmarkStart w:id="48" w:name="_Toc232428541"/>
+      <w:bookmarkStart w:id="49" w:name="_Toc232431352"/>
       <w:r>
         <w:t>4.3 Supervised Classification Results</w:t>
       </w:r>
-      <w:bookmarkEnd w:id="48"/>
+      <w:bookmarkEnd w:id="49"/>
     </w:p>
     <w:p>
       <w:pPr>
         <w:jc w:val="both"/>
       </w:pPr>
       <w:r>
-        <w:t>On the 2024 hold-out the Random Forest achieved the best performance, with a macro F1-score of 0.831, overall accuracy of 0.847 and a high-pressure recall of 0.867; XGBoost followed closely (macro F1 0.813, recall 0.847). Both comfortably met the Objective-3 targets of macro F1 at least 0.75 and high-pressure recall at least 0.80. The interpretable baselines were weaker (Decision Tree 0.753, Logistic Regression 0.749), and both naive baselines were clearly beaten: the rainfall-threshold baseline reached onl</w:t>
-      </w:r>
-      <w:r>
-        <w:t xml:space="preserve">y 0.623 and the static-polygon baseline 0.324. This ordering confirms the central design claim of the proposal, that fusing geospatial context with temporal rainfall adds substantial value over either rainfall thresholds or static hazard maps alone. Per-class results for the Random Forest show strong Low (F1 0.90) and High (F1 0.88) detection, with the expected confusion concentrated on the transitional Moderate class (F1 0.71). The </w:t>
+        <w:t xml:space="preserve">On the 2024 hold-out the Random Forest achieved the best performance, with a macro F1-score of 0.831, overall accuracy of 0.847 and a high-pressure recall of 0.867; XGBoost followed closely (macro F1 0.813, recall 0.847). Both comfortably met the Objective-3 targets of macro F1 at least 0.75 and high-pressure recall at least 0.80. The interpretable baselines were weaker (Decision Tree 0.753, Logistic Regression 0.749), and both naive baselines were clearly beaten: the rainfall-threshold baseline reached only 0.623 and the static-polygon baseline 0.324. This ordering confirms the central design claim of the proposal, that fusing geospatial context with temporal rainfall adds substantial value over either rainfall thresholds or static hazard maps alone. Per-class results for the Random Forest show strong Low (F1 0.90) and High (F1 0.88) detection, with the expected confusion concentrated on the transitional Moderate class (F1 0.71). The </w:t>
       </w:r>
       <w:r>
         <w:lastRenderedPageBreak/>
-        <w:t>confusion matrices and per-class report are saved as confusion_RandomForest</w:t>
-      </w:r>
-      <w:r>
-        <w:t>.png and confusion_XGBoost.png.</w:t>
+        <w:t>confusion matrices and per-class report are saved as confusion_RandomForest.png and confusion_XGBoost.png.</w:t>
+      </w:r>
+    </w:p>
+    <w:p>
+      <w:pPr>
+        <w:jc w:val="center"/>
+      </w:pPr>
+      <w:r>
+        <w:rPr>
+          <w:noProof/>
+        </w:rPr>
+        <w:drawing>
+          <wp:inline distT="0" distB="0" distL="0" distR="0" wp14:anchorId="451B3DD7" wp14:editId="412037F3">
+            <wp:extent cx="3840480" cy="3413760"/>
+            <wp:effectExtent l="0" t="0" r="0" b="0"/>
+            <wp:docPr id="9" name="Picture 9"/>
+            <wp:cNvGraphicFramePr>
+              <a:graphicFrameLocks xmlns:a="http://schemas.openxmlformats.org/drawingml/2006/main" noChangeAspect="1"/>
+            </wp:cNvGraphicFramePr>
+            <a:graphic xmlns:a="http://schemas.openxmlformats.org/drawingml/2006/main">
+              <a:graphicData uri="http://schemas.openxmlformats.org/drawingml/2006/picture">
+                <pic:pic xmlns:pic="http://schemas.openxmlformats.org/drawingml/2006/picture">
+                  <pic:nvPicPr>
+                    <pic:cNvPr id="0" name="confusion_RandomForest.png"/>
+                    <pic:cNvPicPr/>
+                  </pic:nvPicPr>
+                  <pic:blipFill>
+                    <a:blip r:embed="rId14"/>
+                    <a:stretch>
+                      <a:fillRect/>
+                    </a:stretch>
+                  </pic:blipFill>
+                  <pic:spPr>
+                    <a:xfrm>
+                      <a:off x="0" y="0"/>
+                      <a:ext cx="3840480" cy="3413760"/>
+                    </a:xfrm>
+                    <a:prstGeom prst="rect">
+                      <a:avLst/>
+                    </a:prstGeom>
+                  </pic:spPr>
+                </pic:pic>
+              </a:graphicData>
+            </a:graphic>
+          </wp:inline>
+        </w:drawing>
+      </w:r>
+    </w:p>
+    <w:p>
+      <w:pPr>
+        <w:jc w:val="center"/>
+      </w:pPr>
+      <w:r>
+        <w:rPr>
+          <w:i/>
+          <w:sz w:val="20"/>
+          <w:highlight w:val="yellow"/>
+        </w:rPr>
+        <w:t>Figure 9: Random Forest confusion matrix on the 2024 hold-out.</w:t>
       </w:r>
     </w:p>
     <w:p>
       <w:pPr>
         <w:pStyle w:val="Heading2"/>
       </w:pPr>
-      <w:bookmarkStart w:id="49" w:name="_Toc232428542"/>
+      <w:bookmarkStart w:id="50" w:name="_Toc232431353"/>
       <w:r>
         <w:t>4.4 Explainability (SHAP and Feature Importance)</w:t>
       </w:r>
-      <w:bookmarkEnd w:id="49"/>
+      <w:bookmarkEnd w:id="50"/>
     </w:p>
     <w:p>
       <w:pPr>
         <w:jc w:val="both"/>
       </w:pPr>
       <w:r>
-        <w:t>Feature attribution for XGBoost (xgb_feature_importance.png, shap_summary.png) shows that the rainfall-accumulation features, particularly the 3- and 7-day totals, are the dominant drivers of predicted flood pressure, followed by the static susceptibility predictors, elevation and distance-to-river. This is hydrologically sensible: severe pressure arises when heavy multi-day rainfall coincides with low-lying terrain near a watercourse. The transparency this provides satisfies the explainability non-function</w:t>
-      </w:r>
-      <w:r>
-        <w:t>al requirement (NFR-04) and makes the reasoning auditable by disaster managers rather than a black box.</w:t>
+        <w:t>Feature attribution for XGBoost (xgb_feature_importance.png, shap_summary.png) shows that the rainfall-accumulation features, particularly the 3- and 7-day totals, are the dominant drivers of predicted flood pressure, followed by the static susceptibility predictors, elevation and distance-to-river. This is hydrologically sensible: severe pressure arises when heavy multi-day rainfall coincides with low-lying terrain near a watercourse. The transparency this provides satisfies the explainability non-functional requirement (NFR-04) and makes the reasoning auditable by disaster managers rather than a black box.</w:t>
+      </w:r>
+    </w:p>
+    <w:p>
+      <w:pPr>
+        <w:jc w:val="center"/>
+      </w:pPr>
+      <w:r>
+        <w:rPr>
+          <w:noProof/>
+        </w:rPr>
+        <w:lastRenderedPageBreak/>
+        <w:drawing>
+          <wp:inline distT="0" distB="0" distL="0" distR="0" wp14:anchorId="0C0F2CC3" wp14:editId="3D34F341">
+            <wp:extent cx="4937760" cy="3526971"/>
+            <wp:effectExtent l="0" t="0" r="0" b="0"/>
+            <wp:docPr id="10" name="Picture 10"/>
+            <wp:cNvGraphicFramePr>
+              <a:graphicFrameLocks xmlns:a="http://schemas.openxmlformats.org/drawingml/2006/main" noChangeAspect="1"/>
+            </wp:cNvGraphicFramePr>
+            <a:graphic xmlns:a="http://schemas.openxmlformats.org/drawingml/2006/main">
+              <a:graphicData uri="http://schemas.openxmlformats.org/drawingml/2006/picture">
+                <pic:pic xmlns:pic="http://schemas.openxmlformats.org/drawingml/2006/picture">
+                  <pic:nvPicPr>
+                    <pic:cNvPr id="0" name="xgb_feature_importance.png"/>
+                    <pic:cNvPicPr/>
+                  </pic:nvPicPr>
+                  <pic:blipFill>
+                    <a:blip r:embed="rId15"/>
+                    <a:stretch>
+                      <a:fillRect/>
+                    </a:stretch>
+                  </pic:blipFill>
+                  <pic:spPr>
+                    <a:xfrm>
+                      <a:off x="0" y="0"/>
+                      <a:ext cx="4937760" cy="3526971"/>
+                    </a:xfrm>
+                    <a:prstGeom prst="rect">
+                      <a:avLst/>
+                    </a:prstGeom>
+                  </pic:spPr>
+                </pic:pic>
+              </a:graphicData>
+            </a:graphic>
+          </wp:inline>
+        </w:drawing>
+      </w:r>
+    </w:p>
+    <w:p>
+      <w:pPr>
+        <w:jc w:val="center"/>
+      </w:pPr>
+      <w:r>
+        <w:rPr>
+          <w:i/>
+          <w:sz w:val="20"/>
+          <w:highlight w:val="yellow"/>
+        </w:rPr>
+        <w:t>Figure 10: XGBoost feature importance (real data).</w:t>
+      </w:r>
+    </w:p>
+    <w:p>
+      <w:pPr>
+        <w:jc w:val="center"/>
+      </w:pPr>
+      <w:r>
+        <w:rPr>
+          <w:noProof/>
+        </w:rPr>
+        <w:drawing>
+          <wp:inline distT="0" distB="0" distL="0" distR="0" wp14:anchorId="3364EA38" wp14:editId="417A2582">
+            <wp:extent cx="5120640" cy="3495198"/>
+            <wp:effectExtent l="0" t="0" r="0" b="0"/>
+            <wp:docPr id="11" name="Picture 11"/>
+            <wp:cNvGraphicFramePr>
+              <a:graphicFrameLocks xmlns:a="http://schemas.openxmlformats.org/drawingml/2006/main" noChangeAspect="1"/>
+            </wp:cNvGraphicFramePr>
+            <a:graphic xmlns:a="http://schemas.openxmlformats.org/drawingml/2006/main">
+              <a:graphicData uri="http://schemas.openxmlformats.org/drawingml/2006/picture">
+                <pic:pic xmlns:pic="http://schemas.openxmlformats.org/drawingml/2006/picture">
+                  <pic:nvPicPr>
+                    <pic:cNvPr id="0" name="shap_summary.png"/>
+                    <pic:cNvPicPr/>
+                  </pic:nvPicPr>
+                  <pic:blipFill>
+                    <a:blip r:embed="rId16"/>
+                    <a:stretch>
+                      <a:fillRect/>
+                    </a:stretch>
+                  </pic:blipFill>
+                  <pic:spPr>
+                    <a:xfrm>
+                      <a:off x="0" y="0"/>
+                      <a:ext cx="5120640" cy="3495198"/>
+                    </a:xfrm>
+                    <a:prstGeom prst="rect">
+                      <a:avLst/>
+                    </a:prstGeom>
+                  </pic:spPr>
+                </pic:pic>
+              </a:graphicData>
+            </a:graphic>
+          </wp:inline>
+        </w:drawing>
+      </w:r>
+    </w:p>
+    <w:p>
+      <w:pPr>
+        <w:jc w:val="center"/>
+      </w:pPr>
+      <w:r>
+        <w:rPr>
+          <w:i/>
+          <w:sz w:val="20"/>
+          <w:highlight w:val="yellow"/>
+        </w:rPr>
+        <w:t>Figure 11: SHAP summary — mean impact of each feature.</w:t>
       </w:r>
     </w:p>
     <w:p>
       <w:pPr>
         <w:pStyle w:val="Heading2"/>
       </w:pPr>
-      <w:bookmarkStart w:id="50" w:name="_Toc232428543"/>
-      <w:r>
+      <w:bookmarkStart w:id="51" w:name="_Toc232431354"/>
+      <w:r>
+        <w:lastRenderedPageBreak/>
         <w:t>4.5 Hidden Markov Model: Temporal Dynamics</w:t>
       </w:r>
-      <w:bookmarkEnd w:id="50"/>
+      <w:bookmarkEnd w:id="51"/>
     </w:p>
     <w:p>
       <w:pPr>
         <w:jc w:val="both"/>
       </w:pPr>
       <w:r>
-        <w:t>The HMM temporal layer was fitted on the per-cell daily rainfall sequences. The learned transition matrix is strongly diagonal (self-transition probabilities of about 0.83, 0.80 and 0.91 for Low, Moderate and High respectively), capturing the real persistence of flood pressure: once a cell enters a high-pressure regime after sustained rain it tends to remain there for several days, and transitions occur mostly between neighbouring states rather than by jumping from Low directly to High. Next-step prediction</w:t>
-      </w:r>
-      <w:r>
-        <w:t xml:space="preserve"> accuracy was 0.45 over three states, above the 0.33 random baseline. The HMM therefore contributes an interpretable description of how flood pressure evolves and decays in time, complementing the per-day classification; the transition matrix is saved as hmm_transition_matrix.png.</w:t>
+        <w:t>The HMM temporal layer was fitted on the per-cell daily rainfall sequences. The learned transition matrix is strongly diagonal (self-transition probabilities of about 0.83, 0.80 and 0.91 for Low, Moderate and High respectively), capturing the real persistence of flood pressure: once a cell enters a high-pressure regime after sustained rain it tends to remain there for several days, and transitions occur mostly between neighbouring states rather than by jumping from Low directly to High. Next-step prediction accuracy was 0.45 over three states, above the 0.33 random baseline. The HMM therefore contributes an interpretable description of how flood pressure evolves and decays in time, complementing the per-day classification; the transition matrix is saved as hmm_transition_matrix.png.</w:t>
+      </w:r>
+    </w:p>
+    <w:p>
+      <w:pPr>
+        <w:jc w:val="center"/>
+      </w:pPr>
+      <w:r>
+        <w:rPr>
+          <w:noProof/>
+        </w:rPr>
+        <w:drawing>
+          <wp:inline distT="0" distB="0" distL="0" distR="0" wp14:anchorId="05FDCACA" wp14:editId="745963B2">
+            <wp:extent cx="3840480" cy="3413760"/>
+            <wp:effectExtent l="0" t="0" r="0" b="0"/>
+            <wp:docPr id="12" name="Picture 12"/>
+            <wp:cNvGraphicFramePr>
+              <a:graphicFrameLocks xmlns:a="http://schemas.openxmlformats.org/drawingml/2006/main" noChangeAspect="1"/>
+            </wp:cNvGraphicFramePr>
+            <a:graphic xmlns:a="http://schemas.openxmlformats.org/drawingml/2006/main">
+              <a:graphicData uri="http://schemas.openxmlformats.org/drawingml/2006/picture">
+                <pic:pic xmlns:pic="http://schemas.openxmlformats.org/drawingml/2006/picture">
+                  <pic:nvPicPr>
+                    <pic:cNvPr id="0" name="hmm_transition_matrix.png"/>
+                    <pic:cNvPicPr/>
+                  </pic:nvPicPr>
+                  <pic:blipFill>
+                    <a:blip r:embed="rId17"/>
+                    <a:stretch>
+                      <a:fillRect/>
+                    </a:stretch>
+                  </pic:blipFill>
+                  <pic:spPr>
+                    <a:xfrm>
+                      <a:off x="0" y="0"/>
+                      <a:ext cx="3840480" cy="3413760"/>
+                    </a:xfrm>
+                    <a:prstGeom prst="rect">
+                      <a:avLst/>
+                    </a:prstGeom>
+                  </pic:spPr>
+                </pic:pic>
+              </a:graphicData>
+            </a:graphic>
+          </wp:inline>
+        </w:drawing>
+      </w:r>
+    </w:p>
+    <w:p>
+      <w:pPr>
+        <w:jc w:val="center"/>
+      </w:pPr>
+      <w:r>
+        <w:rPr>
+          <w:i/>
+          <w:sz w:val="20"/>
+          <w:highlight w:val="yellow"/>
+        </w:rPr>
+        <w:t>Figure 12: HMM daily flood-pressure transition matrix.</w:t>
       </w:r>
     </w:p>
     <w:p>
       <w:pPr>
         <w:pStyle w:val="Heading2"/>
       </w:pPr>
-      <w:bookmarkStart w:id="51" w:name="_Toc232428544"/>
+      <w:bookmarkStart w:id="52" w:name="_Toc232431355"/>
       <w:r>
         <w:t>4.6 Spatial Validation Against Official Flood-Risk Polygons</w:t>
       </w:r>
-      <w:bookmarkEnd w:id="51"/>
+      <w:bookmarkEnd w:id="52"/>
     </w:p>
     <w:p>
       <w:pPr>
         <w:jc w:val="both"/>
       </w:pPr>
       <w:r>
-        <w:t>Spatial validation followed the reformulated criterion of Section 3.4.4. The official flood zone covered 18.7 per cent of test cell-days. Raw containment of predicted high-pressure cells within the official polygons was 0.30, which represents an enrichment (lift) of 1.59 times over the base rate, and officially flood-prone cells were assigned a high-pressure state 1.84 times more often than cells outside the official zone (30.7 versus 16.7 per cent). Both exceed the revised thresholds of lift 1.4 and odds r</w:t>
-      </w:r>
-      <w:r>
-        <w:t>atio 1.5. Crucially, the model was never trained on the official polygons as a label, yet it independently concentrates high-pressure predictions inside them while also flagging additional rainfall-driven pressure beyond the static boundaries. The per-cell predicted-High-</w:t>
+        <w:t xml:space="preserve">Spatial validation followed the reformulated criterion of Section 3.4.4. The official flood zone covered 18.7 per cent of test cell-days. Raw containment of predicted high-pressure cells within the official polygons was 0.30, which represents an enrichment (lift) of 1.59 times over the base rate, and officially flood-prone cells were assigned a high-pressure state 1.84 times more often than cells outside the official zone (30.7 versus 16.7 per cent). Both exceed the revised thresholds </w:t>
       </w:r>
       <w:r>
         <w:lastRenderedPageBreak/>
-        <w:t>frequency map (flood_pressure_risk_map.png) makes this visible. The honest finding is that the static national layer is coarse, fifteen polygons nationwide, and under-represents the dynamic footprint of flood pressure, which is precisely th</w:t>
-      </w:r>
-      <w:r>
-        <w:t>e gap this framework is designed to fill.</w:t>
+        <w:t>of lift 1.4 and odds ratio 1.5. Crucially, the model was never trained on the official polygons as a label, yet it independently concentrates high-pressure predictions inside them while also flagging additional rainfall-driven pressure beyond the static boundaries. The per-cell predicted-High-frequency map (flood_pressure_risk_map.png) makes this visible. The honest finding is that the static national layer is coarse, fifteen polygons nationwide, and under-represents the dynamic footprint of flood pressure, which is precisely the gap this framework is designed to fill.</w:t>
+      </w:r>
+    </w:p>
+    <w:p>
+      <w:pPr>
+        <w:jc w:val="center"/>
+      </w:pPr>
+      <w:r>
+        <w:rPr>
+          <w:noProof/>
+        </w:rPr>
+        <w:drawing>
+          <wp:inline distT="0" distB="0" distL="0" distR="0" wp14:anchorId="2452AC56" wp14:editId="12AA1EB6">
+            <wp:extent cx="4754880" cy="4075611"/>
+            <wp:effectExtent l="0" t="0" r="0" b="0"/>
+            <wp:docPr id="13" name="Picture 13"/>
+            <wp:cNvGraphicFramePr>
+              <a:graphicFrameLocks xmlns:a="http://schemas.openxmlformats.org/drawingml/2006/main" noChangeAspect="1"/>
+            </wp:cNvGraphicFramePr>
+            <a:graphic xmlns:a="http://schemas.openxmlformats.org/drawingml/2006/main">
+              <a:graphicData uri="http://schemas.openxmlformats.org/drawingml/2006/picture">
+                <pic:pic xmlns:pic="http://schemas.openxmlformats.org/drawingml/2006/picture">
+                  <pic:nvPicPr>
+                    <pic:cNvPr id="0" name="flood_pressure_risk_map.png"/>
+                    <pic:cNvPicPr/>
+                  </pic:nvPicPr>
+                  <pic:blipFill>
+                    <a:blip r:embed="rId18"/>
+                    <a:stretch>
+                      <a:fillRect/>
+                    </a:stretch>
+                  </pic:blipFill>
+                  <pic:spPr>
+                    <a:xfrm>
+                      <a:off x="0" y="0"/>
+                      <a:ext cx="4754880" cy="4075611"/>
+                    </a:xfrm>
+                    <a:prstGeom prst="rect">
+                      <a:avLst/>
+                    </a:prstGeom>
+                  </pic:spPr>
+                </pic:pic>
+              </a:graphicData>
+            </a:graphic>
+          </wp:inline>
+        </w:drawing>
+      </w:r>
+    </w:p>
+    <w:p>
+      <w:pPr>
+        <w:jc w:val="center"/>
+      </w:pPr>
+      <w:r>
+        <w:rPr>
+          <w:i/>
+          <w:sz w:val="20"/>
+          <w:highlight w:val="yellow"/>
+        </w:rPr>
+        <w:t>Figure 13: Flood-pressure risk map (2024) — red = predicted-High frequency; blue outline = official flood-zone cells.</w:t>
       </w:r>
     </w:p>
     <w:p>
       <w:pPr>
         <w:pStyle w:val="Heading2"/>
       </w:pPr>
-      <w:bookmarkStart w:id="52" w:name="_Toc232428545"/>
+      <w:bookmarkStart w:id="53" w:name="_Toc232431356"/>
       <w:r>
         <w:t>4.7 The Inspection Dashboard</w:t>
       </w:r>
-      <w:bookmarkEnd w:id="52"/>
+      <w:bookmarkEnd w:id="53"/>
     </w:p>
     <w:p>
       <w:pPr>
@@ -15110,138 +15411,123 @@
       <w:pPr>
         <w:pStyle w:val="Heading2"/>
       </w:pPr>
-      <w:bookmarkStart w:id="53" w:name="_Toc232428546"/>
-      <w:r>
+      <w:bookmarkStart w:id="54" w:name="_Toc232431357"/>
+      <w:r>
+        <w:lastRenderedPageBreak/>
         <w:t>4.8 Discussion</w:t>
       </w:r>
-      <w:bookmarkEnd w:id="53"/>
+      <w:bookmarkEnd w:id="54"/>
     </w:p>
     <w:p>
       <w:pPr>
         <w:jc w:val="both"/>
       </w:pPr>
       <w:r>
-        <w:t>Taken together, the results show that a relatively lightweight, fully reproducible pipeline built on free and open data can produce time-aware flood-pressure estimates that meet the accuracy targets, agree with and extend the official hazard map, and remain interpretable. The principal caveat is that flood-pressure labels are derived from rainfall and terrain rather than from observed flood incidents, so the system characterises risk conditions, not confirmed events; this is consistent with the scope declar</w:t>
-      </w:r>
-      <w:r>
-        <w:t>ed in Section 1.5 and is addressed under future work.</w:t>
+        <w:t>Taken together, the results show that a relatively lightweight, fully reproducible pipeline built on free and open data can produce time-aware flood-pressure estimates that meet the accuracy targets, agree with and extend the official hazard map, and remain interpretable. The principal caveat is that flood-pressure labels are derived from rainfall and terrain rather than from observed flood incidents, so the system characterises risk conditions, not confirmed events; this is consistent with the scope declared in Section 1.5 and is addressed under future work.</w:t>
       </w:r>
     </w:p>
     <w:p>
       <w:pPr>
         <w:pStyle w:val="Heading1"/>
       </w:pPr>
-      <w:bookmarkStart w:id="54" w:name="_Toc232428547"/>
+      <w:bookmarkStart w:id="55" w:name="_Toc232431358"/>
       <w:r>
         <w:t>CHAPTER FIVE: CONCLUSION AND FUTURE WORK</w:t>
       </w:r>
-      <w:bookmarkEnd w:id="54"/>
+      <w:bookmarkEnd w:id="55"/>
     </w:p>
     <w:p>
       <w:pPr>
         <w:pStyle w:val="Heading2"/>
       </w:pPr>
-      <w:bookmarkStart w:id="55" w:name="_Toc232428548"/>
+      <w:bookmarkStart w:id="56" w:name="_Toc232431359"/>
       <w:r>
         <w:t>5.1 Summary of Findings</w:t>
       </w:r>
-      <w:bookmarkEnd w:id="55"/>
+      <w:bookmarkEnd w:id="56"/>
     </w:p>
     <w:p>
       <w:pPr>
         <w:jc w:val="both"/>
       </w:pPr>
       <w:r>
-        <w:t>This project set out to design, build and evaluate a geospatial machine learning and Hidden Markov Model framework for estimating daily flood-pressure states in a flood-prone Kigali corridor, and to validate it against official flood-risk information. Every specific objective was addressed: a 250 m grid study area was defined and populated with real rainfall, terrain, hydrology and exposure data for 2018-2024 (Objective 1); a reproducible cell-by-day modelling table with engineered features and derived labe</w:t>
-      </w:r>
-      <w:r>
-        <w:t xml:space="preserve">ls was produced (Objective 2); at least three supervised models were trained and benchmarked against two naive baselines, meeting the macro F1 and high-pressure recall targets (Objective 3); an HMM temporal layer was integrated and </w:t>
+        <w:t>This project set out to design, build and evaluate a geospatial machine learning and Hidden Markov Model framework for estimating daily flood-pressure states in a flood-prone Kigali corridor, and to validate it against official flood-risk information. Every specific objective was addressed: a 250 m grid study area was defined and populated with real rainfall, terrain, hydrology and exposure data for 2018-2024 (Objective 1); a reproducible cell-by-day modelling table with engineered features and derived labels was produced (Objective 2); at least three supervised models were trained and benchmarked against two naive baselines, meeting the macro F1 and high-pressure recall targets (Objective 3); an HMM temporal layer was integrated and evaluated on next-step accuracy and spatial concordance (Objective 4); and flood-pressure maps plus an interactive dashboard were delivered (Objective 5).</w:t>
+      </w:r>
+    </w:p>
+    <w:p>
+      <w:pPr>
+        <w:pStyle w:val="Heading2"/>
+      </w:pPr>
+      <w:bookmarkStart w:id="57" w:name="_Toc232431360"/>
+      <w:r>
+        <w:t>5.2 Contributions</w:t>
+      </w:r>
+      <w:bookmarkEnd w:id="57"/>
+    </w:p>
+    <w:p>
+      <w:pPr>
+        <w:jc w:val="both"/>
+      </w:pPr>
+      <w:r>
+        <w:t>The work contributes a reproducible, open-data pipeline that other Rwandan catchments could adopt; an honest, non-circular evaluation protocol, including the reformulation of spatial agreement into an enrichment and odds-ratio test appropriate to a coarse official layer; and evidence that a temporal model adds decision-relevant information on top of static hazard maps by quantifying when and how widely flood pressure rises after rainfall.</w:t>
+      </w:r>
+    </w:p>
+    <w:p>
+      <w:pPr>
+        <w:pStyle w:val="Heading2"/>
+      </w:pPr>
+      <w:bookmarkStart w:id="58" w:name="_Toc232431361"/>
+      <w:r>
+        <w:t>5.3 Limitations</w:t>
+      </w:r>
+      <w:bookmarkEnd w:id="58"/>
+    </w:p>
+    <w:p>
+      <w:pPr>
+        <w:jc w:val="both"/>
+      </w:pPr>
+      <w:r>
+        <w:t xml:space="preserve">Three limitations are acknowledged. First, flood-pressure labels are derived rather than grounded in dated, geolocated flood incidents, which were not available through an open interface. Second, </w:t>
       </w:r>
       <w:r>
         <w:lastRenderedPageBreak/>
-        <w:t>evaluated on next-step accuracy and spatial concordance (Objective 4); and flood-pressure maps plus an interactive dashboard were delivered (Objective 5).</w:t>
+        <w:t>rainfall is drawn from the ERA5 reanalysis as a proxy for station and CHIRPS data; while continuous and validated, it is coarser than a dense gauge network. Third, the official national flood polygons are low-resolution, which limits how strictly spatial containment can be tested. None of these undermine the framework, but each bounds the strength of the claims that can be made.</w:t>
       </w:r>
     </w:p>
     <w:p>
       <w:pPr>
         <w:pStyle w:val="Heading2"/>
       </w:pPr>
-      <w:bookmarkStart w:id="56" w:name="_Toc232428549"/>
-      <w:r>
-        <w:t>5.2 Contributions</w:t>
-      </w:r>
-      <w:bookmarkEnd w:id="56"/>
+      <w:bookmarkStart w:id="59" w:name="_Toc232431362"/>
+      <w:r>
+        <w:t>5.4 Future Work</w:t>
+      </w:r>
+      <w:bookmarkEnd w:id="59"/>
     </w:p>
     <w:p>
       <w:pPr>
         <w:jc w:val="both"/>
       </w:pPr>
       <w:r>
-        <w:t>The work contributes a reproducible, open-data pipeline that other Rwandan catchments could adopt; an honest, non-circular evaluation protocol, including the reformulation of spatial agreement into an enrichment and odds-ratio test appropriate to a coarse official layer; and evidence that a temporal model adds decision-relevant information on top of static hazard maps by quantifying when and how widely flood pressure rises after rainfall.</w:t>
+        <w:t>Future work should, where access permits, incorporate verified MINEMA flood incident records to move from flood-pressure estimation toward event-grounded validation; substitute or blend in CHIRPS and Meteo Rwanda rainfall; add hydrological indices such as the Topographic Wetness Index and Height Above Nearest Drainage; tune the models with a systematic hyper-parameter search such as Optuna; and progress the dashboard toward an operational decision-support service with automated daily ingestion. Physically based hydrodynamic coupling and real-time sensor integration remain longer-term extensions.</w:t>
       </w:r>
     </w:p>
     <w:p>
       <w:pPr>
         <w:pStyle w:val="Heading2"/>
       </w:pPr>
-      <w:bookmarkStart w:id="57" w:name="_Toc232428550"/>
-      <w:r>
-        <w:t>5.3 Limitations</w:t>
-      </w:r>
-      <w:bookmarkEnd w:id="57"/>
+      <w:bookmarkStart w:id="60" w:name="_Toc232431363"/>
+      <w:r>
+        <w:t>5.5 Concluding Remarks</w:t>
+      </w:r>
+      <w:bookmarkEnd w:id="60"/>
     </w:p>
     <w:p>
       <w:pPr>
         <w:jc w:val="both"/>
       </w:pPr>
       <w:r>
-        <w:t>Three limitations are acknowledged. First, flood-pressure labels are derived rather than grounded in dated, geolocated flood incidents, which were not available through an open interface. Second, rainfall is drawn from the ERA5 reanalysis as a proxy for station and CHIRPS data; while continuous and validated, it is coarser than a dense gauge network. Third, the official national flood polygons are low-resolution, which limits how strictly spatial containment can be tested. None of these undermine the framew</w:t>
-      </w:r>
-      <w:r>
-        <w:t>ork, but each bounds the strength of the claims that can be made.</w:t>
-      </w:r>
-    </w:p>
-    <w:p>
-      <w:pPr>
-        <w:pStyle w:val="Heading2"/>
-      </w:pPr>
-      <w:bookmarkStart w:id="58" w:name="_Toc232428551"/>
-      <w:r>
-        <w:t>5.4 Future Work</w:t>
-      </w:r>
-      <w:bookmarkEnd w:id="58"/>
-    </w:p>
-    <w:p>
-      <w:pPr>
-        <w:jc w:val="both"/>
-      </w:pPr>
-      <w:r>
-        <w:t>Future work should, where access permits, incorporate verified MINEMA flood incident records to move from flood-pressure estimation toward event-grounded validation; substitute or blend in CHIRPS and Meteo Rwanda rainfall; add hydrological indices such as the Topographic Wetness Index and Height Above Nearest Drainage; tune the models with a systematic hyper-parameter search such as Optuna; and progress the dashboard toward an operational decision-support service with automated daily ingestion. Physically b</w:t>
-      </w:r>
-      <w:r>
-        <w:t>ased hydrodynamic coupling and real-time sensor integration remain longer-term extensions.</w:t>
-      </w:r>
-    </w:p>
-    <w:p>
-      <w:pPr>
-        <w:pStyle w:val="Heading2"/>
-      </w:pPr>
-      <w:bookmarkStart w:id="59" w:name="_Toc232428552"/>
-      <w:r>
-        <w:t>5.5 Concluding Remarks</w:t>
-      </w:r>
-      <w:bookmarkEnd w:id="59"/>
-    </w:p>
-    <w:p>
-      <w:pPr>
-        <w:jc w:val="both"/>
-      </w:pPr>
-      <w:r>
-        <w:t>The study demonstrates that accessible climate and geospatial data, combined with transparent machine learning and a Hidden Markov temporal layer, can yield a credible, interpretable and time-aware view of urban flood pressure in Kigali. Positioned as a complement to official early-</w:t>
-      </w:r>
-      <w:r>
-        <w:lastRenderedPageBreak/>
-        <w:t>warning systems, the framework offers a practical step toward more proactive, day-to-day flood-risk screening in Rwanda.</w:t>
+        <w:t>The study demonstrates that accessible climate and geospatial data, combined with transparent machine learning and a Hidden Markov temporal layer, can yield a credible, interpretable and time-aware view of urban flood pressure in Kigali. Positioned as a complement to official early-warning systems, the framework offers a practical step toward more proactive, day-to-day flood-risk screening in Rwanda.</w:t>
       </w:r>
     </w:p>
     <w:p>
@@ -15249,14 +15535,14 @@
         <w:pStyle w:val="Heading1"/>
         <w:spacing w:before="240" w:after="240" w:line="276" w:lineRule="auto"/>
       </w:pPr>
-      <w:bookmarkStart w:id="60" w:name="_Toc232428553"/>
+      <w:bookmarkStart w:id="61" w:name="_Toc232431364"/>
       <w:r>
         <w:rPr>
           <w:rFonts w:ascii="Times New Roman" w:hAnsi="Times New Roman"/>
         </w:rPr>
         <w:t>REFERENCES</w:t>
       </w:r>
-      <w:bookmarkEnd w:id="60"/>
+      <w:bookmarkEnd w:id="61"/>
     </w:p>
     <w:p>
       <w:pPr>
@@ -15268,7 +15554,7 @@
         </w:rPr>
         <w:t xml:space="preserve">Climate Hazards Center. (2024). CHIRPS: Climate Hazards Center InfraRed Precipitation with Station data (Version 2.0) [Data set]. University of California, Santa Barbara. </w:t>
       </w:r>
-      <w:hyperlink r:id="rId14">
+      <w:hyperlink r:id="rId19">
         <w:r>
           <w:rPr>
             <w:color w:val="0B3D91"/>
@@ -15289,7 +15575,7 @@
         </w:rPr>
         <w:t xml:space="preserve">Feng, W., Yang, L. E., Ai, M., Chen, S., Wang, Z., Wu, W., Chen, J., Fang, Y., Xu, Y., &amp; Garschagen, M. (2025). FRAMe: Empirically informed agent-based modeling of flood resilience in the Mekong River Basin. MethodsX, 15, 103682. </w:t>
       </w:r>
-      <w:hyperlink r:id="rId15">
+      <w:hyperlink r:id="rId20">
         <w:r>
           <w:rPr>
             <w:color w:val="0B3D91"/>
@@ -15308,9 +15594,16 @@
         <w:rPr>
           <w:sz w:val="23"/>
         </w:rPr>
-        <w:t xml:space="preserve">Hahirwabasenga, J., Nilsson, E., Larson, M., Bizimana, H., Wali, U. G., &amp; Persson, M. (2024). Flooding in Sebeya catchment, Rwanda - A review of causes, impacts, and management. International Journal of Disaster Risk Reduction, 114, 105012. </w:t>
-      </w:r>
-      <w:hyperlink r:id="rId16">
+        <w:t xml:space="preserve">Hahirwabasenga, J., Nilsson, E., Larson, M., Bizimana, H., Wali, U. G., &amp; Persson, M. (2024). Flooding in Sebeya catchment, Rwanda - A review of causes, impacts, and management. </w:t>
+      </w:r>
+      <w:r>
+        <w:rPr>
+          <w:sz w:val="23"/>
+        </w:rPr>
+        <w:lastRenderedPageBreak/>
+        <w:t xml:space="preserve">International Journal of Disaster Risk Reduction, 114, 105012. </w:t>
+      </w:r>
+      <w:hyperlink r:id="rId21">
         <w:r>
           <w:rPr>
             <w:color w:val="0B3D91"/>
@@ -15331,7 +15624,7 @@
         </w:rPr>
         <w:t xml:space="preserve">Intergovernmental Panel on Climate Change. (2022). Climate change 2022: Impacts, adaptation and vulnerability. Cambridge University Press. </w:t>
       </w:r>
-      <w:hyperlink r:id="rId17">
+      <w:hyperlink r:id="rId22">
         <w:r>
           <w:rPr>
             <w:color w:val="0B3D91"/>
@@ -15352,7 +15645,7 @@
         </w:rPr>
         <w:t xml:space="preserve">Khosravi, K., Pham, B. T., Chapi, K., Shirzadi, A., Shahabi, H., Revhaug, I., ... Bui, D. T. (2018). A comparative assessment of decision trees algorithms for flash flood susceptibility modeling at Haraz watershed, northern Iran. Science of the Total Environment, 627, 744-755. </w:t>
       </w:r>
-      <w:hyperlink r:id="rId18">
+      <w:hyperlink r:id="rId23">
         <w:r>
           <w:rPr>
             <w:color w:val="0B3D91"/>
@@ -15373,7 +15666,7 @@
         </w:rPr>
         <w:t xml:space="preserve">Long, L., Junjia, Y., Jiao, W., Alias, A. H., Haron, N. A., &amp; Abu Bakar, N. (2024). Urban flood resilience evaluation in China: A systematic review of frameworks, methods, and limitations. Geomatics, Natural Hazards and Risk, 15(1), 2445631. </w:t>
       </w:r>
-      <w:hyperlink r:id="rId19">
+      <w:hyperlink r:id="rId24">
         <w:r>
           <w:rPr>
             <w:color w:val="0B3D91"/>
@@ -15394,7 +15687,7 @@
         </w:rPr>
         <w:t xml:space="preserve">Ma, M., Zhao, G., He, B., Li, Q., Dong, H., Wang, S., &amp; Wang, Z. (2021). XGBoost-based method for flash flood risk assessment. Journal of Hydrology, 598, 126382. </w:t>
       </w:r>
-      <w:hyperlink r:id="rId20">
+      <w:hyperlink r:id="rId25">
         <w:r>
           <w:rPr>
             <w:color w:val="0B3D91"/>
@@ -15402,6 +15695,111 @@
             <w:u w:val="single"/>
           </w:rPr>
           <w:t>https://doi.org/10.1016/j.jhydrol.2021.126382</w:t>
+        </w:r>
+      </w:hyperlink>
+    </w:p>
+    <w:p>
+      <w:pPr>
+        <w:ind w:left="720" w:hanging="720"/>
+      </w:pPr>
+      <w:r>
+        <w:rPr>
+          <w:sz w:val="23"/>
+        </w:rPr>
+        <w:t xml:space="preserve">Mind'je, R., Li, L., Amanambu, A. C., Nahayo, L., Nsengiyumva, J. B., Gasirabo, A., &amp; Mindje, M. (2019). Flood susceptibility modeling and hazard perception in Rwanda. International Journal of Disaster Risk Reduction, 38, 101211. </w:t>
+      </w:r>
+      <w:hyperlink r:id="rId26">
+        <w:r>
+          <w:rPr>
+            <w:color w:val="0B3D91"/>
+            <w:sz w:val="23"/>
+            <w:u w:val="single"/>
+          </w:rPr>
+          <w:t>https://doi.org/10.1016/j.ijdrr.2019.101211</w:t>
+        </w:r>
+      </w:hyperlink>
+    </w:p>
+    <w:p>
+      <w:pPr>
+        <w:ind w:left="720" w:hanging="720"/>
+      </w:pPr>
+      <w:r>
+        <w:rPr>
+          <w:sz w:val="23"/>
+        </w:rPr>
+        <w:t xml:space="preserve">Mind'je, R., Li, L., Kayumba, P. M., Mindje, M., Ali, S., &amp; Umugwaneza, A. (2021). Integrated geospatial analysis and hydrological modeling for peak flow and volume simulation in Rwanda. Water, 13(20), 2926. </w:t>
+      </w:r>
+      <w:hyperlink r:id="rId27">
+        <w:r>
+          <w:rPr>
+            <w:color w:val="0B3D91"/>
+            <w:sz w:val="23"/>
+            <w:u w:val="single"/>
+          </w:rPr>
+          <w:t>https://doi.org/10.3390/w13202926</w:t>
+        </w:r>
+      </w:hyperlink>
+    </w:p>
+    <w:p>
+      <w:pPr>
+        <w:ind w:left="720" w:hanging="720"/>
+      </w:pPr>
+      <w:r>
+        <w:rPr>
+          <w:sz w:val="23"/>
+        </w:rPr>
+        <w:t xml:space="preserve">Ministry in charge of Emergency Management [MINEMA]. (2023). Annual disaster effects report 2023. Government of Rwanda. </w:t>
+      </w:r>
+      <w:hyperlink r:id="rId28">
+        <w:r>
+          <w:rPr>
+            <w:color w:val="0B3D91"/>
+            <w:sz w:val="23"/>
+            <w:u w:val="single"/>
+          </w:rPr>
+          <w:t>https://www.minema.gov.rw/fileadmin/user_upload/Minema/Publications/Disaster_Effects/Annual_Disaster_Effects_Report_2023.pdf</w:t>
+        </w:r>
+      </w:hyperlink>
+    </w:p>
+    <w:p>
+      <w:pPr>
+        <w:ind w:left="720" w:hanging="720"/>
+      </w:pPr>
+      <w:r>
+        <w:rPr>
+          <w:sz w:val="23"/>
+        </w:rPr>
+        <w:t xml:space="preserve">Mosavi, A., Ozturk, P., &amp; Chau, K.-W. (2018). Flood prediction using machine learning models: Literature review. Water, 10(11), 1536. </w:t>
+      </w:r>
+      <w:hyperlink r:id="rId29">
+        <w:r>
+          <w:rPr>
+            <w:color w:val="0B3D91"/>
+            <w:sz w:val="23"/>
+            <w:u w:val="single"/>
+          </w:rPr>
+          <w:t>https://doi.org/10.3390/w10111536</w:t>
+        </w:r>
+      </w:hyperlink>
+    </w:p>
+    <w:p>
+      <w:pPr>
+        <w:ind w:left="720" w:hanging="720"/>
+      </w:pPr>
+      <w:r>
+        <w:rPr>
+          <w:sz w:val="23"/>
+        </w:rPr>
+        <w:t xml:space="preserve">NASA JPL. (2020). NASADEM merged DEM global 1 arc second V001 [Data set]. NASA Land Processes Distributed Active Archive Center. </w:t>
+      </w:r>
+      <w:hyperlink r:id="rId30">
+        <w:r>
+          <w:rPr>
+            <w:color w:val="0B3D91"/>
+            <w:sz w:val="23"/>
+            <w:u w:val="single"/>
+          </w:rPr>
+          <w:t>https://doi.org/10.5067/MEASURES/NASADEM/NASADEM_HGT.001</w:t>
         </w:r>
       </w:hyperlink>
     </w:p>
@@ -15414,114 +15812,9 @@
           <w:sz w:val="23"/>
         </w:rPr>
         <w:lastRenderedPageBreak/>
-        <w:t xml:space="preserve">Mind'je, R., Li, L., Amanambu, A. C., Nahayo, L., Nsengiyumva, J. B., Gasirabo, A., &amp; Mindje, M. (2019). Flood susceptibility modeling and hazard perception in Rwanda. International Journal of Disaster Risk Reduction, 38, 101211. </w:t>
-      </w:r>
-      <w:hyperlink r:id="rId21">
-        <w:r>
-          <w:rPr>
-            <w:color w:val="0B3D91"/>
-            <w:sz w:val="23"/>
-            <w:u w:val="single"/>
-          </w:rPr>
-          <w:t>https://doi.org/10.1016/j.ijdrr.2019.101211</w:t>
-        </w:r>
-      </w:hyperlink>
-    </w:p>
-    <w:p>
-      <w:pPr>
-        <w:ind w:left="720" w:hanging="720"/>
-      </w:pPr>
-      <w:r>
-        <w:rPr>
-          <w:sz w:val="23"/>
-        </w:rPr>
-        <w:t xml:space="preserve">Mind'je, R., Li, L., Kayumba, P. M., Mindje, M., Ali, S., &amp; Umugwaneza, A. (2021). Integrated geospatial analysis and hydrological modeling for peak flow and volume simulation in Rwanda. Water, 13(20), 2926. </w:t>
-      </w:r>
-      <w:hyperlink r:id="rId22">
-        <w:r>
-          <w:rPr>
-            <w:color w:val="0B3D91"/>
-            <w:sz w:val="23"/>
-            <w:u w:val="single"/>
-          </w:rPr>
-          <w:t>https://doi.org/10.3390/w13202926</w:t>
-        </w:r>
-      </w:hyperlink>
-    </w:p>
-    <w:p>
-      <w:pPr>
-        <w:ind w:left="720" w:hanging="720"/>
-      </w:pPr>
-      <w:r>
-        <w:rPr>
-          <w:sz w:val="23"/>
-        </w:rPr>
-        <w:t xml:space="preserve">Ministry in charge of Emergency Management [MINEMA]. (2023). Annual disaster effects report 2023. Government of Rwanda. </w:t>
-      </w:r>
-      <w:hyperlink r:id="rId23">
-        <w:r>
-          <w:rPr>
-            <w:color w:val="0B3D91"/>
-            <w:sz w:val="23"/>
-            <w:u w:val="single"/>
-          </w:rPr>
-          <w:t>https://www.minema.gov.rw/fileadmin/user_upload/Minema/Publications/Disaster_Effects/Annual_Disaster_Effects_Report_2023.pdf</w:t>
-        </w:r>
-      </w:hyperlink>
-    </w:p>
-    <w:p>
-      <w:pPr>
-        <w:ind w:left="720" w:hanging="720"/>
-      </w:pPr>
-      <w:r>
-        <w:rPr>
-          <w:sz w:val="23"/>
-        </w:rPr>
-        <w:t xml:space="preserve">Mosavi, A., Ozturk, P., &amp; Chau, K.-W. (2018). Flood prediction using machine learning models: Literature review. Water, 10(11), 1536. </w:t>
-      </w:r>
-      <w:hyperlink r:id="rId24">
-        <w:r>
-          <w:rPr>
-            <w:color w:val="0B3D91"/>
-            <w:sz w:val="23"/>
-            <w:u w:val="single"/>
-          </w:rPr>
-          <w:t>https://doi.org/10.3390/w10111536</w:t>
-        </w:r>
-      </w:hyperlink>
-    </w:p>
-    <w:p>
-      <w:pPr>
-        <w:ind w:left="720" w:hanging="720"/>
-      </w:pPr>
-      <w:r>
-        <w:rPr>
-          <w:sz w:val="23"/>
-        </w:rPr>
-        <w:t xml:space="preserve">NASA JPL. (2020). NASADEM merged DEM global 1 arc second V001 [Data set]. NASA Land Processes Distributed Active Archive Center. </w:t>
-      </w:r>
-      <w:hyperlink r:id="rId25">
-        <w:r>
-          <w:rPr>
-            <w:color w:val="0B3D91"/>
-            <w:sz w:val="23"/>
-            <w:u w:val="single"/>
-          </w:rPr>
-          <w:t>https://doi.org/10.5067/MEASURES/NASADEM/NASADEM_HGT.001</w:t>
-        </w:r>
-      </w:hyperlink>
-    </w:p>
-    <w:p>
-      <w:pPr>
-        <w:ind w:left="720" w:hanging="720"/>
-      </w:pPr>
-      <w:r>
-        <w:rPr>
-          <w:sz w:val="23"/>
-        </w:rPr>
         <w:t xml:space="preserve">National Institute of Statistics of Rwanda [NISR]. (2023). Statistical yearbook 2023. Government of Rwanda. </w:t>
       </w:r>
-      <w:hyperlink r:id="rId26">
+      <w:hyperlink r:id="rId31">
         <w:r>
           <w:rPr>
             <w:color w:val="0B3D91"/>
@@ -15542,7 +15835,7 @@
         </w:rPr>
         <w:t xml:space="preserve">Nzabonantuma, L., Nduwayezu, G., Naghibi, A., Nilsson, E., Wali, U. G., &amp; Larson, M. (2025). Flood susceptibility mapping in the Nyabarongo Catchment, Rwanda, based on data analysis and modeling. Geomatics, Natural Hazards and Risk, 16(1), 2556987. </w:t>
       </w:r>
-      <w:hyperlink r:id="rId27">
+      <w:hyperlink r:id="rId32">
         <w:r>
           <w:rPr>
             <w:color w:val="0B3D91"/>
@@ -15563,7 +15856,7 @@
         </w:rPr>
         <w:t xml:space="preserve">OpenStreetMap contributors. (2024). OpenStreetMap [Data set]. OpenStreetMap Foundation. </w:t>
       </w:r>
-      <w:hyperlink r:id="rId28">
+      <w:hyperlink r:id="rId33">
         <w:r>
           <w:rPr>
             <w:color w:val="0B3D91"/>
@@ -15584,7 +15877,7 @@
         </w:rPr>
         <w:t xml:space="preserve">Papaioannou, G., Varlas, G., Terti, G., Papadopoulos, A., Loukas, A., Panagopoulos, Y., &amp; Dimitriou, E. (2019). Flood inundation mapping at ungauged basins using coupled hydrometeorological-hydraulic modelling: The catastrophic case of the 2006 flash flood in Volos City, Greece. Water, 11(11), 2328. </w:t>
       </w:r>
-      <w:hyperlink r:id="rId29">
+      <w:hyperlink r:id="rId34">
         <w:r>
           <w:rPr>
             <w:color w:val="0B3D91"/>
@@ -15605,7 +15898,7 @@
         </w:rPr>
         <w:t xml:space="preserve">Rwanda Meteorology Agency. (2022). Downscaled climate projections for Rwanda. Government of Rwanda. </w:t>
       </w:r>
-      <w:hyperlink r:id="rId30">
+      <w:hyperlink r:id="rId35">
         <w:r>
           <w:rPr>
             <w:color w:val="0B3D91"/>
@@ -15624,10 +15917,9 @@
         <w:rPr>
           <w:sz w:val="23"/>
         </w:rPr>
-        <w:lastRenderedPageBreak/>
         <w:t xml:space="preserve">Stoner, O., &amp; Economou, T. (2020). An advanced hidden Markov model for hourly rainfall time series. Computational Statistics &amp; Data Analysis, 152, 107045. </w:t>
       </w:r>
-      <w:hyperlink r:id="rId31">
+      <w:hyperlink r:id="rId36">
         <w:r>
           <w:rPr>
             <w:color w:val="0B3D91"/>
@@ -15648,7 +15940,7 @@
         </w:rPr>
         <w:t xml:space="preserve">The New Times. (2026, February 12). Kigali steps up drainage patrols after floods, crime incidents. The New Times Rwanda. </w:t>
       </w:r>
-      <w:hyperlink r:id="rId32">
+      <w:hyperlink r:id="rId37">
         <w:r>
           <w:rPr>
             <w:color w:val="0B3D91"/>
@@ -15669,7 +15961,7 @@
         </w:rPr>
         <w:t xml:space="preserve">vom Brocke, J., Hevner, A., &amp; Maedche, A. (2020). Introduction to design science research. In J. vom Brocke, A. Hevner, &amp; A. Maedche (Eds.), Design science research. Cases (pp. 1-13). Springer. </w:t>
       </w:r>
-      <w:hyperlink r:id="rId33">
+      <w:hyperlink r:id="rId38">
         <w:r>
           <w:rPr>
             <w:color w:val="0B3D91"/>
@@ -15690,7 +15982,7 @@
         </w:rPr>
         <w:t xml:space="preserve">Xie, M., Jiang, Z., &amp; Sainju, A. M. (2018). Geographical hidden Markov tree for flood extent mapping. In Proceedings of the 24th ACM SIGKDD International Conference on Knowledge Discovery &amp; Data Mining (pp. 2545-2554). Association for Computing Machinery. </w:t>
       </w:r>
-      <w:hyperlink r:id="rId34">
+      <w:hyperlink r:id="rId39">
         <w:r>
           <w:rPr>
             <w:color w:val="0B3D91"/>

</xml_diff>